<commit_message>
feat: implement tenant legal profile management, private file storage, and contract lifecycle policies with corresponding API and frontend integration.
</commit_message>
<xml_diff>
--- a/Source/Artifacts/ContractTemplates/Mẫu Contract Placeholder - đã gắn placeholder.docx
+++ b/Source/Artifacts/ContractTemplates/Mẫu Contract Placeholder - đã gắn placeholder.docx
@@ -104,7 +104,7 @@
           </mc:Choice>
           <mc:Fallback>
             <w:pict>
-              <v:line w14:anchorId="5A450FFB" id="Straight Connector 1" o:spid="_x0000_s1026" style="position:absolute;z-index:251660288;visibility:visible;mso-wrap-style:square;mso-wrap-distance-left:9pt;mso-wrap-distance-top:0;mso-wrap-distance-right:9pt;mso-wrap-distance-bottom:0;mso-position-horizontal:absolute;mso-position-horizontal-relative:text;mso-position-vertical:absolute;mso-position-vertical-relative:text" from="171.3pt,15.1pt" to="313.8pt,15.1pt" o:gfxdata="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" strokecolor="black [3213]" strokeweight=".25pt">
+              <v:line w14:anchorId="3C7CCA6B" id="Straight Connector 1" o:spid="_x0000_s1026" style="position:absolute;z-index:251660288;visibility:visible;mso-wrap-style:square;mso-wrap-distance-left:9pt;mso-wrap-distance-top:0;mso-wrap-distance-right:9pt;mso-wrap-distance-bottom:0;mso-position-horizontal:absolute;mso-position-horizontal-relative:text;mso-position-vertical:absolute;mso-position-vertical-relative:text" from="171.3pt,15.1pt" to="313.8pt,15.1pt" o:gfxdata="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" strokecolor="black [3213]" strokeweight=".25pt">
                 <v:stroke joinstyle="miter"/>
               </v:line>
             </w:pict>
@@ -1826,10 +1826,7 @@
       </w:pPr>
     </w:p>
     <w:sectPr>
-      <w:headerReference w:type="default" r:id="rId7"/>
-      <w:footerReference w:type="default" r:id="rId8"/>
-      <w:headerReference w:type="first" r:id="rId9"/>
-      <w:footerReference w:type="first" r:id="rId10"/>
+      <w:footerReference w:type="default" r:id="rId7"/>
       <w:type w:val="continuous"/>
       <w:pgSz w:w="11905" w:h="16837"/>
       <w:pgMar w:top="1134" w:right="1134" w:bottom="1134" w:left="1134" w:header="448" w:footer="91" w:gutter="0"/>
@@ -1892,12 +1889,6 @@
 </w:ftr>
 </file>
 
-<file path=word/footer2.xml><?xml version="1.0" encoding="utf-8"?>
-<w:ftr xmlns:wpc="http://schemas.microsoft.com/office/word/2010/wordprocessingCanvas" xmlns:cx="http://schemas.microsoft.com/office/drawing/2014/chartex" xmlns:cx1="http://schemas.microsoft.com/office/drawing/2015/9/8/chartex" xmlns:cx2="http://schemas.microsoft.com/office/drawing/2015/10/21/chartex" xmlns:cx3="http://schemas.microsoft.com/office/drawing/2016/5/9/chartex" xmlns:cx4="http://schemas.microsoft.com/office/drawing/2016/5/10/chartex" xmlns:cx5="http://schemas.microsoft.com/office/drawing/2016/5/11/chartex" xmlns:cx6="http://schemas.microsoft.com/office/drawing/2016/5/12/chartex" xmlns:cx7="http://schemas.microsoft.com/office/drawing/2016/5/13/chartex" xmlns:cx8="http://schemas.microsoft.com/office/drawing/2016/5/14/chartex" xmlns:mc="http://schemas.openxmlformats.org/markup-compatibility/2006" xmlns:aink="http://schemas.microsoft.com/office/drawing/2016/ink" xmlns:am3d="http://schemas.microsoft.com/office/drawing/2017/model3d" xmlns:o="urn:schemas-microsoft-com:office:office" xmlns:oel="http://schemas.microsoft.com/office/2019/extlst" xmlns:r="http://schemas.openxmlformats.org/officeDocument/2006/relationships" xmlns:m="http://schemas.openxmlformats.org/officeDocument/2006/math" xmlns:v="urn:schemas-microsoft-com:vml" xmlns:wp14="http://schemas.microsoft.com/office/word/2010/wordprocessingDrawing" xmlns:wp="http://schemas.openxmlformats.org/drawingml/2006/wordprocessingDrawing" xmlns:w10="urn:schemas-microsoft-com:office:word" xmlns:w="http://schemas.openxmlformats.org/wordprocessingml/2006/main" xmlns:w14="http://schemas.microsoft.com/office/word/2010/wordml" xmlns:w15="http://schemas.microsoft.com/office/word/2012/wordml" xmlns:w16cei="http://schemas.microsoft.com/office/word/2026/wordml/cei" xmlns:w16cex="http://schemas.microsoft.com/office/word/2018/wordml/cex" xmlns:w16cid="http://schemas.microsoft.com/office/word/2016/wordml/cid" xmlns:w16="http://schemas.microsoft.com/office/word/2018/wordml" xmlns:w16du="http://schemas.microsoft.com/office/word/2023/wordml/word16du" xmlns:w16sdtdh="http://schemas.microsoft.com/office/word/2020/wordml/sdtdatahash" xmlns:w16sdtfl="http://schemas.microsoft.com/office/word/2024/wordml/sdtformatlock" xmlns:w16se="http://schemas.microsoft.com/office/word/2015/wordml/symex" xmlns:wpg="http://schemas.microsoft.com/office/word/2010/wordprocessingGroup" xmlns:wpi="http://schemas.microsoft.com/office/word/2010/wordprocessingInk" xmlns:wne="http://schemas.microsoft.com/office/word/2006/wordml" xmlns:wps="http://schemas.microsoft.com/office/word/2010/wordprocessingShape" mc:Ignorable="w14 w15 w16se w16cid w16 w16cex w16sdtdh w16sdtfl w16du wp14">
-  <w:p/>
-</w:ftr>
-</file>
-
 <file path=word/footnotes.xml><?xml version="1.0" encoding="utf-8"?>
 <w:footnotes xmlns:wpc="http://schemas.microsoft.com/office/word/2010/wordprocessingCanvas" xmlns:cx="http://schemas.microsoft.com/office/drawing/2014/chartex" xmlns:cx1="http://schemas.microsoft.com/office/drawing/2015/9/8/chartex" xmlns:cx2="http://schemas.microsoft.com/office/drawing/2015/10/21/chartex" xmlns:cx3="http://schemas.microsoft.com/office/drawing/2016/5/9/chartex" xmlns:cx4="http://schemas.microsoft.com/office/drawing/2016/5/10/chartex" xmlns:cx5="http://schemas.microsoft.com/office/drawing/2016/5/11/chartex" xmlns:cx6="http://schemas.microsoft.com/office/drawing/2016/5/12/chartex" xmlns:cx7="http://schemas.microsoft.com/office/drawing/2016/5/13/chartex" xmlns:cx8="http://schemas.microsoft.com/office/drawing/2016/5/14/chartex" xmlns:mc="http://schemas.openxmlformats.org/markup-compatibility/2006" xmlns:aink="http://schemas.microsoft.com/office/drawing/2016/ink" xmlns:am3d="http://schemas.microsoft.com/office/drawing/2017/model3d" xmlns:o="urn:schemas-microsoft-com:office:office" xmlns:oel="http://schemas.microsoft.com/office/2019/extlst" xmlns:r="http://schemas.openxmlformats.org/officeDocument/2006/relationships" xmlns:m="http://schemas.openxmlformats.org/officeDocument/2006/math" xmlns:v="urn:schemas-microsoft-com:vml" xmlns:wp14="http://schemas.microsoft.com/office/word/2010/wordprocessingDrawing" xmlns:wp="http://schemas.openxmlformats.org/drawingml/2006/wordprocessingDrawing" xmlns:w10="urn:schemas-microsoft-com:office:word" xmlns:w="http://schemas.openxmlformats.org/wordprocessingml/2006/main" xmlns:w14="http://schemas.microsoft.com/office/word/2010/wordml" xmlns:w15="http://schemas.microsoft.com/office/word/2012/wordml" xmlns:w16cei="http://schemas.microsoft.com/office/word/2026/wordml/cei" xmlns:w16cex="http://schemas.microsoft.com/office/word/2018/wordml/cex" xmlns:w16cid="http://schemas.microsoft.com/office/word/2016/wordml/cid" xmlns:w16="http://schemas.microsoft.com/office/word/2018/wordml" xmlns:w16du="http://schemas.microsoft.com/office/word/2023/wordml/word16du" xmlns:w16sdtdh="http://schemas.microsoft.com/office/word/2020/wordml/sdtdatahash" xmlns:w16sdtfl="http://schemas.microsoft.com/office/word/2024/wordml/sdtformatlock" xmlns:w16se="http://schemas.microsoft.com/office/word/2015/wordml/symex" xmlns:wpg="http://schemas.microsoft.com/office/word/2010/wordprocessingGroup" xmlns:wpi="http://schemas.microsoft.com/office/word/2010/wordprocessingInk" xmlns:wne="http://schemas.microsoft.com/office/word/2006/wordml" xmlns:wps="http://schemas.microsoft.com/office/word/2010/wordprocessingShape" mc:Ignorable="w14 w15 w16se w16cid w16 w16cex w16sdtdh w16sdtfl w16du wp14">
   <w:footnote w:type="separator" w:id="-1">
@@ -1921,233 +1912,6 @@
     </w:p>
   </w:footnote>
 </w:footnotes>
-</file>
-
-<file path=word/header1.xml><?xml version="1.0" encoding="utf-8"?>
-<w:hdr xmlns:wpc="http://schemas.microsoft.com/office/word/2010/wordprocessingCanvas" xmlns:cx="http://schemas.microsoft.com/office/drawing/2014/chartex" xmlns:cx1="http://schemas.microsoft.com/office/drawing/2015/9/8/chartex" xmlns:cx2="http://schemas.microsoft.com/office/drawing/2015/10/21/chartex" xmlns:cx3="http://schemas.microsoft.com/office/drawing/2016/5/9/chartex" xmlns:cx4="http://schemas.microsoft.com/office/drawing/2016/5/10/chartex" xmlns:cx5="http://schemas.microsoft.com/office/drawing/2016/5/11/chartex" xmlns:cx6="http://schemas.microsoft.com/office/drawing/2016/5/12/chartex" xmlns:cx7="http://schemas.microsoft.com/office/drawing/2016/5/13/chartex" xmlns:cx8="http://schemas.microsoft.com/office/drawing/2016/5/14/chartex" xmlns:mc="http://schemas.openxmlformats.org/markup-compatibility/2006" xmlns:aink="http://schemas.microsoft.com/office/drawing/2016/ink" xmlns:am3d="http://schemas.microsoft.com/office/drawing/2017/model3d" xmlns:o="urn:schemas-microsoft-com:office:office" xmlns:oel="http://schemas.microsoft.com/office/2019/extlst" xmlns:r="http://schemas.openxmlformats.org/officeDocument/2006/relationships" xmlns:m="http://schemas.openxmlformats.org/officeDocument/2006/math" xmlns:v="urn:schemas-microsoft-com:vml" xmlns:wp14="http://schemas.microsoft.com/office/word/2010/wordprocessingDrawing" xmlns:wp="http://schemas.openxmlformats.org/drawingml/2006/wordprocessingDrawing" xmlns:w10="urn:schemas-microsoft-com:office:word" xmlns:w="http://schemas.openxmlformats.org/wordprocessingml/2006/main" xmlns:w14="http://schemas.microsoft.com/office/word/2010/wordml" xmlns:w15="http://schemas.microsoft.com/office/word/2012/wordml" xmlns:w16cei="http://schemas.microsoft.com/office/word/2026/wordml/cei" xmlns:w16cex="http://schemas.microsoft.com/office/word/2018/wordml/cex" xmlns:w16cid="http://schemas.microsoft.com/office/word/2016/wordml/cid" xmlns:w16="http://schemas.microsoft.com/office/word/2018/wordml" xmlns:w16du="http://schemas.microsoft.com/office/word/2023/wordml/word16du" xmlns:w16sdtdh="http://schemas.microsoft.com/office/word/2020/wordml/sdtdatahash" xmlns:w16sdtfl="http://schemas.microsoft.com/office/word/2024/wordml/sdtformatlock" xmlns:w16se="http://schemas.microsoft.com/office/word/2015/wordml/symex" xmlns:wpg="http://schemas.microsoft.com/office/word/2010/wordprocessingGroup" xmlns:wpi="http://schemas.microsoft.com/office/word/2010/wordprocessingInk" xmlns:wne="http://schemas.microsoft.com/office/word/2006/wordml" xmlns:wps="http://schemas.microsoft.com/office/word/2010/wordprocessingShape" mc:Ignorable="w14 w15 w16se w16cid w16 w16cex w16sdtdh w16sdtfl w16du wp14">
-  <w:tbl>
-    <w:tblPr>
-      <w:tblW w:w="0" w:type="auto"/>
-      <w:tblInd w:w="108" w:type="dxa"/>
-      <w:tblBorders>
-        <w:bottom w:val="thinThickSmallGap" w:sz="24" w:space="0" w:color="C00000"/>
-      </w:tblBorders>
-      <w:tblLayout w:type="fixed"/>
-      <w:tblCellMar>
-        <w:left w:w="115" w:type="dxa"/>
-        <w:right w:w="115" w:type="dxa"/>
-      </w:tblCellMar>
-      <w:tblLook w:val="04A0" w:firstRow="1" w:lastRow="0" w:firstColumn="1" w:lastColumn="0" w:noHBand="0" w:noVBand="1"/>
-    </w:tblPr>
-    <w:tblGrid>
-      <w:gridCol w:w="990"/>
-      <w:gridCol w:w="8377"/>
-    </w:tblGrid>
-    <w:tr>
-      <w:tc>
-        <w:tcPr>
-          <w:tcW w:w="990" w:type="dxa"/>
-        </w:tcPr>
-        <w:p>
-          <w:pPr>
-            <w:pStyle w:val="Footer"/>
-            <w:tabs>
-              <w:tab w:val="right" w:pos="9562"/>
-            </w:tabs>
-            <w:spacing w:before="240"/>
-            <w:rPr>
-              <w:rFonts w:ascii="Tahoma" w:hAnsi="Tahoma" w:cs="Tahoma"/>
-              <w:sz w:val="18"/>
-              <w:szCs w:val="18"/>
-            </w:rPr>
-          </w:pPr>
-          <w:r>
-            <w:rPr>
-              <w:rFonts w:ascii="Arial" w:hAnsi="Arial" w:cs="Arial"/>
-              <w:noProof/>
-              <w:sz w:val="20"/>
-              <w:szCs w:val="20"/>
-            </w:rPr>
-            <w:drawing>
-              <wp:inline distT="0" distB="0" distL="0" distR="0" wp14:anchorId="1FE5861C" wp14:editId="4356B60A">
-                <wp:extent cx="390525" cy="234711"/>
-                <wp:effectExtent l="0" t="0" r="0" b="0"/>
-                <wp:docPr id="24" name="Picture 24"/>
-                <wp:cNvGraphicFramePr>
-                  <a:graphicFrameLocks xmlns:a="http://schemas.openxmlformats.org/drawingml/2006/main" noChangeAspect="1"/>
-                </wp:cNvGraphicFramePr>
-                <a:graphic xmlns:a="http://schemas.openxmlformats.org/drawingml/2006/main">
-                  <a:graphicData uri="http://schemas.openxmlformats.org/drawingml/2006/picture">
-                    <pic:pic xmlns:pic="http://schemas.openxmlformats.org/drawingml/2006/picture">
-                      <pic:nvPicPr>
-                        <pic:cNvPr id="0" name="Picture 13" descr="LogoRegisted"/>
-                        <pic:cNvPicPr>
-                          <a:picLocks noChangeAspect="1" noChangeArrowheads="1"/>
-                        </pic:cNvPicPr>
-                      </pic:nvPicPr>
-                      <pic:blipFill>
-                        <a:blip r:embed="rId1" cstate="print">
-                          <a:extLst>
-                            <a:ext uri="{28A0092B-C50C-407E-A947-70E740481C1C}">
-                              <a14:useLocalDpi xmlns:a14="http://schemas.microsoft.com/office/drawing/2010/main" val="0"/>
-                            </a:ext>
-                          </a:extLst>
-                        </a:blip>
-                        <a:stretch>
-                          <a:fillRect/>
-                        </a:stretch>
-                      </pic:blipFill>
-                      <pic:spPr bwMode="auto">
-                        <a:xfrm>
-                          <a:off x="0" y="0"/>
-                          <a:ext cx="390525" cy="234711"/>
-                        </a:xfrm>
-                        <a:prstGeom prst="rect">
-                          <a:avLst/>
-                        </a:prstGeom>
-                        <a:noFill/>
-                        <a:ln>
-                          <a:noFill/>
-                        </a:ln>
-                      </pic:spPr>
-                    </pic:pic>
-                  </a:graphicData>
-                </a:graphic>
-              </wp:inline>
-            </w:drawing>
-          </w:r>
-        </w:p>
-      </w:tc>
-      <w:tc>
-        <w:tcPr>
-          <w:tcW w:w="8377" w:type="dxa"/>
-        </w:tcPr>
-        <w:p>
-          <w:pPr>
-            <w:pStyle w:val="Footer"/>
-            <w:tabs>
-              <w:tab w:val="right" w:pos="9562"/>
-            </w:tabs>
-            <w:spacing w:before="120" w:line="200" w:lineRule="exact"/>
-            <w:ind w:right="-115"/>
-            <w:jc w:val="right"/>
-            <w:rPr>
-              <w:rFonts w:ascii="Tahoma" w:hAnsi="Tahoma" w:cs="Tahoma"/>
-              <w:b/>
-              <w:color w:val="006496"/>
-              <w:sz w:val="18"/>
-              <w:szCs w:val="18"/>
-            </w:rPr>
-          </w:pPr>
-          <w:r>
-            <w:rPr>
-              <w:rFonts w:ascii="Tahoma" w:hAnsi="Tahoma" w:cs="Tahoma"/>
-              <w:b/>
-              <w:color w:val="006496"/>
-              <w:sz w:val="18"/>
-              <w:szCs w:val="18"/>
-            </w:rPr>
-            <w:t>CÔNG TY TNHH CÔNG NGHỆ ỨNG DỤNG VÀ TRUYỀN THÔNG DTC</w:t>
-          </w:r>
-        </w:p>
-        <w:p>
-          <w:pPr>
-            <w:pStyle w:val="Footer"/>
-            <w:tabs>
-              <w:tab w:val="right" w:pos="9562"/>
-            </w:tabs>
-            <w:spacing w:before="120" w:line="200" w:lineRule="exact"/>
-            <w:ind w:right="-115"/>
-            <w:jc w:val="right"/>
-            <w:rPr>
-              <w:rFonts w:ascii="Tahoma" w:hAnsi="Tahoma" w:cs="Tahoma"/>
-              <w:sz w:val="18"/>
-              <w:szCs w:val="18"/>
-            </w:rPr>
-          </w:pPr>
-          <w:r>
-            <w:rPr>
-              <w:rFonts w:ascii="Tahoma" w:hAnsi="Tahoma" w:cs="Tahoma"/>
-              <w:color w:val="808080"/>
-              <w:sz w:val="18"/>
-              <w:szCs w:val="18"/>
-            </w:rPr>
-            <w:t>DTC., Ltd | Website:</w:t>
-          </w:r>
-          <w:r>
-            <w:rPr>
-              <w:rFonts w:ascii="Tahoma" w:hAnsi="Tahoma" w:cs="Tahoma"/>
-              <w:sz w:val="18"/>
-              <w:szCs w:val="18"/>
-            </w:rPr>
-            <w:t xml:space="preserve"> </w:t>
-          </w:r>
-          <w:hyperlink w:history="1">
-            <w:r>
-              <w:rPr>
-                <w:rStyle w:val="Hyperlink"/>
-                <w:rFonts w:ascii="Tahoma" w:hAnsi="Tahoma" w:cs="Tahoma"/>
-                <w:sz w:val="18"/>
-                <w:szCs w:val="18"/>
-              </w:rPr>
-              <w:t>www.dtctech.vn</w:t>
-            </w:r>
-          </w:hyperlink>
-          <w:r>
-            <w:rPr>
-              <w:rFonts w:ascii="Tahoma" w:hAnsi="Tahoma" w:cs="Tahoma"/>
-              <w:sz w:val="18"/>
-              <w:szCs w:val="18"/>
-            </w:rPr>
-            <w:t xml:space="preserve"> </w:t>
-          </w:r>
-          <w:r>
-            <w:rPr>
-              <w:rFonts w:ascii="Tahoma" w:hAnsi="Tahoma" w:cs="Tahoma"/>
-              <w:color w:val="808080"/>
-              <w:sz w:val="18"/>
-              <w:szCs w:val="18"/>
-            </w:rPr>
-            <w:t>| Email:</w:t>
-          </w:r>
-          <w:r>
-            <w:rPr>
-              <w:rFonts w:ascii="Tahoma" w:hAnsi="Tahoma" w:cs="Tahoma"/>
-              <w:sz w:val="18"/>
-              <w:szCs w:val="18"/>
-            </w:rPr>
-            <w:t xml:space="preserve"> </w:t>
-          </w:r>
-          <w:hyperlink w:history="1">
-            <w:r>
-              <w:rPr>
-                <w:rStyle w:val="Hyperlink"/>
-                <w:rFonts w:ascii="Tahoma" w:hAnsi="Tahoma" w:cs="Tahoma"/>
-                <w:sz w:val="18"/>
-                <w:szCs w:val="18"/>
-              </w:rPr>
-              <w:t>info@dtctech.vn</w:t>
-            </w:r>
-          </w:hyperlink>
-        </w:p>
-      </w:tc>
-    </w:tr>
-  </w:tbl>
-  <w:p>
-    <w:pPr>
-      <w:pStyle w:val="Header"/>
-      <w:tabs>
-        <w:tab w:val="clear" w:pos="9360"/>
-      </w:tabs>
-    </w:pPr>
-  </w:p>
-</w:hdr>
-</file>
-
-<file path=word/header2.xml><?xml version="1.0" encoding="utf-8"?>
-<w:hdr xmlns:wpc="http://schemas.microsoft.com/office/word/2010/wordprocessingCanvas" xmlns:cx="http://schemas.microsoft.com/office/drawing/2014/chartex" xmlns:cx1="http://schemas.microsoft.com/office/drawing/2015/9/8/chartex" xmlns:cx2="http://schemas.microsoft.com/office/drawing/2015/10/21/chartex" xmlns:cx3="http://schemas.microsoft.com/office/drawing/2016/5/9/chartex" xmlns:cx4="http://schemas.microsoft.com/office/drawing/2016/5/10/chartex" xmlns:cx5="http://schemas.microsoft.com/office/drawing/2016/5/11/chartex" xmlns:cx6="http://schemas.microsoft.com/office/drawing/2016/5/12/chartex" xmlns:cx7="http://schemas.microsoft.com/office/drawing/2016/5/13/chartex" xmlns:cx8="http://schemas.microsoft.com/office/drawing/2016/5/14/chartex" xmlns:mc="http://schemas.openxmlformats.org/markup-compatibility/2006" xmlns:aink="http://schemas.microsoft.com/office/drawing/2016/ink" xmlns:am3d="http://schemas.microsoft.com/office/drawing/2017/model3d" xmlns:o="urn:schemas-microsoft-com:office:office" xmlns:oel="http://schemas.microsoft.com/office/2019/extlst" xmlns:r="http://schemas.openxmlformats.org/officeDocument/2006/relationships" xmlns:m="http://schemas.openxmlformats.org/officeDocument/2006/math" xmlns:v="urn:schemas-microsoft-com:vml" xmlns:wp14="http://schemas.microsoft.com/office/word/2010/wordprocessingDrawing" xmlns:wp="http://schemas.openxmlformats.org/drawingml/2006/wordprocessingDrawing" xmlns:w10="urn:schemas-microsoft-com:office:word" xmlns:w="http://schemas.openxmlformats.org/wordprocessingml/2006/main" xmlns:w14="http://schemas.microsoft.com/office/word/2010/wordml" xmlns:w15="http://schemas.microsoft.com/office/word/2012/wordml" xmlns:w16cei="http://schemas.microsoft.com/office/word/2026/wordml/cei" xmlns:w16cex="http://schemas.microsoft.com/office/word/2018/wordml/cex" xmlns:w16cid="http://schemas.microsoft.com/office/word/2016/wordml/cid" xmlns:w16="http://schemas.microsoft.com/office/word/2018/wordml" xmlns:w16du="http://schemas.microsoft.com/office/word/2023/wordml/word16du" xmlns:w16sdtdh="http://schemas.microsoft.com/office/word/2020/wordml/sdtdatahash" xmlns:w16sdtfl="http://schemas.microsoft.com/office/word/2024/wordml/sdtformatlock" xmlns:w16se="http://schemas.microsoft.com/office/word/2015/wordml/symex" xmlns:wpg="http://schemas.microsoft.com/office/word/2010/wordprocessingGroup" xmlns:wpi="http://schemas.microsoft.com/office/word/2010/wordprocessingInk" xmlns:wne="http://schemas.microsoft.com/office/word/2006/wordml" xmlns:wps="http://schemas.microsoft.com/office/word/2010/wordprocessingShape" mc:Ignorable="w14 w15 w16se w16cid w16 w16cex w16sdtdh w16sdtfl w16du wp14">
-  <w:p/>
-</w:hdr>
 </file>
 
 <file path=word/numbering.xml><?xml version="1.0" encoding="utf-8"?>

</xml_diff>

<commit_message>
feat: implement document preview engine with dynamic DOCX merging and contract template rendering services
</commit_message>
<xml_diff>
--- a/Source/Artifacts/ContractTemplates/Mẫu Contract Placeholder - đã gắn placeholder.docx
+++ b/Source/Artifacts/ContractTemplates/Mẫu Contract Placeholder - đã gắn placeholder.docx
@@ -1,6 +1,6 @@
 
 <file path=word/document.xml><?xml version="1.0" encoding="utf-8"?>
-<w:document xmlns:wpc="http://schemas.microsoft.com/office/word/2010/wordprocessingCanvas" xmlns:cx="http://schemas.microsoft.com/office/drawing/2014/chartex" xmlns:cx1="http://schemas.microsoft.com/office/drawing/2015/9/8/chartex" xmlns:cx2="http://schemas.microsoft.com/office/drawing/2015/10/21/chartex" xmlns:cx3="http://schemas.microsoft.com/office/drawing/2016/5/9/chartex" xmlns:cx4="http://schemas.microsoft.com/office/drawing/2016/5/10/chartex" xmlns:cx5="http://schemas.microsoft.com/office/drawing/2016/5/11/chartex" xmlns:cx6="http://schemas.microsoft.com/office/drawing/2016/5/12/chartex" xmlns:cx7="http://schemas.microsoft.com/office/drawing/2016/5/13/chartex" xmlns:cx8="http://schemas.microsoft.com/office/drawing/2016/5/14/chartex" xmlns:mc="http://schemas.openxmlformats.org/markup-compatibility/2006" xmlns:aink="http://schemas.microsoft.com/office/drawing/2016/ink" xmlns:am3d="http://schemas.microsoft.com/office/drawing/2017/model3d" xmlns:o="urn:schemas-microsoft-com:office:office" xmlns:oel="http://schemas.microsoft.com/office/2019/extlst" xmlns:r="http://schemas.openxmlformats.org/officeDocument/2006/relationships" xmlns:m="http://schemas.openxmlformats.org/officeDocument/2006/math" xmlns:v="urn:schemas-microsoft-com:vml" xmlns:wp14="http://schemas.microsoft.com/office/word/2010/wordprocessingDrawing" xmlns:wp="http://schemas.openxmlformats.org/drawingml/2006/wordprocessingDrawing" xmlns:w10="urn:schemas-microsoft-com:office:word" xmlns:w="http://schemas.openxmlformats.org/wordprocessingml/2006/main" xmlns:w14="http://schemas.microsoft.com/office/word/2010/wordml" xmlns:w15="http://schemas.microsoft.com/office/word/2012/wordml" xmlns:w16cei="http://schemas.microsoft.com/office/word/2026/wordml/cei" xmlns:w16cex="http://schemas.microsoft.com/office/word/2018/wordml/cex" xmlns:w16cid="http://schemas.microsoft.com/office/word/2016/wordml/cid" xmlns:w16="http://schemas.microsoft.com/office/word/2018/wordml" xmlns:w16du="http://schemas.microsoft.com/office/word/2023/wordml/word16du" xmlns:w16sdtdh="http://schemas.microsoft.com/office/word/2020/wordml/sdtdatahash" xmlns:w16sdtfl="http://schemas.microsoft.com/office/word/2024/wordml/sdtformatlock" xmlns:w16se="http://schemas.microsoft.com/office/word/2015/wordml/symex" xmlns:wpg="http://schemas.microsoft.com/office/word/2010/wordprocessingGroup" xmlns:wpi="http://schemas.microsoft.com/office/word/2010/wordprocessingInk" xmlns:wne="http://schemas.microsoft.com/office/word/2006/wordml" xmlns:wps="http://schemas.microsoft.com/office/word/2010/wordprocessingShape" mc:Ignorable="w14 w15 w16se w16cid w16 w16cex w16sdtdh w16sdtfl w16du wp14">
+<w:document xmlns:wpc="http://schemas.microsoft.com/office/word/2010/wordprocessingCanvas" xmlns:cx="http://schemas.microsoft.com/office/drawing/2014/chartex" xmlns:cx1="http://schemas.microsoft.com/office/drawing/2015/9/8/chartex" xmlns:cx2="http://schemas.microsoft.com/office/drawing/2015/10/21/chartex" xmlns:cx3="http://schemas.microsoft.com/office/drawing/2016/5/9/chartex" xmlns:cx4="http://schemas.microsoft.com/office/drawing/2016/5/10/chartex" xmlns:cx5="http://schemas.microsoft.com/office/drawing/2016/5/11/chartex" xmlns:cx6="http://schemas.microsoft.com/office/drawing/2016/5/12/chartex" xmlns:cx7="http://schemas.microsoft.com/office/drawing/2016/5/13/chartex" xmlns:cx8="http://schemas.microsoft.com/office/drawing/2016/5/14/chartex" xmlns:mc="http://schemas.openxmlformats.org/markup-compatibility/2006" xmlns:aink="http://schemas.microsoft.com/office/drawing/2016/ink" xmlns:am3d="http://schemas.microsoft.com/office/drawing/2017/model3d" xmlns:o="urn:schemas-microsoft-com:office:office" xmlns:oel="http://schemas.microsoft.com/office/2019/extlst" xmlns:r="http://schemas.openxmlformats.org/officeDocument/2006/relationships" xmlns:m="http://schemas.openxmlformats.org/officeDocument/2006/math" xmlns:v="urn:schemas-microsoft-com:vml" xmlns:wp14="http://schemas.microsoft.com/office/word/2010/wordprocessingDrawing" xmlns:wp="http://schemas.openxmlformats.org/drawingml/2006/wordprocessingDrawing" xmlns:w10="urn:schemas-microsoft-com:office:word" xmlns:w="http://schemas.openxmlformats.org/wordprocessingml/2006/main" xmlns:w14="http://schemas.microsoft.com/office/word/2010/wordml" xmlns:w15="http://schemas.microsoft.com/office/word/2012/wordml" xmlns:w16cex="http://schemas.microsoft.com/office/word/2018/wordml/cex" xmlns:w16cid="http://schemas.microsoft.com/office/word/2016/wordml/cid" xmlns:w16="http://schemas.microsoft.com/office/word/2018/wordml" xmlns:w16du="http://schemas.microsoft.com/office/word/2023/wordml/word16du" xmlns:w16sdtdh="http://schemas.microsoft.com/office/word/2020/wordml/sdtdatahash" xmlns:w16sdtfl="http://schemas.microsoft.com/office/word/2024/wordml/sdtformatlock" xmlns:w16se="http://schemas.microsoft.com/office/word/2015/wordml/symex" xmlns:wpg="http://schemas.microsoft.com/office/word/2010/wordprocessingGroup" xmlns:wpi="http://schemas.microsoft.com/office/word/2010/wordprocessingInk" xmlns:wne="http://schemas.microsoft.com/office/word/2006/wordml" xmlns:wps="http://schemas.microsoft.com/office/word/2010/wordprocessingShape" mc:Ignorable="w14 w15 w16se w16cid w16 w16cex w16sdtdh w16sdtfl w16du wp14">
   <w:body>
     <w:p>
       <w:pPr>
@@ -102,7 +102,7 @@
               </wp:anchor>
             </w:drawing>
           </mc:Choice>
-          <mc:Fallback>
+          <mc:Fallback xmlns:w16cei="http://schemas.microsoft.com/office/word/2026/wordml/cei">
             <w:pict>
               <v:line w14:anchorId="3C7CCA6B" id="Straight Connector 1" o:spid="_x0000_s1026" style="position:absolute;z-index:251660288;visibility:visible;mso-wrap-style:square;mso-wrap-distance-left:9pt;mso-wrap-distance-top:0;mso-wrap-distance-right:9pt;mso-wrap-distance-bottom:0;mso-position-horizontal:absolute;mso-position-horizontal-relative:text;mso-position-vertical:absolute;mso-position-vertical-relative:text" from="171.3pt,15.1pt" to="313.8pt,15.1pt" o:gfxdata="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" strokecolor="black [3213]" strokeweight=".25pt">
                 <v:stroke joinstyle="miter"/>
@@ -1840,7 +1840,7 @@
 </file>
 
 <file path=word/endnotes.xml><?xml version="1.0" encoding="utf-8"?>
-<w:endnotes xmlns:wpc="http://schemas.microsoft.com/office/word/2010/wordprocessingCanvas" xmlns:cx="http://schemas.microsoft.com/office/drawing/2014/chartex" xmlns:cx1="http://schemas.microsoft.com/office/drawing/2015/9/8/chartex" xmlns:cx2="http://schemas.microsoft.com/office/drawing/2015/10/21/chartex" xmlns:cx3="http://schemas.microsoft.com/office/drawing/2016/5/9/chartex" xmlns:cx4="http://schemas.microsoft.com/office/drawing/2016/5/10/chartex" xmlns:cx5="http://schemas.microsoft.com/office/drawing/2016/5/11/chartex" xmlns:cx6="http://schemas.microsoft.com/office/drawing/2016/5/12/chartex" xmlns:cx7="http://schemas.microsoft.com/office/drawing/2016/5/13/chartex" xmlns:cx8="http://schemas.microsoft.com/office/drawing/2016/5/14/chartex" xmlns:mc="http://schemas.openxmlformats.org/markup-compatibility/2006" xmlns:aink="http://schemas.microsoft.com/office/drawing/2016/ink" xmlns:am3d="http://schemas.microsoft.com/office/drawing/2017/model3d" xmlns:o="urn:schemas-microsoft-com:office:office" xmlns:oel="http://schemas.microsoft.com/office/2019/extlst" xmlns:r="http://schemas.openxmlformats.org/officeDocument/2006/relationships" xmlns:m="http://schemas.openxmlformats.org/officeDocument/2006/math" xmlns:v="urn:schemas-microsoft-com:vml" xmlns:wp14="http://schemas.microsoft.com/office/word/2010/wordprocessingDrawing" xmlns:wp="http://schemas.openxmlformats.org/drawingml/2006/wordprocessingDrawing" xmlns:w10="urn:schemas-microsoft-com:office:word" xmlns:w="http://schemas.openxmlformats.org/wordprocessingml/2006/main" xmlns:w14="http://schemas.microsoft.com/office/word/2010/wordml" xmlns:w15="http://schemas.microsoft.com/office/word/2012/wordml" xmlns:w16cei="http://schemas.microsoft.com/office/word/2026/wordml/cei" xmlns:w16cex="http://schemas.microsoft.com/office/word/2018/wordml/cex" xmlns:w16cid="http://schemas.microsoft.com/office/word/2016/wordml/cid" xmlns:w16="http://schemas.microsoft.com/office/word/2018/wordml" xmlns:w16du="http://schemas.microsoft.com/office/word/2023/wordml/word16du" xmlns:w16sdtdh="http://schemas.microsoft.com/office/word/2020/wordml/sdtdatahash" xmlns:w16sdtfl="http://schemas.microsoft.com/office/word/2024/wordml/sdtformatlock" xmlns:w16se="http://schemas.microsoft.com/office/word/2015/wordml/symex" xmlns:wpg="http://schemas.microsoft.com/office/word/2010/wordprocessingGroup" xmlns:wpi="http://schemas.microsoft.com/office/word/2010/wordprocessingInk" xmlns:wne="http://schemas.microsoft.com/office/word/2006/wordml" xmlns:wps="http://schemas.microsoft.com/office/word/2010/wordprocessingShape" mc:Ignorable="w14 w15 w16se w16cid w16 w16cex w16sdtdh w16sdtfl w16du wp14">
+<w:endnotes xmlns:wpc="http://schemas.microsoft.com/office/word/2010/wordprocessingCanvas" xmlns:cx="http://schemas.microsoft.com/office/drawing/2014/chartex" xmlns:cx1="http://schemas.microsoft.com/office/drawing/2015/9/8/chartex" xmlns:cx2="http://schemas.microsoft.com/office/drawing/2015/10/21/chartex" xmlns:cx3="http://schemas.microsoft.com/office/drawing/2016/5/9/chartex" xmlns:cx4="http://schemas.microsoft.com/office/drawing/2016/5/10/chartex" xmlns:cx5="http://schemas.microsoft.com/office/drawing/2016/5/11/chartex" xmlns:cx6="http://schemas.microsoft.com/office/drawing/2016/5/12/chartex" xmlns:cx7="http://schemas.microsoft.com/office/drawing/2016/5/13/chartex" xmlns:cx8="http://schemas.microsoft.com/office/drawing/2016/5/14/chartex" xmlns:mc="http://schemas.openxmlformats.org/markup-compatibility/2006" xmlns:aink="http://schemas.microsoft.com/office/drawing/2016/ink" xmlns:am3d="http://schemas.microsoft.com/office/drawing/2017/model3d" xmlns:o="urn:schemas-microsoft-com:office:office" xmlns:oel="http://schemas.microsoft.com/office/2019/extlst" xmlns:r="http://schemas.openxmlformats.org/officeDocument/2006/relationships" xmlns:m="http://schemas.openxmlformats.org/officeDocument/2006/math" xmlns:v="urn:schemas-microsoft-com:vml" xmlns:wp14="http://schemas.microsoft.com/office/word/2010/wordprocessingDrawing" xmlns:wp="http://schemas.openxmlformats.org/drawingml/2006/wordprocessingDrawing" xmlns:w10="urn:schemas-microsoft-com:office:word" xmlns:w="http://schemas.openxmlformats.org/wordprocessingml/2006/main" xmlns:w14="http://schemas.microsoft.com/office/word/2010/wordml" xmlns:w15="http://schemas.microsoft.com/office/word/2012/wordml" xmlns:w16cex="http://schemas.microsoft.com/office/word/2018/wordml/cex" xmlns:w16cid="http://schemas.microsoft.com/office/word/2016/wordml/cid" xmlns:w16="http://schemas.microsoft.com/office/word/2018/wordml" xmlns:w16du="http://schemas.microsoft.com/office/word/2023/wordml/word16du" xmlns:w16sdtdh="http://schemas.microsoft.com/office/word/2020/wordml/sdtdatahash" xmlns:w16sdtfl="http://schemas.microsoft.com/office/word/2024/wordml/sdtformatlock" xmlns:w16se="http://schemas.microsoft.com/office/word/2015/wordml/symex" xmlns:wpg="http://schemas.microsoft.com/office/word/2010/wordprocessingGroup" xmlns:wpi="http://schemas.microsoft.com/office/word/2010/wordprocessingInk" xmlns:wne="http://schemas.microsoft.com/office/word/2006/wordml" xmlns:wps="http://schemas.microsoft.com/office/word/2010/wordprocessingShape" mc:Ignorable="w14 w15 w16se w16cid w16 w16cex w16sdtdh w16sdtfl w16du wp14">
   <w:endnote w:type="separator" w:id="-1">
     <w:p>
       <w:pPr>
@@ -1865,7 +1865,7 @@
 </file>
 
 <file path=word/footer1.xml><?xml version="1.0" encoding="utf-8"?>
-<w:ftr xmlns:wpc="http://schemas.microsoft.com/office/word/2010/wordprocessingCanvas" xmlns:cx="http://schemas.microsoft.com/office/drawing/2014/chartex" xmlns:cx1="http://schemas.microsoft.com/office/drawing/2015/9/8/chartex" xmlns:cx2="http://schemas.microsoft.com/office/drawing/2015/10/21/chartex" xmlns:cx3="http://schemas.microsoft.com/office/drawing/2016/5/9/chartex" xmlns:cx4="http://schemas.microsoft.com/office/drawing/2016/5/10/chartex" xmlns:cx5="http://schemas.microsoft.com/office/drawing/2016/5/11/chartex" xmlns:cx6="http://schemas.microsoft.com/office/drawing/2016/5/12/chartex" xmlns:cx7="http://schemas.microsoft.com/office/drawing/2016/5/13/chartex" xmlns:cx8="http://schemas.microsoft.com/office/drawing/2016/5/14/chartex" xmlns:mc="http://schemas.openxmlformats.org/markup-compatibility/2006" xmlns:aink="http://schemas.microsoft.com/office/drawing/2016/ink" xmlns:am3d="http://schemas.microsoft.com/office/drawing/2017/model3d" xmlns:o="urn:schemas-microsoft-com:office:office" xmlns:oel="http://schemas.microsoft.com/office/2019/extlst" xmlns:r="http://schemas.openxmlformats.org/officeDocument/2006/relationships" xmlns:m="http://schemas.openxmlformats.org/officeDocument/2006/math" xmlns:v="urn:schemas-microsoft-com:vml" xmlns:wp14="http://schemas.microsoft.com/office/word/2010/wordprocessingDrawing" xmlns:wp="http://schemas.openxmlformats.org/drawingml/2006/wordprocessingDrawing" xmlns:w10="urn:schemas-microsoft-com:office:word" xmlns:w="http://schemas.openxmlformats.org/wordprocessingml/2006/main" xmlns:w14="http://schemas.microsoft.com/office/word/2010/wordml" xmlns:w15="http://schemas.microsoft.com/office/word/2012/wordml" xmlns:w16cei="http://schemas.microsoft.com/office/word/2026/wordml/cei" xmlns:w16cex="http://schemas.microsoft.com/office/word/2018/wordml/cex" xmlns:w16cid="http://schemas.microsoft.com/office/word/2016/wordml/cid" xmlns:w16="http://schemas.microsoft.com/office/word/2018/wordml" xmlns:w16du="http://schemas.microsoft.com/office/word/2023/wordml/word16du" xmlns:w16sdtdh="http://schemas.microsoft.com/office/word/2020/wordml/sdtdatahash" xmlns:w16sdtfl="http://schemas.microsoft.com/office/word/2024/wordml/sdtformatlock" xmlns:w16se="http://schemas.microsoft.com/office/word/2015/wordml/symex" xmlns:wpg="http://schemas.microsoft.com/office/word/2010/wordprocessingGroup" xmlns:wpi="http://schemas.microsoft.com/office/word/2010/wordprocessingInk" xmlns:wne="http://schemas.microsoft.com/office/word/2006/wordml" xmlns:wps="http://schemas.microsoft.com/office/word/2010/wordprocessingShape" mc:Ignorable="w14 w15 w16se w16cid w16 w16cex w16sdtdh w16sdtfl w16du wp14">
+<w:ftr xmlns:wpc="http://schemas.microsoft.com/office/word/2010/wordprocessingCanvas" xmlns:cx="http://schemas.microsoft.com/office/drawing/2014/chartex" xmlns:cx1="http://schemas.microsoft.com/office/drawing/2015/9/8/chartex" xmlns:cx2="http://schemas.microsoft.com/office/drawing/2015/10/21/chartex" xmlns:cx3="http://schemas.microsoft.com/office/drawing/2016/5/9/chartex" xmlns:cx4="http://schemas.microsoft.com/office/drawing/2016/5/10/chartex" xmlns:cx5="http://schemas.microsoft.com/office/drawing/2016/5/11/chartex" xmlns:cx6="http://schemas.microsoft.com/office/drawing/2016/5/12/chartex" xmlns:cx7="http://schemas.microsoft.com/office/drawing/2016/5/13/chartex" xmlns:cx8="http://schemas.microsoft.com/office/drawing/2016/5/14/chartex" xmlns:mc="http://schemas.openxmlformats.org/markup-compatibility/2006" xmlns:aink="http://schemas.microsoft.com/office/drawing/2016/ink" xmlns:am3d="http://schemas.microsoft.com/office/drawing/2017/model3d" xmlns:o="urn:schemas-microsoft-com:office:office" xmlns:oel="http://schemas.microsoft.com/office/2019/extlst" xmlns:r="http://schemas.openxmlformats.org/officeDocument/2006/relationships" xmlns:m="http://schemas.openxmlformats.org/officeDocument/2006/math" xmlns:v="urn:schemas-microsoft-com:vml" xmlns:wp14="http://schemas.microsoft.com/office/word/2010/wordprocessingDrawing" xmlns:wp="http://schemas.openxmlformats.org/drawingml/2006/wordprocessingDrawing" xmlns:w10="urn:schemas-microsoft-com:office:word" xmlns:w="http://schemas.openxmlformats.org/wordprocessingml/2006/main" xmlns:w14="http://schemas.microsoft.com/office/word/2010/wordml" xmlns:w15="http://schemas.microsoft.com/office/word/2012/wordml" xmlns:w16cex="http://schemas.microsoft.com/office/word/2018/wordml/cex" xmlns:w16cid="http://schemas.microsoft.com/office/word/2016/wordml/cid" xmlns:w16="http://schemas.microsoft.com/office/word/2018/wordml" xmlns:w16du="http://schemas.microsoft.com/office/word/2023/wordml/word16du" xmlns:w16sdtdh="http://schemas.microsoft.com/office/word/2020/wordml/sdtdatahash" xmlns:w16sdtfl="http://schemas.microsoft.com/office/word/2024/wordml/sdtformatlock" xmlns:w16se="http://schemas.microsoft.com/office/word/2015/wordml/symex" xmlns:wpg="http://schemas.microsoft.com/office/word/2010/wordprocessingGroup" xmlns:wpi="http://schemas.microsoft.com/office/word/2010/wordprocessingInk" xmlns:wne="http://schemas.microsoft.com/office/word/2006/wordml" xmlns:wps="http://schemas.microsoft.com/office/word/2010/wordprocessingShape" mc:Ignorable="w14 w15 w16se w16cid w16 w16cex w16sdtdh w16sdtfl w16du wp14">
   <w:p>
     <w:pPr>
       <w:jc w:val="center"/>
@@ -1890,7 +1890,7 @@
 </file>
 
 <file path=word/footnotes.xml><?xml version="1.0" encoding="utf-8"?>
-<w:footnotes xmlns:wpc="http://schemas.microsoft.com/office/word/2010/wordprocessingCanvas" xmlns:cx="http://schemas.microsoft.com/office/drawing/2014/chartex" xmlns:cx1="http://schemas.microsoft.com/office/drawing/2015/9/8/chartex" xmlns:cx2="http://schemas.microsoft.com/office/drawing/2015/10/21/chartex" xmlns:cx3="http://schemas.microsoft.com/office/drawing/2016/5/9/chartex" xmlns:cx4="http://schemas.microsoft.com/office/drawing/2016/5/10/chartex" xmlns:cx5="http://schemas.microsoft.com/office/drawing/2016/5/11/chartex" xmlns:cx6="http://schemas.microsoft.com/office/drawing/2016/5/12/chartex" xmlns:cx7="http://schemas.microsoft.com/office/drawing/2016/5/13/chartex" xmlns:cx8="http://schemas.microsoft.com/office/drawing/2016/5/14/chartex" xmlns:mc="http://schemas.openxmlformats.org/markup-compatibility/2006" xmlns:aink="http://schemas.microsoft.com/office/drawing/2016/ink" xmlns:am3d="http://schemas.microsoft.com/office/drawing/2017/model3d" xmlns:o="urn:schemas-microsoft-com:office:office" xmlns:oel="http://schemas.microsoft.com/office/2019/extlst" xmlns:r="http://schemas.openxmlformats.org/officeDocument/2006/relationships" xmlns:m="http://schemas.openxmlformats.org/officeDocument/2006/math" xmlns:v="urn:schemas-microsoft-com:vml" xmlns:wp14="http://schemas.microsoft.com/office/word/2010/wordprocessingDrawing" xmlns:wp="http://schemas.openxmlformats.org/drawingml/2006/wordprocessingDrawing" xmlns:w10="urn:schemas-microsoft-com:office:word" xmlns:w="http://schemas.openxmlformats.org/wordprocessingml/2006/main" xmlns:w14="http://schemas.microsoft.com/office/word/2010/wordml" xmlns:w15="http://schemas.microsoft.com/office/word/2012/wordml" xmlns:w16cei="http://schemas.microsoft.com/office/word/2026/wordml/cei" xmlns:w16cex="http://schemas.microsoft.com/office/word/2018/wordml/cex" xmlns:w16cid="http://schemas.microsoft.com/office/word/2016/wordml/cid" xmlns:w16="http://schemas.microsoft.com/office/word/2018/wordml" xmlns:w16du="http://schemas.microsoft.com/office/word/2023/wordml/word16du" xmlns:w16sdtdh="http://schemas.microsoft.com/office/word/2020/wordml/sdtdatahash" xmlns:w16sdtfl="http://schemas.microsoft.com/office/word/2024/wordml/sdtformatlock" xmlns:w16se="http://schemas.microsoft.com/office/word/2015/wordml/symex" xmlns:wpg="http://schemas.microsoft.com/office/word/2010/wordprocessingGroup" xmlns:wpi="http://schemas.microsoft.com/office/word/2010/wordprocessingInk" xmlns:wne="http://schemas.microsoft.com/office/word/2006/wordml" xmlns:wps="http://schemas.microsoft.com/office/word/2010/wordprocessingShape" mc:Ignorable="w14 w15 w16se w16cid w16 w16cex w16sdtdh w16sdtfl w16du wp14">
+<w:footnotes xmlns:wpc="http://schemas.microsoft.com/office/word/2010/wordprocessingCanvas" xmlns:cx="http://schemas.microsoft.com/office/drawing/2014/chartex" xmlns:cx1="http://schemas.microsoft.com/office/drawing/2015/9/8/chartex" xmlns:cx2="http://schemas.microsoft.com/office/drawing/2015/10/21/chartex" xmlns:cx3="http://schemas.microsoft.com/office/drawing/2016/5/9/chartex" xmlns:cx4="http://schemas.microsoft.com/office/drawing/2016/5/10/chartex" xmlns:cx5="http://schemas.microsoft.com/office/drawing/2016/5/11/chartex" xmlns:cx6="http://schemas.microsoft.com/office/drawing/2016/5/12/chartex" xmlns:cx7="http://schemas.microsoft.com/office/drawing/2016/5/13/chartex" xmlns:cx8="http://schemas.microsoft.com/office/drawing/2016/5/14/chartex" xmlns:mc="http://schemas.openxmlformats.org/markup-compatibility/2006" xmlns:aink="http://schemas.microsoft.com/office/drawing/2016/ink" xmlns:am3d="http://schemas.microsoft.com/office/drawing/2017/model3d" xmlns:o="urn:schemas-microsoft-com:office:office" xmlns:oel="http://schemas.microsoft.com/office/2019/extlst" xmlns:r="http://schemas.openxmlformats.org/officeDocument/2006/relationships" xmlns:m="http://schemas.openxmlformats.org/officeDocument/2006/math" xmlns:v="urn:schemas-microsoft-com:vml" xmlns:wp14="http://schemas.microsoft.com/office/word/2010/wordprocessingDrawing" xmlns:wp="http://schemas.openxmlformats.org/drawingml/2006/wordprocessingDrawing" xmlns:w10="urn:schemas-microsoft-com:office:word" xmlns:w="http://schemas.openxmlformats.org/wordprocessingml/2006/main" xmlns:w14="http://schemas.microsoft.com/office/word/2010/wordml" xmlns:w15="http://schemas.microsoft.com/office/word/2012/wordml" xmlns:w16cex="http://schemas.microsoft.com/office/word/2018/wordml/cex" xmlns:w16cid="http://schemas.microsoft.com/office/word/2016/wordml/cid" xmlns:w16="http://schemas.microsoft.com/office/word/2018/wordml" xmlns:w16du="http://schemas.microsoft.com/office/word/2023/wordml/word16du" xmlns:w16sdtdh="http://schemas.microsoft.com/office/word/2020/wordml/sdtdatahash" xmlns:w16sdtfl="http://schemas.microsoft.com/office/word/2024/wordml/sdtformatlock" xmlns:w16se="http://schemas.microsoft.com/office/word/2015/wordml/symex" xmlns:wpg="http://schemas.microsoft.com/office/word/2010/wordprocessingGroup" xmlns:wpi="http://schemas.microsoft.com/office/word/2010/wordprocessingInk" xmlns:wne="http://schemas.microsoft.com/office/word/2006/wordml" xmlns:wps="http://schemas.microsoft.com/office/word/2010/wordprocessingShape" mc:Ignorable="w14 w15 w16se w16cid w16 w16cex w16sdtdh w16sdtfl w16du wp14">
   <w:footnote w:type="separator" w:id="-1">
     <w:p>
       <w:pPr>
@@ -1915,7 +1915,7 @@
 </file>
 
 <file path=word/numbering.xml><?xml version="1.0" encoding="utf-8"?>
-<w:numbering xmlns:wpc="http://schemas.microsoft.com/office/word/2010/wordprocessingCanvas" xmlns:cx="http://schemas.microsoft.com/office/drawing/2014/chartex" xmlns:cx1="http://schemas.microsoft.com/office/drawing/2015/9/8/chartex" xmlns:cx2="http://schemas.microsoft.com/office/drawing/2015/10/21/chartex" xmlns:cx3="http://schemas.microsoft.com/office/drawing/2016/5/9/chartex" xmlns:cx4="http://schemas.microsoft.com/office/drawing/2016/5/10/chartex" xmlns:cx5="http://schemas.microsoft.com/office/drawing/2016/5/11/chartex" xmlns:cx6="http://schemas.microsoft.com/office/drawing/2016/5/12/chartex" xmlns:cx7="http://schemas.microsoft.com/office/drawing/2016/5/13/chartex" xmlns:cx8="http://schemas.microsoft.com/office/drawing/2016/5/14/chartex" xmlns:mc="http://schemas.openxmlformats.org/markup-compatibility/2006" xmlns:aink="http://schemas.microsoft.com/office/drawing/2016/ink" xmlns:am3d="http://schemas.microsoft.com/office/drawing/2017/model3d" xmlns:o="urn:schemas-microsoft-com:office:office" xmlns:oel="http://schemas.microsoft.com/office/2019/extlst" xmlns:r="http://schemas.openxmlformats.org/officeDocument/2006/relationships" xmlns:m="http://schemas.openxmlformats.org/officeDocument/2006/math" xmlns:v="urn:schemas-microsoft-com:vml" xmlns:wp14="http://schemas.microsoft.com/office/word/2010/wordprocessingDrawing" xmlns:wp="http://schemas.openxmlformats.org/drawingml/2006/wordprocessingDrawing" xmlns:w10="urn:schemas-microsoft-com:office:word" xmlns:w="http://schemas.openxmlformats.org/wordprocessingml/2006/main" xmlns:w14="http://schemas.microsoft.com/office/word/2010/wordml" xmlns:w15="http://schemas.microsoft.com/office/word/2012/wordml" xmlns:w16cei="http://schemas.microsoft.com/office/word/2026/wordml/cei" xmlns:w16cex="http://schemas.microsoft.com/office/word/2018/wordml/cex" xmlns:w16cid="http://schemas.microsoft.com/office/word/2016/wordml/cid" xmlns:w16="http://schemas.microsoft.com/office/word/2018/wordml" xmlns:w16du="http://schemas.microsoft.com/office/word/2023/wordml/word16du" xmlns:w16sdtdh="http://schemas.microsoft.com/office/word/2020/wordml/sdtdatahash" xmlns:w16sdtfl="http://schemas.microsoft.com/office/word/2024/wordml/sdtformatlock" xmlns:w16se="http://schemas.microsoft.com/office/word/2015/wordml/symex" xmlns:wpg="http://schemas.microsoft.com/office/word/2010/wordprocessingGroup" xmlns:wpi="http://schemas.microsoft.com/office/word/2010/wordprocessingInk" xmlns:wne="http://schemas.microsoft.com/office/word/2006/wordml" xmlns:wps="http://schemas.microsoft.com/office/word/2010/wordprocessingShape" mc:Ignorable="w14 w15 w16se w16cid w16 w16cex w16sdtdh w16sdtfl w16du wp14">
+<w:numbering xmlns:wpc="http://schemas.microsoft.com/office/word/2010/wordprocessingCanvas" xmlns:cx="http://schemas.microsoft.com/office/drawing/2014/chartex" xmlns:cx1="http://schemas.microsoft.com/office/drawing/2015/9/8/chartex" xmlns:cx2="http://schemas.microsoft.com/office/drawing/2015/10/21/chartex" xmlns:cx3="http://schemas.microsoft.com/office/drawing/2016/5/9/chartex" xmlns:cx4="http://schemas.microsoft.com/office/drawing/2016/5/10/chartex" xmlns:cx5="http://schemas.microsoft.com/office/drawing/2016/5/11/chartex" xmlns:cx6="http://schemas.microsoft.com/office/drawing/2016/5/12/chartex" xmlns:cx7="http://schemas.microsoft.com/office/drawing/2016/5/13/chartex" xmlns:cx8="http://schemas.microsoft.com/office/drawing/2016/5/14/chartex" xmlns:mc="http://schemas.openxmlformats.org/markup-compatibility/2006" xmlns:aink="http://schemas.microsoft.com/office/drawing/2016/ink" xmlns:am3d="http://schemas.microsoft.com/office/drawing/2017/model3d" xmlns:o="urn:schemas-microsoft-com:office:office" xmlns:oel="http://schemas.microsoft.com/office/2019/extlst" xmlns:r="http://schemas.openxmlformats.org/officeDocument/2006/relationships" xmlns:m="http://schemas.openxmlformats.org/officeDocument/2006/math" xmlns:v="urn:schemas-microsoft-com:vml" xmlns:wp14="http://schemas.microsoft.com/office/word/2010/wordprocessingDrawing" xmlns:wp="http://schemas.openxmlformats.org/drawingml/2006/wordprocessingDrawing" xmlns:w10="urn:schemas-microsoft-com:office:word" xmlns:w="http://schemas.openxmlformats.org/wordprocessingml/2006/main" xmlns:w14="http://schemas.microsoft.com/office/word/2010/wordml" xmlns:w15="http://schemas.microsoft.com/office/word/2012/wordml" xmlns:w16cex="http://schemas.microsoft.com/office/word/2018/wordml/cex" xmlns:w16cid="http://schemas.microsoft.com/office/word/2016/wordml/cid" xmlns:w16="http://schemas.microsoft.com/office/word/2018/wordml" xmlns:w16du="http://schemas.microsoft.com/office/word/2023/wordml/word16du" xmlns:w16sdtdh="http://schemas.microsoft.com/office/word/2020/wordml/sdtdatahash" xmlns:w16sdtfl="http://schemas.microsoft.com/office/word/2024/wordml/sdtformatlock" xmlns:w16se="http://schemas.microsoft.com/office/word/2015/wordml/symex" xmlns:wpg="http://schemas.microsoft.com/office/word/2010/wordprocessingGroup" xmlns:wpi="http://schemas.microsoft.com/office/word/2010/wordprocessingInk" xmlns:wne="http://schemas.microsoft.com/office/word/2006/wordml" xmlns:wps="http://schemas.microsoft.com/office/word/2010/wordprocessingShape" mc:Ignorable="w14 w15 w16se w16cid w16 w16cex w16sdtdh w16sdtfl w16du wp14">
   <w:abstractNum w:abstractNumId="0" w15:restartNumberingAfterBreak="0">
     <w:nsid w:val="00294612"/>
     <w:multiLevelType w:val="multilevel"/>

</xml_diff>

<commit_message>
feat: initialize ContractManagement.API project with core dependencies and configuration
</commit_message>
<xml_diff>
--- a/Source/Artifacts/ContractTemplates/Mẫu Contract Placeholder - đã gắn placeholder.docx
+++ b/Source/Artifacts/ContractTemplates/Mẫu Contract Placeholder - đã gắn placeholder.docx
@@ -1,6 +1,6 @@
 
 <file path=word/document.xml><?xml version="1.0" encoding="utf-8"?>
-<w:document xmlns:wpc="http://schemas.microsoft.com/office/word/2010/wordprocessingCanvas" xmlns:cx="http://schemas.microsoft.com/office/drawing/2014/chartex" xmlns:cx1="http://schemas.microsoft.com/office/drawing/2015/9/8/chartex" xmlns:cx2="http://schemas.microsoft.com/office/drawing/2015/10/21/chartex" xmlns:cx3="http://schemas.microsoft.com/office/drawing/2016/5/9/chartex" xmlns:cx4="http://schemas.microsoft.com/office/drawing/2016/5/10/chartex" xmlns:cx5="http://schemas.microsoft.com/office/drawing/2016/5/11/chartex" xmlns:cx6="http://schemas.microsoft.com/office/drawing/2016/5/12/chartex" xmlns:cx7="http://schemas.microsoft.com/office/drawing/2016/5/13/chartex" xmlns:cx8="http://schemas.microsoft.com/office/drawing/2016/5/14/chartex" xmlns:mc="http://schemas.openxmlformats.org/markup-compatibility/2006" xmlns:aink="http://schemas.microsoft.com/office/drawing/2016/ink" xmlns:am3d="http://schemas.microsoft.com/office/drawing/2017/model3d" xmlns:o="urn:schemas-microsoft-com:office:office" xmlns:oel="http://schemas.microsoft.com/office/2019/extlst" xmlns:r="http://schemas.openxmlformats.org/officeDocument/2006/relationships" xmlns:m="http://schemas.openxmlformats.org/officeDocument/2006/math" xmlns:v="urn:schemas-microsoft-com:vml" xmlns:wp14="http://schemas.microsoft.com/office/word/2010/wordprocessingDrawing" xmlns:wp="http://schemas.openxmlformats.org/drawingml/2006/wordprocessingDrawing" xmlns:w10="urn:schemas-microsoft-com:office:word" xmlns:w="http://schemas.openxmlformats.org/wordprocessingml/2006/main" xmlns:w14="http://schemas.microsoft.com/office/word/2010/wordml" xmlns:w15="http://schemas.microsoft.com/office/word/2012/wordml" xmlns:w16cei="http://schemas.microsoft.com/office/word/2026/wordml/cei" xmlns:w16cex="http://schemas.microsoft.com/office/word/2018/wordml/cex" xmlns:w16cid="http://schemas.microsoft.com/office/word/2016/wordml/cid" xmlns:w16="http://schemas.microsoft.com/office/word/2018/wordml" xmlns:w16du="http://schemas.microsoft.com/office/word/2023/wordml/word16du" xmlns:w16sdtdh="http://schemas.microsoft.com/office/word/2020/wordml/sdtdatahash" xmlns:w16sdtfl="http://schemas.microsoft.com/office/word/2024/wordml/sdtformatlock" xmlns:w16se="http://schemas.microsoft.com/office/word/2015/wordml/symex" xmlns:wpg="http://schemas.microsoft.com/office/word/2010/wordprocessingGroup" xmlns:wpi="http://schemas.microsoft.com/office/word/2010/wordprocessingInk" xmlns:wne="http://schemas.microsoft.com/office/word/2006/wordml" xmlns:wps="http://schemas.microsoft.com/office/word/2010/wordprocessingShape" mc:Ignorable="w14 w15 w16se w16cid w16 w16cex w16sdtdh w16sdtfl w16du wp14">
+<w:document xmlns:wpc="http://schemas.microsoft.com/office/word/2010/wordprocessingCanvas" xmlns:cx="http://schemas.microsoft.com/office/drawing/2014/chartex" xmlns:cx1="http://schemas.microsoft.com/office/drawing/2015/9/8/chartex" xmlns:cx2="http://schemas.microsoft.com/office/drawing/2015/10/21/chartex" xmlns:cx3="http://schemas.microsoft.com/office/drawing/2016/5/9/chartex" xmlns:cx4="http://schemas.microsoft.com/office/drawing/2016/5/10/chartex" xmlns:cx5="http://schemas.microsoft.com/office/drawing/2016/5/11/chartex" xmlns:cx6="http://schemas.microsoft.com/office/drawing/2016/5/12/chartex" xmlns:cx7="http://schemas.microsoft.com/office/drawing/2016/5/13/chartex" xmlns:cx8="http://schemas.microsoft.com/office/drawing/2016/5/14/chartex" xmlns:mc="http://schemas.openxmlformats.org/markup-compatibility/2006" xmlns:aink="http://schemas.microsoft.com/office/drawing/2016/ink" xmlns:am3d="http://schemas.microsoft.com/office/drawing/2017/model3d" xmlns:o="urn:schemas-microsoft-com:office:office" xmlns:oel="http://schemas.microsoft.com/office/2019/extlst" xmlns:r="http://schemas.openxmlformats.org/officeDocument/2006/relationships" xmlns:m="http://schemas.openxmlformats.org/officeDocument/2006/math" xmlns:v="urn:schemas-microsoft-com:vml" xmlns:wp14="http://schemas.microsoft.com/office/word/2010/wordprocessingDrawing" xmlns:wp="http://schemas.openxmlformats.org/drawingml/2006/wordprocessingDrawing" xmlns:w10="urn:schemas-microsoft-com:office:word" xmlns:w="http://schemas.openxmlformats.org/wordprocessingml/2006/main" xmlns:w14="http://schemas.microsoft.com/office/word/2010/wordml" xmlns:w15="http://schemas.microsoft.com/office/word/2012/wordml" xmlns:w16cex="http://schemas.microsoft.com/office/word/2018/wordml/cex" xmlns:w16cid="http://schemas.microsoft.com/office/word/2016/wordml/cid" xmlns:w16="http://schemas.microsoft.com/office/word/2018/wordml" xmlns:w16du="http://schemas.microsoft.com/office/word/2023/wordml/word16du" xmlns:w16sdtdh="http://schemas.microsoft.com/office/word/2020/wordml/sdtdatahash" xmlns:w16sdtfl="http://schemas.microsoft.com/office/word/2024/wordml/sdtformatlock" xmlns:w16se="http://schemas.microsoft.com/office/word/2015/wordml/symex" xmlns:wpg="http://schemas.microsoft.com/office/word/2010/wordprocessingGroup" xmlns:wpi="http://schemas.microsoft.com/office/word/2010/wordprocessingInk" xmlns:wne="http://schemas.microsoft.com/office/word/2006/wordml" xmlns:wps="http://schemas.microsoft.com/office/word/2010/wordprocessingShape" mc:Ignorable="w14 w15 w16se w16cid w16 w16cex w16sdtdh w16sdtfl w16du wp14">
   <w:body>
     <w:p>
       <w:pPr>
@@ -102,7 +102,7 @@
               </wp:anchor>
             </w:drawing>
           </mc:Choice>
-          <mc:Fallback>
+          <mc:Fallback xmlns:w16cei="http://schemas.microsoft.com/office/word/2026/wordml/cei">
             <w:pict>
               <v:line w14:anchorId="3C7CCA6B" id="Straight Connector 1" o:spid="_x0000_s1026" style="position:absolute;z-index:251660288;visibility:visible;mso-wrap-style:square;mso-wrap-distance-left:9pt;mso-wrap-distance-top:0;mso-wrap-distance-right:9pt;mso-wrap-distance-bottom:0;mso-position-horizontal:absolute;mso-position-horizontal-relative:text;mso-position-vertical:absolute;mso-position-vertical-relative:text" from="171.3pt,15.1pt" to="313.8pt,15.1pt" o:gfxdata="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" strokecolor="black [3213]" strokeweight=".25pt">
                 <v:stroke joinstyle="miter"/>
@@ -111,6 +111,7 @@
           </mc:Fallback>
         </mc:AlternateContent>
       </w:r>
+      <w:proofErr w:type="spellStart"/>
       <w:r>
         <w:rPr>
           <w:rFonts w:ascii="Times New Roman" w:hAnsi="Times New Roman" w:cs="Times New Roman"/>
@@ -119,8 +120,75 @@
           <w:sz w:val="24"/>
           <w:szCs w:val="24"/>
         </w:rPr>
-        <w:t>Độc Lập - Tự Do - Hạnh</w:t>
-      </w:r>
+        <w:t>Độc</w:t>
+      </w:r>
+      <w:proofErr w:type="spellEnd"/>
+      <w:r>
+        <w:rPr>
+          <w:rFonts w:ascii="Times New Roman" w:hAnsi="Times New Roman" w:cs="Times New Roman"/>
+          <w:b/>
+          <w:bCs/>
+          <w:sz w:val="24"/>
+          <w:szCs w:val="24"/>
+        </w:rPr>
+        <w:t xml:space="preserve"> </w:t>
+      </w:r>
+      <w:proofErr w:type="spellStart"/>
+      <w:r>
+        <w:rPr>
+          <w:rFonts w:ascii="Times New Roman" w:hAnsi="Times New Roman" w:cs="Times New Roman"/>
+          <w:b/>
+          <w:bCs/>
+          <w:sz w:val="24"/>
+          <w:szCs w:val="24"/>
+        </w:rPr>
+        <w:t>Lập</w:t>
+      </w:r>
+      <w:proofErr w:type="spellEnd"/>
+      <w:r>
+        <w:rPr>
+          <w:rFonts w:ascii="Times New Roman" w:hAnsi="Times New Roman" w:cs="Times New Roman"/>
+          <w:b/>
+          <w:bCs/>
+          <w:sz w:val="24"/>
+          <w:szCs w:val="24"/>
+        </w:rPr>
+        <w:t xml:space="preserve"> - </w:t>
+      </w:r>
+      <w:proofErr w:type="spellStart"/>
+      <w:r>
+        <w:rPr>
+          <w:rFonts w:ascii="Times New Roman" w:hAnsi="Times New Roman" w:cs="Times New Roman"/>
+          <w:b/>
+          <w:bCs/>
+          <w:sz w:val="24"/>
+          <w:szCs w:val="24"/>
+        </w:rPr>
+        <w:t>Tự</w:t>
+      </w:r>
+      <w:proofErr w:type="spellEnd"/>
+      <w:r>
+        <w:rPr>
+          <w:rFonts w:ascii="Times New Roman" w:hAnsi="Times New Roman" w:cs="Times New Roman"/>
+          <w:b/>
+          <w:bCs/>
+          <w:sz w:val="24"/>
+          <w:szCs w:val="24"/>
+        </w:rPr>
+        <w:t xml:space="preserve"> Do - </w:t>
+      </w:r>
+      <w:proofErr w:type="spellStart"/>
+      <w:r>
+        <w:rPr>
+          <w:rFonts w:ascii="Times New Roman" w:hAnsi="Times New Roman" w:cs="Times New Roman"/>
+          <w:b/>
+          <w:bCs/>
+          <w:sz w:val="24"/>
+          <w:szCs w:val="24"/>
+        </w:rPr>
+        <w:t>Hạnh</w:t>
+      </w:r>
+      <w:proofErr w:type="spellEnd"/>
       <w:r>
         <w:rPr>
           <w:rFonts w:ascii="Times New Roman" w:hAnsi="Times New Roman" w:cs="Times New Roman"/>
@@ -178,6 +246,7 @@
           <w:szCs w:val="24"/>
         </w:rPr>
       </w:pPr>
+      <w:proofErr w:type="spellStart"/>
       <w:proofErr w:type="gramStart"/>
       <w:r>
         <w:rPr>
@@ -186,7 +255,17 @@
           <w:sz w:val="24"/>
           <w:szCs w:val="24"/>
         </w:rPr>
-        <w:t>Số: {{</w:t>
+        <w:t>Số</w:t>
+      </w:r>
+      <w:proofErr w:type="spellEnd"/>
+      <w:r>
+        <w:rPr>
+          <w:rFonts w:ascii="Times New Roman" w:hAnsi="Times New Roman" w:cs="Times New Roman"/>
+          <w:iCs/>
+          <w:sz w:val="24"/>
+          <w:szCs w:val="24"/>
+        </w:rPr>
+        <w:t>: {{</w:t>
       </w:r>
       <w:proofErr w:type="gramEnd"/>
       <w:r>
@@ -211,15 +290,115 @@
           <w:szCs w:val="24"/>
         </w:rPr>
       </w:pPr>
-      <w:r>
-        <w:rPr>
-          <w:rFonts w:ascii="Times New Roman" w:hAnsi="Times New Roman" w:cs="Times New Roman"/>
-          <w:i/>
-          <w:iCs/>
-          <w:sz w:val="24"/>
-          <w:szCs w:val="24"/>
-        </w:rPr>
-        <w:t>Hôm nay, {{CONTRACT_DATE}}, chúng tôi gồm có:</w:t>
+      <w:proofErr w:type="spellStart"/>
+      <w:r>
+        <w:rPr>
+          <w:rFonts w:ascii="Times New Roman" w:hAnsi="Times New Roman" w:cs="Times New Roman"/>
+          <w:i/>
+          <w:iCs/>
+          <w:sz w:val="24"/>
+          <w:szCs w:val="24"/>
+        </w:rPr>
+        <w:t>Hôm</w:t>
+      </w:r>
+      <w:proofErr w:type="spellEnd"/>
+      <w:r>
+        <w:rPr>
+          <w:rFonts w:ascii="Times New Roman" w:hAnsi="Times New Roman" w:cs="Times New Roman"/>
+          <w:i/>
+          <w:iCs/>
+          <w:sz w:val="24"/>
+          <w:szCs w:val="24"/>
+        </w:rPr>
+        <w:t xml:space="preserve"> nay, {{CONTRACT_DATE}}, </w:t>
+      </w:r>
+      <w:proofErr w:type="spellStart"/>
+      <w:r>
+        <w:rPr>
+          <w:rFonts w:ascii="Times New Roman" w:hAnsi="Times New Roman" w:cs="Times New Roman"/>
+          <w:i/>
+          <w:iCs/>
+          <w:sz w:val="24"/>
+          <w:szCs w:val="24"/>
+        </w:rPr>
+        <w:t>chúng</w:t>
+      </w:r>
+      <w:proofErr w:type="spellEnd"/>
+      <w:r>
+        <w:rPr>
+          <w:rFonts w:ascii="Times New Roman" w:hAnsi="Times New Roman" w:cs="Times New Roman"/>
+          <w:i/>
+          <w:iCs/>
+          <w:sz w:val="24"/>
+          <w:szCs w:val="24"/>
+        </w:rPr>
+        <w:t xml:space="preserve"> </w:t>
+      </w:r>
+      <w:proofErr w:type="spellStart"/>
+      <w:r>
+        <w:rPr>
+          <w:rFonts w:ascii="Times New Roman" w:hAnsi="Times New Roman" w:cs="Times New Roman"/>
+          <w:i/>
+          <w:iCs/>
+          <w:sz w:val="24"/>
+          <w:szCs w:val="24"/>
+        </w:rPr>
+        <w:t>tôi</w:t>
+      </w:r>
+      <w:proofErr w:type="spellEnd"/>
+      <w:r>
+        <w:rPr>
+          <w:rFonts w:ascii="Times New Roman" w:hAnsi="Times New Roman" w:cs="Times New Roman"/>
+          <w:i/>
+          <w:iCs/>
+          <w:sz w:val="24"/>
+          <w:szCs w:val="24"/>
+        </w:rPr>
+        <w:t xml:space="preserve"> </w:t>
+      </w:r>
+      <w:proofErr w:type="spellStart"/>
+      <w:r>
+        <w:rPr>
+          <w:rFonts w:ascii="Times New Roman" w:hAnsi="Times New Roman" w:cs="Times New Roman"/>
+          <w:i/>
+          <w:iCs/>
+          <w:sz w:val="24"/>
+          <w:szCs w:val="24"/>
+        </w:rPr>
+        <w:t>gồm</w:t>
+      </w:r>
+      <w:proofErr w:type="spellEnd"/>
+      <w:r>
+        <w:rPr>
+          <w:rFonts w:ascii="Times New Roman" w:hAnsi="Times New Roman" w:cs="Times New Roman"/>
+          <w:i/>
+          <w:iCs/>
+          <w:sz w:val="24"/>
+          <w:szCs w:val="24"/>
+        </w:rPr>
+        <w:t xml:space="preserve"> </w:t>
+      </w:r>
+      <w:proofErr w:type="spellStart"/>
+      <w:r>
+        <w:rPr>
+          <w:rFonts w:ascii="Times New Roman" w:hAnsi="Times New Roman" w:cs="Times New Roman"/>
+          <w:i/>
+          <w:iCs/>
+          <w:sz w:val="24"/>
+          <w:szCs w:val="24"/>
+        </w:rPr>
+        <w:t>có</w:t>
+      </w:r>
+      <w:proofErr w:type="spellEnd"/>
+      <w:r>
+        <w:rPr>
+          <w:rFonts w:ascii="Times New Roman" w:hAnsi="Times New Roman" w:cs="Times New Roman"/>
+          <w:i/>
+          <w:iCs/>
+          <w:sz w:val="24"/>
+          <w:szCs w:val="24"/>
+        </w:rPr>
+        <w:t>:</w:t>
       </w:r>
     </w:p>
     <w:p>
@@ -244,6 +423,901 @@
           <w:szCs w:val="24"/>
         </w:rPr>
         <w:t>BÊN A: {{CUSTOMER_COMPANY}}</w:t>
+      </w:r>
+    </w:p>
+    <w:tbl>
+      <w:tblPr>
+        <w:tblStyle w:val="TableGrid"/>
+        <w:tblW w:w="0" w:type="auto"/>
+        <w:tblBorders>
+          <w:top w:val="none" w:sz="0" w:space="0" w:color="auto"/>
+          <w:left w:val="none" w:sz="0" w:space="0" w:color="auto"/>
+          <w:bottom w:val="none" w:sz="0" w:space="0" w:color="auto"/>
+          <w:right w:val="none" w:sz="0" w:space="0" w:color="auto"/>
+          <w:insideH w:val="none" w:sz="0" w:space="0" w:color="auto"/>
+          <w:insideV w:val="none" w:sz="0" w:space="0" w:color="auto"/>
+        </w:tblBorders>
+        <w:tblLook w:val="04A0" w:firstRow="1" w:lastRow="0" w:firstColumn="1" w:lastColumn="0" w:noHBand="0" w:noVBand="1"/>
+      </w:tblPr>
+      <w:tblGrid>
+        <w:gridCol w:w="2093"/>
+        <w:gridCol w:w="368"/>
+        <w:gridCol w:w="3421"/>
+        <w:gridCol w:w="3724"/>
+      </w:tblGrid>
+      <w:tr>
+        <w:tc>
+          <w:tcPr>
+            <w:tcW w:w="2093" w:type="dxa"/>
+          </w:tcPr>
+          <w:p>
+            <w:pPr>
+              <w:spacing w:after="0" w:line="288" w:lineRule="auto"/>
+              <w:rPr>
+                <w:rFonts w:ascii="Times New Roman" w:hAnsi="Times New Roman" w:cs="Times New Roman"/>
+                <w:sz w:val="24"/>
+                <w:szCs w:val="24"/>
+              </w:rPr>
+            </w:pPr>
+            <w:proofErr w:type="spellStart"/>
+            <w:r>
+              <w:rPr>
+                <w:rFonts w:ascii="Times New Roman" w:hAnsi="Times New Roman" w:cs="Times New Roman"/>
+                <w:sz w:val="24"/>
+                <w:szCs w:val="24"/>
+              </w:rPr>
+              <w:t>Người</w:t>
+            </w:r>
+            <w:proofErr w:type="spellEnd"/>
+            <w:r>
+              <w:rPr>
+                <w:rFonts w:ascii="Times New Roman" w:hAnsi="Times New Roman" w:cs="Times New Roman"/>
+                <w:sz w:val="24"/>
+                <w:szCs w:val="24"/>
+              </w:rPr>
+              <w:t xml:space="preserve"> </w:t>
+            </w:r>
+            <w:proofErr w:type="spellStart"/>
+            <w:r>
+              <w:rPr>
+                <w:rFonts w:ascii="Times New Roman" w:hAnsi="Times New Roman" w:cs="Times New Roman"/>
+                <w:sz w:val="24"/>
+                <w:szCs w:val="24"/>
+              </w:rPr>
+              <w:t>đại</w:t>
+            </w:r>
+            <w:proofErr w:type="spellEnd"/>
+            <w:r>
+              <w:rPr>
+                <w:rFonts w:ascii="Times New Roman" w:hAnsi="Times New Roman" w:cs="Times New Roman"/>
+                <w:spacing w:val="-4"/>
+                <w:sz w:val="24"/>
+                <w:szCs w:val="24"/>
+              </w:rPr>
+              <w:t xml:space="preserve"> </w:t>
+            </w:r>
+            <w:proofErr w:type="spellStart"/>
+            <w:r>
+              <w:rPr>
+                <w:rFonts w:ascii="Times New Roman" w:hAnsi="Times New Roman" w:cs="Times New Roman"/>
+                <w:sz w:val="24"/>
+                <w:szCs w:val="24"/>
+              </w:rPr>
+              <w:t>diện</w:t>
+            </w:r>
+            <w:proofErr w:type="spellEnd"/>
+          </w:p>
+        </w:tc>
+        <w:tc>
+          <w:tcPr>
+            <w:tcW w:w="368" w:type="dxa"/>
+          </w:tcPr>
+          <w:p>
+            <w:pPr>
+              <w:spacing w:after="0" w:line="288" w:lineRule="auto"/>
+              <w:rPr>
+                <w:rFonts w:ascii="Times New Roman" w:hAnsi="Times New Roman" w:cs="Times New Roman"/>
+                <w:sz w:val="24"/>
+                <w:szCs w:val="24"/>
+              </w:rPr>
+            </w:pPr>
+            <w:r>
+              <w:rPr>
+                <w:rFonts w:ascii="Times New Roman" w:hAnsi="Times New Roman" w:cs="Times New Roman"/>
+                <w:sz w:val="24"/>
+                <w:szCs w:val="24"/>
+              </w:rPr>
+              <w:t>:</w:t>
+            </w:r>
+          </w:p>
+        </w:tc>
+        <w:tc>
+          <w:tcPr>
+            <w:tcW w:w="3421" w:type="dxa"/>
+          </w:tcPr>
+          <w:p>
+            <w:pPr>
+              <w:spacing w:after="0" w:line="288" w:lineRule="auto"/>
+              <w:rPr>
+                <w:rFonts w:ascii="Times New Roman" w:hAnsi="Times New Roman" w:cs="Times New Roman"/>
+                <w:sz w:val="24"/>
+                <w:szCs w:val="24"/>
+              </w:rPr>
+            </w:pPr>
+            <w:r>
+              <w:rPr>
+                <w:rFonts w:ascii="Times New Roman" w:hAnsi="Times New Roman" w:cs="Times New Roman"/>
+                <w:sz w:val="24"/>
+                <w:szCs w:val="24"/>
+              </w:rPr>
+              <w:t>{{CUSTOMER_NAME}}</w:t>
+            </w:r>
+          </w:p>
+        </w:tc>
+        <w:tc>
+          <w:tcPr>
+            <w:tcW w:w="3724" w:type="dxa"/>
+          </w:tcPr>
+          <w:p>
+            <w:pPr>
+              <w:spacing w:after="0" w:line="288" w:lineRule="auto"/>
+              <w:ind w:left="180"/>
+              <w:rPr>
+                <w:rFonts w:ascii="Times New Roman" w:hAnsi="Times New Roman" w:cs="Times New Roman"/>
+                <w:sz w:val="24"/>
+                <w:szCs w:val="24"/>
+              </w:rPr>
+            </w:pPr>
+            <w:proofErr w:type="spellStart"/>
+            <w:r>
+              <w:rPr>
+                <w:rFonts w:ascii="Times New Roman" w:hAnsi="Times New Roman" w:cs="Times New Roman"/>
+                <w:sz w:val="24"/>
+                <w:szCs w:val="24"/>
+              </w:rPr>
+              <w:t>Chức</w:t>
+            </w:r>
+            <w:proofErr w:type="spellEnd"/>
+            <w:r>
+              <w:rPr>
+                <w:rFonts w:ascii="Times New Roman" w:hAnsi="Times New Roman" w:cs="Times New Roman"/>
+                <w:sz w:val="24"/>
+                <w:szCs w:val="24"/>
+              </w:rPr>
+              <w:t xml:space="preserve"> </w:t>
+            </w:r>
+            <w:proofErr w:type="spellStart"/>
+            <w:r>
+              <w:rPr>
+                <w:rFonts w:ascii="Times New Roman" w:hAnsi="Times New Roman" w:cs="Times New Roman"/>
+                <w:sz w:val="24"/>
+                <w:szCs w:val="24"/>
+              </w:rPr>
+              <w:t>vụ</w:t>
+            </w:r>
+            <w:proofErr w:type="spellEnd"/>
+            <w:r>
+              <w:rPr>
+                <w:rFonts w:ascii="Times New Roman" w:hAnsi="Times New Roman" w:cs="Times New Roman"/>
+                <w:sz w:val="24"/>
+                <w:szCs w:val="24"/>
+              </w:rPr>
+              <w:t>: ................................</w:t>
+            </w:r>
+          </w:p>
+        </w:tc>
+      </w:tr>
+      <w:tr>
+        <w:tc>
+          <w:tcPr>
+            <w:tcW w:w="2093" w:type="dxa"/>
+          </w:tcPr>
+          <w:p>
+            <w:pPr>
+              <w:spacing w:after="0" w:line="288" w:lineRule="auto"/>
+              <w:rPr>
+                <w:rFonts w:ascii="Times New Roman" w:hAnsi="Times New Roman" w:cs="Times New Roman"/>
+                <w:sz w:val="24"/>
+                <w:szCs w:val="24"/>
+              </w:rPr>
+            </w:pPr>
+            <w:proofErr w:type="spellStart"/>
+            <w:r>
+              <w:rPr>
+                <w:rFonts w:ascii="Times New Roman" w:hAnsi="Times New Roman" w:cs="Times New Roman"/>
+                <w:sz w:val="24"/>
+                <w:szCs w:val="24"/>
+              </w:rPr>
+              <w:t>Địa</w:t>
+            </w:r>
+            <w:proofErr w:type="spellEnd"/>
+            <w:r>
+              <w:rPr>
+                <w:rFonts w:ascii="Times New Roman" w:hAnsi="Times New Roman" w:cs="Times New Roman"/>
+                <w:spacing w:val="-2"/>
+                <w:sz w:val="24"/>
+                <w:szCs w:val="24"/>
+              </w:rPr>
+              <w:t xml:space="preserve"> </w:t>
+            </w:r>
+            <w:proofErr w:type="spellStart"/>
+            <w:r>
+              <w:rPr>
+                <w:rFonts w:ascii="Times New Roman" w:hAnsi="Times New Roman" w:cs="Times New Roman"/>
+                <w:sz w:val="24"/>
+                <w:szCs w:val="24"/>
+              </w:rPr>
+              <w:t>chỉ</w:t>
+            </w:r>
+            <w:proofErr w:type="spellEnd"/>
+          </w:p>
+        </w:tc>
+        <w:tc>
+          <w:tcPr>
+            <w:tcW w:w="368" w:type="dxa"/>
+          </w:tcPr>
+          <w:p>
+            <w:pPr>
+              <w:spacing w:after="0" w:line="288" w:lineRule="auto"/>
+              <w:rPr>
+                <w:rFonts w:ascii="Times New Roman" w:hAnsi="Times New Roman" w:cs="Times New Roman"/>
+                <w:sz w:val="24"/>
+                <w:szCs w:val="24"/>
+              </w:rPr>
+            </w:pPr>
+            <w:r>
+              <w:rPr>
+                <w:rFonts w:ascii="Times New Roman" w:hAnsi="Times New Roman" w:cs="Times New Roman"/>
+                <w:sz w:val="24"/>
+                <w:szCs w:val="24"/>
+              </w:rPr>
+              <w:t>:</w:t>
+            </w:r>
+          </w:p>
+        </w:tc>
+        <w:tc>
+          <w:tcPr>
+            <w:tcW w:w="3421" w:type="dxa"/>
+          </w:tcPr>
+          <w:p>
+            <w:pPr>
+              <w:spacing w:after="0" w:line="288" w:lineRule="auto"/>
+              <w:rPr>
+                <w:rFonts w:ascii="Times New Roman" w:hAnsi="Times New Roman" w:cs="Times New Roman"/>
+                <w:sz w:val="24"/>
+                <w:szCs w:val="24"/>
+              </w:rPr>
+            </w:pPr>
+            <w:r>
+              <w:rPr>
+                <w:rFonts w:ascii="Times New Roman" w:hAnsi="Times New Roman" w:cs="Times New Roman"/>
+                <w:sz w:val="24"/>
+                <w:szCs w:val="24"/>
+              </w:rPr>
+              <w:t>{{CUSTOMER_ADDRESS}}</w:t>
+            </w:r>
+          </w:p>
+        </w:tc>
+        <w:tc>
+          <w:tcPr>
+            <w:tcW w:w="3724" w:type="dxa"/>
+          </w:tcPr>
+          <w:p>
+            <w:pPr>
+              <w:spacing w:after="0" w:line="288" w:lineRule="auto"/>
+              <w:rPr>
+                <w:rFonts w:ascii="Times New Roman" w:hAnsi="Times New Roman" w:cs="Times New Roman"/>
+                <w:sz w:val="24"/>
+                <w:szCs w:val="24"/>
+              </w:rPr>
+            </w:pPr>
+          </w:p>
+        </w:tc>
+      </w:tr>
+      <w:tr>
+        <w:tc>
+          <w:tcPr>
+            <w:tcW w:w="2093" w:type="dxa"/>
+          </w:tcPr>
+          <w:p>
+            <w:pPr>
+              <w:spacing w:after="0" w:line="288" w:lineRule="auto"/>
+              <w:rPr>
+                <w:rFonts w:ascii="Times New Roman" w:hAnsi="Times New Roman" w:cs="Times New Roman"/>
+                <w:sz w:val="24"/>
+                <w:szCs w:val="24"/>
+              </w:rPr>
+            </w:pPr>
+            <w:proofErr w:type="spellStart"/>
+            <w:r>
+              <w:rPr>
+                <w:rFonts w:ascii="Times New Roman" w:hAnsi="Times New Roman" w:cs="Times New Roman"/>
+                <w:sz w:val="24"/>
+                <w:szCs w:val="24"/>
+              </w:rPr>
+              <w:t>Điện</w:t>
+            </w:r>
+            <w:proofErr w:type="spellEnd"/>
+            <w:r>
+              <w:rPr>
+                <w:rFonts w:ascii="Times New Roman" w:hAnsi="Times New Roman" w:cs="Times New Roman"/>
+                <w:spacing w:val="-2"/>
+                <w:sz w:val="24"/>
+                <w:szCs w:val="24"/>
+              </w:rPr>
+              <w:t xml:space="preserve"> </w:t>
+            </w:r>
+            <w:proofErr w:type="spellStart"/>
+            <w:r>
+              <w:rPr>
+                <w:rFonts w:ascii="Times New Roman" w:hAnsi="Times New Roman" w:cs="Times New Roman"/>
+                <w:sz w:val="24"/>
+                <w:szCs w:val="24"/>
+              </w:rPr>
+              <w:t>thoại</w:t>
+            </w:r>
+            <w:proofErr w:type="spellEnd"/>
+          </w:p>
+        </w:tc>
+        <w:tc>
+          <w:tcPr>
+            <w:tcW w:w="368" w:type="dxa"/>
+          </w:tcPr>
+          <w:p>
+            <w:pPr>
+              <w:spacing w:after="0" w:line="288" w:lineRule="auto"/>
+              <w:rPr>
+                <w:rFonts w:ascii="Times New Roman" w:hAnsi="Times New Roman" w:cs="Times New Roman"/>
+                <w:sz w:val="24"/>
+                <w:szCs w:val="24"/>
+              </w:rPr>
+            </w:pPr>
+            <w:r>
+              <w:rPr>
+                <w:rFonts w:ascii="Times New Roman" w:hAnsi="Times New Roman" w:cs="Times New Roman"/>
+                <w:sz w:val="24"/>
+                <w:szCs w:val="24"/>
+              </w:rPr>
+              <w:t>:</w:t>
+            </w:r>
+          </w:p>
+        </w:tc>
+        <w:tc>
+          <w:tcPr>
+            <w:tcW w:w="3421" w:type="dxa"/>
+          </w:tcPr>
+          <w:p>
+            <w:pPr>
+              <w:spacing w:after="0" w:line="288" w:lineRule="auto"/>
+              <w:rPr>
+                <w:rFonts w:ascii="Times New Roman" w:hAnsi="Times New Roman" w:cs="Times New Roman"/>
+                <w:sz w:val="24"/>
+                <w:szCs w:val="24"/>
+              </w:rPr>
+            </w:pPr>
+            <w:r>
+              <w:rPr>
+                <w:rFonts w:ascii="Times New Roman" w:hAnsi="Times New Roman" w:cs="Times New Roman"/>
+                <w:sz w:val="24"/>
+                <w:szCs w:val="24"/>
+                <w:lang w:val="pt-BR"/>
+              </w:rPr>
+              <w:t>{{CUSTOMER_PHONE}}</w:t>
+            </w:r>
+          </w:p>
+        </w:tc>
+        <w:tc>
+          <w:tcPr>
+            <w:tcW w:w="3724" w:type="dxa"/>
+          </w:tcPr>
+          <w:p>
+            <w:pPr>
+              <w:spacing w:after="0" w:line="288" w:lineRule="auto"/>
+              <w:ind w:left="180"/>
+              <w:rPr>
+                <w:rFonts w:ascii="Times New Roman" w:hAnsi="Times New Roman" w:cs="Times New Roman"/>
+                <w:sz w:val="24"/>
+                <w:szCs w:val="24"/>
+              </w:rPr>
+            </w:pPr>
+            <w:r>
+              <w:rPr>
+                <w:rFonts w:ascii="Times New Roman" w:hAnsi="Times New Roman" w:cs="Times New Roman"/>
+                <w:sz w:val="24"/>
+                <w:szCs w:val="24"/>
+                <w:lang w:val="pt-BR"/>
+              </w:rPr>
+              <w:t>Fax: {{CUSTOMER_FAX}}</w:t>
+            </w:r>
+          </w:p>
+        </w:tc>
+      </w:tr>
+      <w:tr>
+        <w:tc>
+          <w:tcPr>
+            <w:tcW w:w="2093" w:type="dxa"/>
+          </w:tcPr>
+          <w:p>
+            <w:pPr>
+              <w:spacing w:after="0" w:line="288" w:lineRule="auto"/>
+              <w:rPr>
+                <w:rFonts w:ascii="Times New Roman" w:hAnsi="Times New Roman" w:cs="Times New Roman"/>
+                <w:sz w:val="24"/>
+                <w:szCs w:val="24"/>
+              </w:rPr>
+            </w:pPr>
+            <w:proofErr w:type="spellStart"/>
+            <w:r>
+              <w:rPr>
+                <w:rFonts w:ascii="Times New Roman" w:hAnsi="Times New Roman" w:cs="Times New Roman"/>
+                <w:sz w:val="24"/>
+                <w:szCs w:val="24"/>
+              </w:rPr>
+              <w:t>Mã</w:t>
+            </w:r>
+            <w:proofErr w:type="spellEnd"/>
+            <w:r>
+              <w:rPr>
+                <w:rFonts w:ascii="Times New Roman" w:hAnsi="Times New Roman" w:cs="Times New Roman"/>
+                <w:sz w:val="24"/>
+                <w:szCs w:val="24"/>
+              </w:rPr>
+              <w:t xml:space="preserve"> </w:t>
+            </w:r>
+            <w:proofErr w:type="spellStart"/>
+            <w:r>
+              <w:rPr>
+                <w:rFonts w:ascii="Times New Roman" w:hAnsi="Times New Roman" w:cs="Times New Roman"/>
+                <w:sz w:val="24"/>
+                <w:szCs w:val="24"/>
+              </w:rPr>
+              <w:t>khách</w:t>
+            </w:r>
+            <w:proofErr w:type="spellEnd"/>
+            <w:r>
+              <w:rPr>
+                <w:rFonts w:ascii="Times New Roman" w:hAnsi="Times New Roman" w:cs="Times New Roman"/>
+                <w:sz w:val="24"/>
+                <w:szCs w:val="24"/>
+              </w:rPr>
+              <w:t xml:space="preserve"> </w:t>
+            </w:r>
+            <w:proofErr w:type="spellStart"/>
+            <w:r>
+              <w:rPr>
+                <w:rFonts w:ascii="Times New Roman" w:hAnsi="Times New Roman" w:cs="Times New Roman"/>
+                <w:sz w:val="24"/>
+                <w:szCs w:val="24"/>
+              </w:rPr>
+              <w:t>hàng</w:t>
+            </w:r>
+            <w:proofErr w:type="spellEnd"/>
+          </w:p>
+          <w:p>
+            <w:pPr>
+              <w:spacing w:after="0" w:line="288" w:lineRule="auto"/>
+              <w:rPr>
+                <w:rFonts w:ascii="Times New Roman" w:hAnsi="Times New Roman" w:cs="Times New Roman"/>
+                <w:sz w:val="24"/>
+                <w:szCs w:val="24"/>
+              </w:rPr>
+            </w:pPr>
+            <w:proofErr w:type="spellStart"/>
+            <w:r>
+              <w:rPr>
+                <w:rFonts w:ascii="Times New Roman" w:hAnsi="Times New Roman" w:cs="Times New Roman"/>
+                <w:sz w:val="24"/>
+                <w:szCs w:val="24"/>
+              </w:rPr>
+              <w:t>Mã</w:t>
+            </w:r>
+            <w:proofErr w:type="spellEnd"/>
+            <w:r>
+              <w:rPr>
+                <w:rFonts w:ascii="Times New Roman" w:hAnsi="Times New Roman" w:cs="Times New Roman"/>
+                <w:sz w:val="24"/>
+                <w:szCs w:val="24"/>
+              </w:rPr>
+              <w:t xml:space="preserve"> </w:t>
+            </w:r>
+            <w:proofErr w:type="spellStart"/>
+            <w:r>
+              <w:rPr>
+                <w:rFonts w:ascii="Times New Roman" w:hAnsi="Times New Roman" w:cs="Times New Roman"/>
+                <w:sz w:val="24"/>
+                <w:szCs w:val="24"/>
+              </w:rPr>
+              <w:t>số</w:t>
+            </w:r>
+            <w:proofErr w:type="spellEnd"/>
+            <w:r>
+              <w:rPr>
+                <w:rFonts w:ascii="Times New Roman" w:hAnsi="Times New Roman" w:cs="Times New Roman"/>
+                <w:sz w:val="24"/>
+                <w:szCs w:val="24"/>
+              </w:rPr>
+              <w:t xml:space="preserve"> </w:t>
+            </w:r>
+            <w:proofErr w:type="spellStart"/>
+            <w:r>
+              <w:rPr>
+                <w:rFonts w:ascii="Times New Roman" w:hAnsi="Times New Roman" w:cs="Times New Roman"/>
+                <w:sz w:val="24"/>
+                <w:szCs w:val="24"/>
+              </w:rPr>
+              <w:t>thuế</w:t>
+            </w:r>
+            <w:proofErr w:type="spellEnd"/>
+          </w:p>
+          <w:p>
+            <w:pPr>
+              <w:spacing w:after="0" w:line="288" w:lineRule="auto"/>
+              <w:rPr>
+                <w:rFonts w:ascii="Times New Roman" w:hAnsi="Times New Roman" w:cs="Times New Roman"/>
+                <w:sz w:val="24"/>
+                <w:szCs w:val="24"/>
+              </w:rPr>
+            </w:pPr>
+            <w:r>
+              <w:rPr>
+                <w:rFonts w:ascii="Times New Roman" w:hAnsi="Times New Roman" w:cs="Times New Roman"/>
+                <w:sz w:val="24"/>
+                <w:szCs w:val="24"/>
+              </w:rPr>
+              <w:t>Email</w:t>
+            </w:r>
+          </w:p>
+        </w:tc>
+        <w:tc>
+          <w:tcPr>
+            <w:tcW w:w="368" w:type="dxa"/>
+          </w:tcPr>
+          <w:p>
+            <w:pPr>
+              <w:spacing w:after="0" w:line="288" w:lineRule="auto"/>
+              <w:rPr>
+                <w:rFonts w:ascii="Times New Roman" w:hAnsi="Times New Roman" w:cs="Times New Roman"/>
+                <w:sz w:val="24"/>
+                <w:szCs w:val="24"/>
+              </w:rPr>
+            </w:pPr>
+            <w:r>
+              <w:rPr>
+                <w:rFonts w:ascii="Times New Roman" w:hAnsi="Times New Roman" w:cs="Times New Roman"/>
+                <w:sz w:val="24"/>
+                <w:szCs w:val="24"/>
+              </w:rPr>
+              <w:t>:</w:t>
+            </w:r>
+          </w:p>
+          <w:p>
+            <w:pPr>
+              <w:spacing w:after="0" w:line="288" w:lineRule="auto"/>
+              <w:rPr>
+                <w:rFonts w:ascii="Times New Roman" w:hAnsi="Times New Roman" w:cs="Times New Roman"/>
+                <w:sz w:val="24"/>
+                <w:szCs w:val="24"/>
+              </w:rPr>
+            </w:pPr>
+            <w:r>
+              <w:rPr>
+                <w:rFonts w:ascii="Times New Roman" w:hAnsi="Times New Roman" w:cs="Times New Roman"/>
+                <w:sz w:val="24"/>
+                <w:szCs w:val="24"/>
+              </w:rPr>
+              <w:t>:</w:t>
+            </w:r>
+          </w:p>
+          <w:p>
+            <w:pPr>
+              <w:spacing w:after="0" w:line="288" w:lineRule="auto"/>
+              <w:rPr>
+                <w:rFonts w:ascii="Times New Roman" w:hAnsi="Times New Roman" w:cs="Times New Roman"/>
+                <w:sz w:val="24"/>
+                <w:szCs w:val="24"/>
+              </w:rPr>
+            </w:pPr>
+            <w:r>
+              <w:rPr>
+                <w:rFonts w:ascii="Times New Roman" w:hAnsi="Times New Roman" w:cs="Times New Roman"/>
+                <w:sz w:val="24"/>
+                <w:szCs w:val="24"/>
+              </w:rPr>
+              <w:t>:</w:t>
+            </w:r>
+          </w:p>
+        </w:tc>
+        <w:tc>
+          <w:tcPr>
+            <w:tcW w:w="3421" w:type="dxa"/>
+          </w:tcPr>
+          <w:p>
+            <w:pPr>
+              <w:spacing w:after="0" w:line="288" w:lineRule="auto"/>
+              <w:rPr>
+                <w:rFonts w:ascii="Times New Roman" w:hAnsi="Times New Roman" w:cs="Times New Roman"/>
+                <w:sz w:val="24"/>
+                <w:szCs w:val="24"/>
+              </w:rPr>
+            </w:pPr>
+            <w:r>
+              <w:rPr>
+                <w:rFonts w:ascii="Times New Roman" w:hAnsi="Times New Roman" w:cs="Times New Roman"/>
+                <w:sz w:val="24"/>
+                <w:szCs w:val="24"/>
+              </w:rPr>
+              <w:t>{{CUSTOMER_CODE}}</w:t>
+            </w:r>
+          </w:p>
+          <w:p>
+            <w:pPr>
+              <w:spacing w:after="0" w:line="288" w:lineRule="auto"/>
+              <w:rPr>
+                <w:rFonts w:ascii="Times New Roman" w:hAnsi="Times New Roman" w:cs="Times New Roman"/>
+                <w:sz w:val="24"/>
+                <w:szCs w:val="24"/>
+              </w:rPr>
+            </w:pPr>
+            <w:r>
+              <w:rPr>
+                <w:rFonts w:ascii="Times New Roman" w:hAnsi="Times New Roman" w:cs="Times New Roman"/>
+                <w:sz w:val="24"/>
+                <w:szCs w:val="24"/>
+              </w:rPr>
+              <w:t>{{CUSTOMER_TAX_CODE}}</w:t>
+            </w:r>
+          </w:p>
+          <w:p>
+            <w:pPr>
+              <w:spacing w:after="0" w:line="288" w:lineRule="auto"/>
+              <w:rPr>
+                <w:rFonts w:ascii="Times New Roman" w:hAnsi="Times New Roman" w:cs="Times New Roman"/>
+                <w:sz w:val="24"/>
+                <w:szCs w:val="24"/>
+              </w:rPr>
+            </w:pPr>
+            <w:r>
+              <w:rPr>
+                <w:rFonts w:ascii="Times New Roman" w:hAnsi="Times New Roman" w:cs="Times New Roman"/>
+                <w:sz w:val="24"/>
+                <w:szCs w:val="24"/>
+              </w:rPr>
+              <w:t>{{CUSTOMER_EMAIL}}</w:t>
+            </w:r>
+          </w:p>
+        </w:tc>
+        <w:tc>
+          <w:tcPr>
+            <w:tcW w:w="3724" w:type="dxa"/>
+          </w:tcPr>
+          <w:p>
+            <w:pPr>
+              <w:spacing w:after="160" w:line="278" w:lineRule="auto"/>
+              <w:rPr>
+                <w:rFonts w:ascii="Times New Roman" w:hAnsi="Times New Roman" w:cs="Times New Roman"/>
+                <w:sz w:val="24"/>
+                <w:szCs w:val="24"/>
+              </w:rPr>
+            </w:pPr>
+          </w:p>
+          <w:p>
+            <w:pPr>
+              <w:spacing w:after="0" w:line="288" w:lineRule="auto"/>
+              <w:rPr>
+                <w:rFonts w:ascii="Times New Roman" w:hAnsi="Times New Roman" w:cs="Times New Roman"/>
+                <w:sz w:val="24"/>
+                <w:szCs w:val="24"/>
+              </w:rPr>
+            </w:pPr>
+          </w:p>
+        </w:tc>
+      </w:tr>
+    </w:tbl>
+    <w:p>
+      <w:pPr>
+        <w:spacing w:after="0" w:line="288" w:lineRule="auto"/>
+        <w:rPr>
+          <w:rFonts w:ascii="Times New Roman" w:hAnsi="Times New Roman" w:cs="Times New Roman"/>
+          <w:sz w:val="24"/>
+          <w:szCs w:val="24"/>
+        </w:rPr>
+      </w:pPr>
+    </w:p>
+    <w:p>
+      <w:pPr>
+        <w:spacing w:after="0" w:line="288" w:lineRule="auto"/>
+        <w:rPr>
+          <w:rFonts w:ascii="Times New Roman" w:hAnsi="Times New Roman" w:cs="Times New Roman"/>
+          <w:i/>
+          <w:iCs/>
+          <w:sz w:val="24"/>
+          <w:szCs w:val="24"/>
+          <w:lang w:val="fr-FR"/>
+        </w:rPr>
+      </w:pPr>
+      <w:r>
+        <w:rPr>
+          <w:rFonts w:ascii="Times New Roman" w:hAnsi="Times New Roman" w:cs="Times New Roman"/>
+          <w:i/>
+          <w:iCs/>
+          <w:sz w:val="24"/>
+          <w:szCs w:val="24"/>
+          <w:lang w:val="fr-FR"/>
+        </w:rPr>
+        <w:t xml:space="preserve">(Sau </w:t>
+      </w:r>
+      <w:proofErr w:type="spellStart"/>
+      <w:r>
+        <w:rPr>
+          <w:rFonts w:ascii="Times New Roman" w:hAnsi="Times New Roman" w:cs="Times New Roman"/>
+          <w:i/>
+          <w:iCs/>
+          <w:sz w:val="24"/>
+          <w:szCs w:val="24"/>
+          <w:lang w:val="fr-FR"/>
+        </w:rPr>
+        <w:t>đây</w:t>
+      </w:r>
+      <w:proofErr w:type="spellEnd"/>
+      <w:r>
+        <w:rPr>
+          <w:rFonts w:ascii="Times New Roman" w:hAnsi="Times New Roman" w:cs="Times New Roman"/>
+          <w:i/>
+          <w:iCs/>
+          <w:sz w:val="24"/>
+          <w:szCs w:val="24"/>
+          <w:lang w:val="fr-FR"/>
+        </w:rPr>
+        <w:t xml:space="preserve"> </w:t>
+      </w:r>
+      <w:proofErr w:type="spellStart"/>
+      <w:r>
+        <w:rPr>
+          <w:rFonts w:ascii="Times New Roman" w:hAnsi="Times New Roman" w:cs="Times New Roman"/>
+          <w:i/>
+          <w:iCs/>
+          <w:sz w:val="24"/>
+          <w:szCs w:val="24"/>
+          <w:lang w:val="fr-FR"/>
+        </w:rPr>
+        <w:t>gọi</w:t>
+      </w:r>
+      <w:proofErr w:type="spellEnd"/>
+      <w:r>
+        <w:rPr>
+          <w:rFonts w:ascii="Times New Roman" w:hAnsi="Times New Roman" w:cs="Times New Roman"/>
+          <w:i/>
+          <w:iCs/>
+          <w:sz w:val="24"/>
+          <w:szCs w:val="24"/>
+          <w:lang w:val="fr-FR"/>
+        </w:rPr>
+        <w:t xml:space="preserve"> </w:t>
+      </w:r>
+      <w:proofErr w:type="spellStart"/>
+      <w:r>
+        <w:rPr>
+          <w:rFonts w:ascii="Times New Roman" w:hAnsi="Times New Roman" w:cs="Times New Roman"/>
+          <w:i/>
+          <w:iCs/>
+          <w:sz w:val="24"/>
+          <w:szCs w:val="24"/>
+          <w:lang w:val="fr-FR"/>
+        </w:rPr>
+        <w:t>tắt</w:t>
+      </w:r>
+      <w:proofErr w:type="spellEnd"/>
+      <w:r>
+        <w:rPr>
+          <w:rFonts w:ascii="Times New Roman" w:hAnsi="Times New Roman" w:cs="Times New Roman"/>
+          <w:i/>
+          <w:iCs/>
+          <w:sz w:val="24"/>
+          <w:szCs w:val="24"/>
+          <w:lang w:val="fr-FR"/>
+        </w:rPr>
+        <w:t xml:space="preserve"> là “</w:t>
+      </w:r>
+      <w:proofErr w:type="spellStart"/>
+      <w:r>
+        <w:rPr>
+          <w:rFonts w:ascii="Times New Roman" w:hAnsi="Times New Roman" w:cs="Times New Roman"/>
+          <w:b/>
+          <w:bCs/>
+          <w:i/>
+          <w:iCs/>
+          <w:sz w:val="24"/>
+          <w:szCs w:val="24"/>
+          <w:lang w:val="fr-FR"/>
+        </w:rPr>
+        <w:t>Bên</w:t>
+      </w:r>
+      <w:proofErr w:type="spellEnd"/>
+      <w:r>
+        <w:rPr>
+          <w:rFonts w:ascii="Times New Roman" w:hAnsi="Times New Roman" w:cs="Times New Roman"/>
+          <w:b/>
+          <w:bCs/>
+          <w:i/>
+          <w:iCs/>
+          <w:spacing w:val="-3"/>
+          <w:sz w:val="24"/>
+          <w:szCs w:val="24"/>
+          <w:lang w:val="fr-FR"/>
+        </w:rPr>
+        <w:t xml:space="preserve"> </w:t>
+      </w:r>
+      <w:r>
+        <w:rPr>
+          <w:rFonts w:ascii="Times New Roman" w:hAnsi="Times New Roman" w:cs="Times New Roman"/>
+          <w:b/>
+          <w:bCs/>
+          <w:i/>
+          <w:iCs/>
+          <w:sz w:val="24"/>
+          <w:szCs w:val="24"/>
+          <w:lang w:val="fr-FR"/>
+        </w:rPr>
+        <w:t>A</w:t>
+      </w:r>
+      <w:r>
+        <w:rPr>
+          <w:rFonts w:ascii="Times New Roman" w:hAnsi="Times New Roman" w:cs="Times New Roman"/>
+          <w:i/>
+          <w:iCs/>
+          <w:sz w:val="24"/>
+          <w:szCs w:val="24"/>
+          <w:lang w:val="fr-FR"/>
+        </w:rPr>
+        <w:t>”)</w:t>
+      </w:r>
+    </w:p>
+    <w:p>
+      <w:pPr>
+        <w:spacing w:before="120" w:after="120" w:line="288" w:lineRule="auto"/>
+        <w:rPr>
+          <w:rFonts w:ascii="Times New Roman" w:hAnsi="Times New Roman" w:cs="Times New Roman"/>
+          <w:b/>
+          <w:bCs/>
+          <w:sz w:val="24"/>
+          <w:szCs w:val="24"/>
+          <w:lang w:val="fr-FR"/>
+        </w:rPr>
+      </w:pPr>
+      <w:r>
+        <w:rPr>
+          <w:rFonts w:ascii="Times New Roman" w:hAnsi="Times New Roman" w:cs="Times New Roman"/>
+          <w:b/>
+          <w:bCs/>
+          <w:sz w:val="24"/>
+          <w:szCs w:val="24"/>
+          <w:lang w:val="fr-FR"/>
+        </w:rPr>
+        <w:t xml:space="preserve">BÊN </w:t>
+      </w:r>
+      <w:proofErr w:type="gramStart"/>
+      <w:r>
+        <w:rPr>
+          <w:rFonts w:ascii="Times New Roman" w:hAnsi="Times New Roman" w:cs="Times New Roman"/>
+          <w:b/>
+          <w:bCs/>
+          <w:sz w:val="24"/>
+          <w:szCs w:val="24"/>
+          <w:lang w:val="fr-FR"/>
+        </w:rPr>
+        <w:t>B:</w:t>
+      </w:r>
+      <w:proofErr w:type="gramEnd"/>
+      <w:r>
+        <w:rPr>
+          <w:rFonts w:ascii="Times New Roman" w:hAnsi="Times New Roman" w:cs="Times New Roman"/>
+          <w:b/>
+          <w:bCs/>
+          <w:sz w:val="24"/>
+          <w:szCs w:val="24"/>
+          <w:lang w:val="fr-FR"/>
+        </w:rPr>
+        <w:t xml:space="preserve"> CÔNG TY TNHH CÔNG NGHỆ ỨNG DỤNG VÀ TRUYỀN THÔNG DTC</w:t>
       </w:r>
     </w:p>
     <w:tbl>
@@ -279,14 +1353,34 @@
                 <w:szCs w:val="24"/>
               </w:rPr>
             </w:pPr>
-            <w:r>
-              <w:rPr>
-                <w:rFonts w:ascii="Times New Roman" w:hAnsi="Times New Roman" w:cs="Times New Roman"/>
-                <w:sz w:val="24"/>
-                <w:szCs w:val="24"/>
-              </w:rPr>
-              <w:t>Người đại</w:t>
-            </w:r>
+            <w:proofErr w:type="spellStart"/>
+            <w:r>
+              <w:rPr>
+                <w:rFonts w:ascii="Times New Roman" w:hAnsi="Times New Roman" w:cs="Times New Roman"/>
+                <w:sz w:val="24"/>
+                <w:szCs w:val="24"/>
+              </w:rPr>
+              <w:t>Người</w:t>
+            </w:r>
+            <w:proofErr w:type="spellEnd"/>
+            <w:r>
+              <w:rPr>
+                <w:rFonts w:ascii="Times New Roman" w:hAnsi="Times New Roman" w:cs="Times New Roman"/>
+                <w:sz w:val="24"/>
+                <w:szCs w:val="24"/>
+              </w:rPr>
+              <w:t xml:space="preserve"> </w:t>
+            </w:r>
+            <w:proofErr w:type="spellStart"/>
+            <w:r>
+              <w:rPr>
+                <w:rFonts w:ascii="Times New Roman" w:hAnsi="Times New Roman" w:cs="Times New Roman"/>
+                <w:sz w:val="24"/>
+                <w:szCs w:val="24"/>
+              </w:rPr>
+              <w:t>đại</w:t>
+            </w:r>
+            <w:proofErr w:type="spellEnd"/>
             <w:r>
               <w:rPr>
                 <w:rFonts w:ascii="Times New Roman" w:hAnsi="Times New Roman" w:cs="Times New Roman"/>
@@ -296,6 +1390,7 @@
               </w:rPr>
               <w:t xml:space="preserve"> </w:t>
             </w:r>
+            <w:proofErr w:type="spellStart"/>
             <w:r>
               <w:rPr>
                 <w:rFonts w:ascii="Times New Roman" w:hAnsi="Times New Roman" w:cs="Times New Roman"/>
@@ -304,6 +1399,7 @@
               </w:rPr>
               <w:t>diện</w:t>
             </w:r>
+            <w:proofErr w:type="spellEnd"/>
           </w:p>
         </w:tc>
         <w:tc>
@@ -342,17 +1438,29 @@
                 <w:szCs w:val="24"/>
               </w:rPr>
             </w:pPr>
-            <w:r>
-              <w:rPr>
-                <w:rFonts w:ascii="Times New Roman" w:hAnsi="Times New Roman" w:cs="Times New Roman"/>
-                <w:sz w:val="24"/>
-                <w:szCs w:val="24"/>
-              </w:rPr>
-              <w:t>{{CUSTOMER_NAME}}</w:t>
-            </w:r>
-            <w:r>
-              <w:rPr>
-                <w:rFonts w:ascii="Times New Roman" w:hAnsi="Times New Roman" w:cs="Times New Roman"/>
+            <w:proofErr w:type="spellStart"/>
+            <w:r>
+              <w:rPr>
+                <w:rFonts w:ascii="Times New Roman" w:hAnsi="Times New Roman" w:cs="Times New Roman"/>
+                <w:sz w:val="24"/>
+                <w:szCs w:val="24"/>
+              </w:rPr>
+              <w:t>Ông</w:t>
+            </w:r>
+            <w:proofErr w:type="spellEnd"/>
+            <w:r>
+              <w:rPr>
+                <w:rFonts w:ascii="Times New Roman" w:hAnsi="Times New Roman" w:cs="Times New Roman"/>
+                <w:sz w:val="24"/>
+                <w:szCs w:val="24"/>
+              </w:rPr>
+              <w:t xml:space="preserve"> Nguyễn Thành Ý</w:t>
+            </w:r>
+            <w:r>
+              <w:rPr>
+                <w:rFonts w:ascii="Times New Roman" w:hAnsi="Times New Roman" w:cs="Times New Roman"/>
+                <w:b/>
+                <w:bCs/>
                 <w:sz w:val="24"/>
                 <w:szCs w:val="24"/>
               </w:rPr>
@@ -361,11 +1469,69 @@
             <w:r>
               <w:rPr>
                 <w:rFonts w:ascii="Times New Roman" w:hAnsi="Times New Roman" w:cs="Times New Roman"/>
+                <w:b/>
+                <w:bCs/>
                 <w:sz w:val="24"/>
                 <w:szCs w:val="24"/>
               </w:rPr>
               <w:tab/>
-              <w:t>Chức vụ: ................................</w:t>
+            </w:r>
+            <w:proofErr w:type="spellStart"/>
+            <w:r>
+              <w:rPr>
+                <w:rFonts w:ascii="Times New Roman" w:hAnsi="Times New Roman" w:cs="Times New Roman"/>
+                <w:sz w:val="24"/>
+                <w:szCs w:val="24"/>
+              </w:rPr>
+              <w:t>Chức</w:t>
+            </w:r>
+            <w:proofErr w:type="spellEnd"/>
+            <w:r>
+              <w:rPr>
+                <w:rFonts w:ascii="Times New Roman" w:hAnsi="Times New Roman" w:cs="Times New Roman"/>
+                <w:spacing w:val="-1"/>
+                <w:sz w:val="24"/>
+                <w:szCs w:val="24"/>
+              </w:rPr>
+              <w:t xml:space="preserve"> </w:t>
+            </w:r>
+            <w:proofErr w:type="spellStart"/>
+            <w:r>
+              <w:rPr>
+                <w:rFonts w:ascii="Times New Roman" w:hAnsi="Times New Roman" w:cs="Times New Roman"/>
+                <w:sz w:val="24"/>
+                <w:szCs w:val="24"/>
+              </w:rPr>
+              <w:t>vụ</w:t>
+            </w:r>
+            <w:proofErr w:type="spellEnd"/>
+            <w:r>
+              <w:rPr>
+                <w:rFonts w:ascii="Times New Roman" w:hAnsi="Times New Roman" w:cs="Times New Roman"/>
+                <w:sz w:val="24"/>
+                <w:szCs w:val="24"/>
+              </w:rPr>
+              <w:t xml:space="preserve">: </w:t>
+            </w:r>
+            <w:proofErr w:type="spellStart"/>
+            <w:r>
+              <w:rPr>
+                <w:rFonts w:ascii="Times New Roman" w:hAnsi="Times New Roman" w:cs="Times New Roman"/>
+                <w:b/>
+                <w:sz w:val="24"/>
+                <w:szCs w:val="24"/>
+              </w:rPr>
+              <w:t>Giám</w:t>
+            </w:r>
+            <w:proofErr w:type="spellEnd"/>
+            <w:r>
+              <w:rPr>
+                <w:rFonts w:ascii="Times New Roman" w:hAnsi="Times New Roman" w:cs="Times New Roman"/>
+                <w:b/>
+                <w:sz w:val="24"/>
+                <w:szCs w:val="24"/>
+              </w:rPr>
+              <w:t xml:space="preserve"> Đốc</w:t>
             </w:r>
           </w:p>
         </w:tc>
@@ -384,6 +1550,7 @@
                 <w:szCs w:val="24"/>
               </w:rPr>
             </w:pPr>
+            <w:proofErr w:type="spellStart"/>
             <w:r>
               <w:rPr>
                 <w:rFonts w:ascii="Times New Roman" w:hAnsi="Times New Roman" w:cs="Times New Roman"/>
@@ -392,6 +1559,7 @@
               </w:rPr>
               <w:t>Địa</w:t>
             </w:r>
+            <w:proofErr w:type="spellEnd"/>
             <w:r>
               <w:rPr>
                 <w:rFonts w:ascii="Times New Roman" w:hAnsi="Times New Roman" w:cs="Times New Roman"/>
@@ -401,6 +1569,7 @@
               </w:rPr>
               <w:t xml:space="preserve"> </w:t>
             </w:r>
+            <w:proofErr w:type="spellStart"/>
             <w:r>
               <w:rPr>
                 <w:rFonts w:ascii="Times New Roman" w:hAnsi="Times New Roman" w:cs="Times New Roman"/>
@@ -409,6 +1578,43 @@
               </w:rPr>
               <w:t>chỉ</w:t>
             </w:r>
+            <w:proofErr w:type="spellEnd"/>
+            <w:r>
+              <w:rPr>
+                <w:rFonts w:ascii="Times New Roman" w:hAnsi="Times New Roman" w:cs="Times New Roman"/>
+                <w:sz w:val="24"/>
+                <w:szCs w:val="24"/>
+              </w:rPr>
+              <w:t xml:space="preserve"> </w:t>
+            </w:r>
+            <w:proofErr w:type="spellStart"/>
+            <w:r>
+              <w:rPr>
+                <w:rFonts w:ascii="Times New Roman" w:hAnsi="Times New Roman" w:cs="Times New Roman"/>
+                <w:sz w:val="24"/>
+                <w:szCs w:val="24"/>
+              </w:rPr>
+              <w:t>trụ</w:t>
+            </w:r>
+            <w:proofErr w:type="spellEnd"/>
+            <w:r>
+              <w:rPr>
+                <w:rFonts w:ascii="Times New Roman" w:hAnsi="Times New Roman" w:cs="Times New Roman"/>
+                <w:sz w:val="24"/>
+                <w:szCs w:val="24"/>
+              </w:rPr>
+              <w:t xml:space="preserve"> </w:t>
+            </w:r>
+            <w:proofErr w:type="spellStart"/>
+            <w:r>
+              <w:rPr>
+                <w:rFonts w:ascii="Times New Roman" w:hAnsi="Times New Roman" w:cs="Times New Roman"/>
+                <w:sz w:val="24"/>
+                <w:szCs w:val="24"/>
+              </w:rPr>
+              <w:t>sở</w:t>
+            </w:r>
+            <w:proofErr w:type="spellEnd"/>
           </w:p>
         </w:tc>
         <w:tc>
@@ -447,14 +1653,160 @@
                 <w:szCs w:val="24"/>
               </w:rPr>
             </w:pPr>
-            <w:r>
-              <w:rPr>
-                <w:rFonts w:ascii="Times New Roman" w:hAnsi="Times New Roman" w:cs="Times New Roman"/>
-                <w:sz w:val="24"/>
-                <w:szCs w:val="24"/>
-              </w:rPr>
-              <w:t>{{CUSTOMER_ADDRESS}}</w:t>
-            </w:r>
+            <w:proofErr w:type="spellStart"/>
+            <w:r>
+              <w:rPr>
+                <w:rFonts w:ascii="Times New Roman" w:hAnsi="Times New Roman" w:cs="Times New Roman"/>
+                <w:sz w:val="24"/>
+                <w:szCs w:val="24"/>
+              </w:rPr>
+              <w:t>Số</w:t>
+            </w:r>
+            <w:proofErr w:type="spellEnd"/>
+            <w:r>
+              <w:rPr>
+                <w:rFonts w:ascii="Times New Roman" w:hAnsi="Times New Roman" w:cs="Times New Roman"/>
+                <w:sz w:val="24"/>
+                <w:szCs w:val="24"/>
+              </w:rPr>
+              <w:t xml:space="preserve"> 2, </w:t>
+            </w:r>
+            <w:proofErr w:type="spellStart"/>
+            <w:r>
+              <w:rPr>
+                <w:rFonts w:ascii="Times New Roman" w:hAnsi="Times New Roman" w:cs="Times New Roman"/>
+                <w:sz w:val="24"/>
+                <w:szCs w:val="24"/>
+              </w:rPr>
+              <w:t>ngách</w:t>
+            </w:r>
+            <w:proofErr w:type="spellEnd"/>
+            <w:r>
+              <w:rPr>
+                <w:rFonts w:ascii="Times New Roman" w:hAnsi="Times New Roman" w:cs="Times New Roman"/>
+                <w:sz w:val="24"/>
+                <w:szCs w:val="24"/>
+              </w:rPr>
+              <w:t xml:space="preserve"> 6, </w:t>
+            </w:r>
+            <w:proofErr w:type="spellStart"/>
+            <w:r>
+              <w:rPr>
+                <w:rFonts w:ascii="Times New Roman" w:hAnsi="Times New Roman" w:cs="Times New Roman"/>
+                <w:sz w:val="24"/>
+                <w:szCs w:val="24"/>
+              </w:rPr>
+              <w:t>ngõ</w:t>
+            </w:r>
+            <w:proofErr w:type="spellEnd"/>
+            <w:r>
+              <w:rPr>
+                <w:rFonts w:ascii="Times New Roman" w:hAnsi="Times New Roman" w:cs="Times New Roman"/>
+                <w:sz w:val="24"/>
+                <w:szCs w:val="24"/>
+              </w:rPr>
+              <w:t xml:space="preserve"> 200, </w:t>
+            </w:r>
+            <w:proofErr w:type="spellStart"/>
+            <w:r>
+              <w:rPr>
+                <w:rFonts w:ascii="Times New Roman" w:hAnsi="Times New Roman" w:cs="Times New Roman"/>
+                <w:sz w:val="24"/>
+                <w:szCs w:val="24"/>
+              </w:rPr>
+              <w:t>đường</w:t>
+            </w:r>
+            <w:proofErr w:type="spellEnd"/>
+            <w:r>
+              <w:rPr>
+                <w:rFonts w:ascii="Times New Roman" w:hAnsi="Times New Roman" w:cs="Times New Roman"/>
+                <w:sz w:val="24"/>
+                <w:szCs w:val="24"/>
+              </w:rPr>
+              <w:t xml:space="preserve"> </w:t>
+            </w:r>
+            <w:proofErr w:type="spellStart"/>
+            <w:r>
+              <w:rPr>
+                <w:rFonts w:ascii="Times New Roman" w:hAnsi="Times New Roman" w:cs="Times New Roman"/>
+                <w:sz w:val="24"/>
+                <w:szCs w:val="24"/>
+              </w:rPr>
+              <w:t>Vĩnh</w:t>
+            </w:r>
+            <w:proofErr w:type="spellEnd"/>
+            <w:r>
+              <w:rPr>
+                <w:rFonts w:ascii="Times New Roman" w:hAnsi="Times New Roman" w:cs="Times New Roman"/>
+                <w:sz w:val="24"/>
+                <w:szCs w:val="24"/>
+              </w:rPr>
+              <w:t xml:space="preserve"> Hưng, </w:t>
+            </w:r>
+            <w:proofErr w:type="spellStart"/>
+            <w:r>
+              <w:rPr>
+                <w:rFonts w:ascii="Times New Roman" w:hAnsi="Times New Roman" w:cs="Times New Roman"/>
+                <w:sz w:val="24"/>
+                <w:szCs w:val="24"/>
+              </w:rPr>
+              <w:t>Phường</w:t>
+            </w:r>
+            <w:proofErr w:type="spellEnd"/>
+            <w:r>
+              <w:rPr>
+                <w:rFonts w:ascii="Times New Roman" w:hAnsi="Times New Roman" w:cs="Times New Roman"/>
+                <w:sz w:val="24"/>
+                <w:szCs w:val="24"/>
+              </w:rPr>
+              <w:t xml:space="preserve"> </w:t>
+            </w:r>
+            <w:proofErr w:type="spellStart"/>
+            <w:r>
+              <w:rPr>
+                <w:rFonts w:ascii="Times New Roman" w:hAnsi="Times New Roman" w:cs="Times New Roman"/>
+                <w:sz w:val="24"/>
+                <w:szCs w:val="24"/>
+              </w:rPr>
+              <w:t>Vĩnh</w:t>
+            </w:r>
+            <w:proofErr w:type="spellEnd"/>
+            <w:r>
+              <w:rPr>
+                <w:rFonts w:ascii="Times New Roman" w:hAnsi="Times New Roman" w:cs="Times New Roman"/>
+                <w:sz w:val="24"/>
+                <w:szCs w:val="24"/>
+              </w:rPr>
+              <w:t xml:space="preserve"> Hưng, Thành </w:t>
+            </w:r>
+            <w:proofErr w:type="spellStart"/>
+            <w:r>
+              <w:rPr>
+                <w:rFonts w:ascii="Times New Roman" w:hAnsi="Times New Roman" w:cs="Times New Roman"/>
+                <w:sz w:val="24"/>
+                <w:szCs w:val="24"/>
+              </w:rPr>
+              <w:t>phố</w:t>
+            </w:r>
+            <w:proofErr w:type="spellEnd"/>
+            <w:r>
+              <w:rPr>
+                <w:rFonts w:ascii="Times New Roman" w:hAnsi="Times New Roman" w:cs="Times New Roman"/>
+                <w:sz w:val="24"/>
+                <w:szCs w:val="24"/>
+              </w:rPr>
+              <w:t xml:space="preserve"> Hà </w:t>
+            </w:r>
+            <w:proofErr w:type="spellStart"/>
+            <w:r>
+              <w:rPr>
+                <w:rFonts w:ascii="Times New Roman" w:hAnsi="Times New Roman" w:cs="Times New Roman"/>
+                <w:sz w:val="24"/>
+                <w:szCs w:val="24"/>
+              </w:rPr>
+              <w:t>Nội</w:t>
+            </w:r>
+            <w:proofErr w:type="spellEnd"/>
           </w:p>
         </w:tc>
       </w:tr>
@@ -472,6 +1824,7 @@
                 <w:szCs w:val="24"/>
               </w:rPr>
             </w:pPr>
+            <w:proofErr w:type="spellStart"/>
             <w:r>
               <w:rPr>
                 <w:rFonts w:ascii="Times New Roman" w:hAnsi="Times New Roman" w:cs="Times New Roman"/>
@@ -480,6 +1833,7 @@
               </w:rPr>
               <w:t>Điện</w:t>
             </w:r>
+            <w:proofErr w:type="spellEnd"/>
             <w:r>
               <w:rPr>
                 <w:rFonts w:ascii="Times New Roman" w:hAnsi="Times New Roman" w:cs="Times New Roman"/>
@@ -489,6 +1843,7 @@
               </w:rPr>
               <w:t xml:space="preserve"> </w:t>
             </w:r>
+            <w:proofErr w:type="spellStart"/>
             <w:r>
               <w:rPr>
                 <w:rFonts w:ascii="Times New Roman" w:hAnsi="Times New Roman" w:cs="Times New Roman"/>
@@ -497,6 +1852,7 @@
               </w:rPr>
               <w:t>thoại</w:t>
             </w:r>
+            <w:proofErr w:type="spellEnd"/>
           </w:p>
         </w:tc>
         <w:tc>
@@ -540,16 +1896,14 @@
                 <w:rFonts w:ascii="Times New Roman" w:hAnsi="Times New Roman" w:cs="Times New Roman"/>
                 <w:sz w:val="24"/>
                 <w:szCs w:val="24"/>
-                <w:lang w:val="pt-BR"/>
-              </w:rPr>
-              <w:t>{{CUSTOMER_PHONE}}</w:t>
-            </w:r>
-            <w:r>
-              <w:rPr>
-                <w:rFonts w:ascii="Times New Roman" w:hAnsi="Times New Roman" w:cs="Times New Roman"/>
-                <w:sz w:val="24"/>
-                <w:szCs w:val="24"/>
-                <w:lang w:val="pt-BR"/>
+              </w:rPr>
+              <w:t>(+84-24) 3 557-3636</w:t>
+            </w:r>
+            <w:r>
+              <w:rPr>
+                <w:rFonts w:ascii="Times New Roman" w:hAnsi="Times New Roman" w:cs="Times New Roman"/>
+                <w:sz w:val="24"/>
+                <w:szCs w:val="24"/>
               </w:rPr>
               <w:tab/>
             </w:r>
@@ -558,10 +1912,17 @@
                 <w:rFonts w:ascii="Times New Roman" w:hAnsi="Times New Roman" w:cs="Times New Roman"/>
                 <w:sz w:val="24"/>
                 <w:szCs w:val="24"/>
-                <w:lang w:val="pt-BR"/>
               </w:rPr>
               <w:tab/>
-              <w:t>Fax: {{CUSTOMER_FAX}}</w:t>
+            </w:r>
+            <w:r>
+              <w:rPr>
+                <w:rFonts w:ascii="Times New Roman" w:hAnsi="Times New Roman" w:cs="Times New Roman"/>
+                <w:sz w:val="24"/>
+                <w:szCs w:val="24"/>
+              </w:rPr>
+              <w:tab/>
+              <w:t>Fax: (+84-24) 3 569-0588</w:t>
             </w:r>
           </w:p>
         </w:tc>
@@ -580,50 +1941,53 @@
                 <w:szCs w:val="24"/>
               </w:rPr>
             </w:pPr>
-            <w:r>
-              <w:rPr>
-                <w:rFonts w:ascii="Times New Roman" w:hAnsi="Times New Roman" w:cs="Times New Roman"/>
-                <w:sz w:val="24"/>
-                <w:szCs w:val="24"/>
-              </w:rPr>
-              <w:t>Mã khách hàng</w:t>
-            </w:r>
-          </w:p>
-          <w:p>
-            <w:pPr>
-              <w:spacing w:after="0" w:line="288" w:lineRule="auto"/>
-              <w:rPr>
-                <w:rFonts w:ascii="Times New Roman" w:hAnsi="Times New Roman" w:cs="Times New Roman"/>
-                <w:sz w:val="24"/>
-                <w:szCs w:val="24"/>
-              </w:rPr>
-            </w:pPr>
-            <w:r>
-              <w:rPr>
-                <w:rFonts w:ascii="Times New Roman" w:hAnsi="Times New Roman" w:cs="Times New Roman"/>
-                <w:sz w:val="24"/>
-                <w:szCs w:val="24"/>
-              </w:rPr>
-              <w:t>Mã số thuế</w:t>
-            </w:r>
-          </w:p>
-          <w:p>
-            <w:pPr>
-              <w:spacing w:after="0" w:line="288" w:lineRule="auto"/>
-              <w:rPr>
-                <w:rFonts w:ascii="Times New Roman" w:hAnsi="Times New Roman" w:cs="Times New Roman"/>
-                <w:sz w:val="24"/>
-                <w:szCs w:val="24"/>
-              </w:rPr>
-            </w:pPr>
-            <w:r>
-              <w:rPr>
-                <w:rFonts w:ascii="Times New Roman" w:hAnsi="Times New Roman" w:cs="Times New Roman"/>
-                <w:sz w:val="24"/>
-                <w:szCs w:val="24"/>
-              </w:rPr>
-              <w:t>Email</w:t>
-            </w:r>
+            <w:proofErr w:type="spellStart"/>
+            <w:r>
+              <w:rPr>
+                <w:rFonts w:ascii="Times New Roman" w:hAnsi="Times New Roman" w:cs="Times New Roman"/>
+                <w:sz w:val="24"/>
+                <w:szCs w:val="24"/>
+              </w:rPr>
+              <w:t>Mã</w:t>
+            </w:r>
+            <w:proofErr w:type="spellEnd"/>
+            <w:r>
+              <w:rPr>
+                <w:rFonts w:ascii="Times New Roman" w:hAnsi="Times New Roman" w:cs="Times New Roman"/>
+                <w:sz w:val="24"/>
+                <w:szCs w:val="24"/>
+              </w:rPr>
+              <w:t xml:space="preserve"> </w:t>
+            </w:r>
+            <w:proofErr w:type="spellStart"/>
+            <w:r>
+              <w:rPr>
+                <w:rFonts w:ascii="Times New Roman" w:hAnsi="Times New Roman" w:cs="Times New Roman"/>
+                <w:sz w:val="24"/>
+                <w:szCs w:val="24"/>
+              </w:rPr>
+              <w:t>số</w:t>
+            </w:r>
+            <w:proofErr w:type="spellEnd"/>
+            <w:r>
+              <w:rPr>
+                <w:rFonts w:ascii="Times New Roman" w:hAnsi="Times New Roman" w:cs="Times New Roman"/>
+                <w:spacing w:val="-1"/>
+                <w:sz w:val="24"/>
+                <w:szCs w:val="24"/>
+              </w:rPr>
+              <w:t xml:space="preserve"> </w:t>
+            </w:r>
+            <w:proofErr w:type="spellStart"/>
+            <w:r>
+              <w:rPr>
+                <w:rFonts w:ascii="Times New Roman" w:hAnsi="Times New Roman" w:cs="Times New Roman"/>
+                <w:sz w:val="24"/>
+                <w:szCs w:val="24"/>
+              </w:rPr>
+              <w:t>thuế</w:t>
+            </w:r>
+            <w:proofErr w:type="spellEnd"/>
           </w:p>
         </w:tc>
         <w:tc>
@@ -648,42 +2012,6 @@
               <w:t>:</w:t>
             </w:r>
           </w:p>
-          <w:p>
-            <w:pPr>
-              <w:spacing w:after="0" w:line="288" w:lineRule="auto"/>
-              <w:rPr>
-                <w:rFonts w:ascii="Times New Roman" w:hAnsi="Times New Roman" w:cs="Times New Roman"/>
-                <w:sz w:val="24"/>
-                <w:szCs w:val="24"/>
-              </w:rPr>
-            </w:pPr>
-            <w:r>
-              <w:rPr>
-                <w:rFonts w:ascii="Times New Roman" w:hAnsi="Times New Roman" w:cs="Times New Roman"/>
-                <w:sz w:val="24"/>
-                <w:szCs w:val="24"/>
-              </w:rPr>
-              <w:t>:</w:t>
-            </w:r>
-          </w:p>
-          <w:p>
-            <w:pPr>
-              <w:spacing w:after="0" w:line="288" w:lineRule="auto"/>
-              <w:rPr>
-                <w:rFonts w:ascii="Times New Roman" w:hAnsi="Times New Roman" w:cs="Times New Roman"/>
-                <w:sz w:val="24"/>
-                <w:szCs w:val="24"/>
-              </w:rPr>
-            </w:pPr>
-            <w:r>
-              <w:rPr>
-                <w:rFonts w:ascii="Times New Roman" w:hAnsi="Times New Roman" w:cs="Times New Roman"/>
-                <w:sz w:val="24"/>
-                <w:szCs w:val="24"/>
-              </w:rPr>
-              <w:t>:</w:t>
-            </w:r>
-          </w:p>
         </w:tc>
         <w:tc>
           <w:tcPr>
@@ -704,338 +2032,7 @@
                 <w:sz w:val="24"/>
                 <w:szCs w:val="24"/>
               </w:rPr>
-              <w:t>{{CUSTOMER_CODE}}</w:t>
-            </w:r>
-          </w:p>
-          <w:p>
-            <w:pPr>
-              <w:spacing w:after="0" w:line="288" w:lineRule="auto"/>
-              <w:rPr>
-                <w:rFonts w:ascii="Times New Roman" w:hAnsi="Times New Roman" w:cs="Times New Roman"/>
-                <w:sz w:val="24"/>
-                <w:szCs w:val="24"/>
-              </w:rPr>
-            </w:pPr>
-            <w:r>
-              <w:rPr>
-                <w:rFonts w:ascii="Times New Roman" w:hAnsi="Times New Roman" w:cs="Times New Roman"/>
-                <w:sz w:val="24"/>
-                <w:szCs w:val="24"/>
-              </w:rPr>
-              <w:t>{{CUSTOMER_TAX_CODE}}</w:t>
-            </w:r>
-          </w:p>
-          <w:p>
-            <w:pPr>
-              <w:spacing w:after="0" w:line="288" w:lineRule="auto"/>
-              <w:rPr>
-                <w:rFonts w:ascii="Times New Roman" w:hAnsi="Times New Roman" w:cs="Times New Roman"/>
-                <w:sz w:val="24"/>
-                <w:szCs w:val="24"/>
-              </w:rPr>
-            </w:pPr>
-            <w:r>
-              <w:rPr>
-                <w:rFonts w:ascii="Times New Roman" w:hAnsi="Times New Roman" w:cs="Times New Roman"/>
-                <w:sz w:val="24"/>
-                <w:szCs w:val="24"/>
-              </w:rPr>
-              <w:t>{{CUSTOMER_EMAIL}}</w:t>
-            </w:r>
-          </w:p>
-        </w:tc>
-      </w:tr>
-    </w:tbl>
-    <w:p>
-      <w:pPr>
-        <w:spacing w:after="0" w:line="288" w:lineRule="auto"/>
-        <w:rPr>
-          <w:rFonts w:ascii="Times New Roman" w:hAnsi="Times New Roman" w:cs="Times New Roman"/>
-          <w:sz w:val="24"/>
-          <w:szCs w:val="24"/>
-        </w:rPr>
-      </w:pPr>
-    </w:p>
-    <w:p>
-      <w:pPr>
-        <w:spacing w:after="0" w:line="288" w:lineRule="auto"/>
-        <w:rPr>
-          <w:rFonts w:ascii="Times New Roman" w:hAnsi="Times New Roman" w:cs="Times New Roman"/>
-          <w:i/>
-          <w:iCs/>
-          <w:sz w:val="24"/>
-          <w:szCs w:val="24"/>
-          <w:lang w:val="fr-FR"/>
-        </w:rPr>
-      </w:pPr>
-      <w:r>
-        <w:rPr>
-          <w:rFonts w:ascii="Times New Roman" w:hAnsi="Times New Roman" w:cs="Times New Roman"/>
-          <w:i/>
-          <w:iCs/>
-          <w:sz w:val="24"/>
-          <w:szCs w:val="24"/>
-          <w:lang w:val="fr-FR"/>
-        </w:rPr>
-        <w:t>(Sau đây gọi tắt là “</w:t>
-      </w:r>
-      <w:r>
-        <w:rPr>
-          <w:rFonts w:ascii="Times New Roman" w:hAnsi="Times New Roman" w:cs="Times New Roman"/>
-          <w:b/>
-          <w:bCs/>
-          <w:i/>
-          <w:iCs/>
-          <w:sz w:val="24"/>
-          <w:szCs w:val="24"/>
-          <w:lang w:val="fr-FR"/>
-        </w:rPr>
-        <w:t>Bên</w:t>
-      </w:r>
-      <w:r>
-        <w:rPr>
-          <w:rFonts w:ascii="Times New Roman" w:hAnsi="Times New Roman" w:cs="Times New Roman"/>
-          <w:b/>
-          <w:bCs/>
-          <w:i/>
-          <w:iCs/>
-          <w:spacing w:val="-3"/>
-          <w:sz w:val="24"/>
-          <w:szCs w:val="24"/>
-          <w:lang w:val="fr-FR"/>
-        </w:rPr>
-        <w:t xml:space="preserve"> </w:t>
-      </w:r>
-      <w:r>
-        <w:rPr>
-          <w:rFonts w:ascii="Times New Roman" w:hAnsi="Times New Roman" w:cs="Times New Roman"/>
-          <w:b/>
-          <w:bCs/>
-          <w:i/>
-          <w:iCs/>
-          <w:sz w:val="24"/>
-          <w:szCs w:val="24"/>
-          <w:lang w:val="fr-FR"/>
-        </w:rPr>
-        <w:t>A</w:t>
-      </w:r>
-      <w:r>
-        <w:rPr>
-          <w:rFonts w:ascii="Times New Roman" w:hAnsi="Times New Roman" w:cs="Times New Roman"/>
-          <w:i/>
-          <w:iCs/>
-          <w:sz w:val="24"/>
-          <w:szCs w:val="24"/>
-          <w:lang w:val="fr-FR"/>
-        </w:rPr>
-        <w:t>”)</w:t>
-      </w:r>
-    </w:p>
-    <w:p>
-      <w:pPr>
-        <w:spacing w:before="120" w:after="120" w:line="288" w:lineRule="auto"/>
-        <w:rPr>
-          <w:rFonts w:ascii="Times New Roman" w:hAnsi="Times New Roman" w:cs="Times New Roman"/>
-          <w:b/>
-          <w:bCs/>
-          <w:sz w:val="24"/>
-          <w:szCs w:val="24"/>
-          <w:lang w:val="fr-FR"/>
-        </w:rPr>
-      </w:pPr>
-      <w:r>
-        <w:rPr>
-          <w:rFonts w:ascii="Times New Roman" w:hAnsi="Times New Roman" w:cs="Times New Roman"/>
-          <w:b/>
-          <w:bCs/>
-          <w:sz w:val="24"/>
-          <w:szCs w:val="24"/>
-          <w:lang w:val="fr-FR"/>
-        </w:rPr>
-        <w:t xml:space="preserve">BÊN </w:t>
-      </w:r>
-      <w:proofErr w:type="gramStart"/>
-      <w:r>
-        <w:rPr>
-          <w:rFonts w:ascii="Times New Roman" w:hAnsi="Times New Roman" w:cs="Times New Roman"/>
-          <w:b/>
-          <w:bCs/>
-          <w:sz w:val="24"/>
-          <w:szCs w:val="24"/>
-          <w:lang w:val="fr-FR"/>
-        </w:rPr>
-        <w:t>B:</w:t>
-      </w:r>
-      <w:proofErr w:type="gramEnd"/>
-      <w:r>
-        <w:rPr>
-          <w:rFonts w:ascii="Times New Roman" w:hAnsi="Times New Roman" w:cs="Times New Roman"/>
-          <w:b/>
-          <w:bCs/>
-          <w:sz w:val="24"/>
-          <w:szCs w:val="24"/>
-          <w:lang w:val="fr-FR"/>
-        </w:rPr>
-        <w:t xml:space="preserve"> CÔNG TY TNHH CÔNG NGHỆ ỨNG DỤNG VÀ TRUYỀN THÔNG DTC</w:t>
-      </w:r>
-    </w:p>
-    <w:tbl>
-      <w:tblPr>
-        <w:tblStyle w:val="TableGrid"/>
-        <w:tblW w:w="0" w:type="auto"/>
-        <w:tblBorders>
-          <w:top w:val="none" w:sz="0" w:space="0" w:color="auto"/>
-          <w:left w:val="none" w:sz="0" w:space="0" w:color="auto"/>
-          <w:bottom w:val="none" w:sz="0" w:space="0" w:color="auto"/>
-          <w:right w:val="none" w:sz="0" w:space="0" w:color="auto"/>
-          <w:insideH w:val="none" w:sz="0" w:space="0" w:color="auto"/>
-          <w:insideV w:val="none" w:sz="0" w:space="0" w:color="auto"/>
-        </w:tblBorders>
-        <w:tblLook w:val="04A0" w:firstRow="1" w:lastRow="0" w:firstColumn="1" w:lastColumn="0" w:noHBand="0" w:noVBand="1"/>
-      </w:tblPr>
-      <w:tblGrid>
-        <w:gridCol w:w="2093"/>
-        <w:gridCol w:w="368"/>
-        <w:gridCol w:w="7145"/>
-      </w:tblGrid>
-      <w:tr>
-        <w:tc>
-          <w:tcPr>
-            <w:tcW w:w="2093" w:type="dxa"/>
-          </w:tcPr>
-          <w:p>
-            <w:pPr>
-              <w:spacing w:after="0" w:line="288" w:lineRule="auto"/>
-              <w:rPr>
-                <w:rFonts w:ascii="Times New Roman" w:hAnsi="Times New Roman" w:cs="Times New Roman"/>
-                <w:sz w:val="24"/>
-                <w:szCs w:val="24"/>
-              </w:rPr>
-            </w:pPr>
-            <w:r>
-              <w:rPr>
-                <w:rFonts w:ascii="Times New Roman" w:hAnsi="Times New Roman" w:cs="Times New Roman"/>
-                <w:sz w:val="24"/>
-                <w:szCs w:val="24"/>
-              </w:rPr>
-              <w:t>Người đại</w:t>
-            </w:r>
-            <w:r>
-              <w:rPr>
-                <w:rFonts w:ascii="Times New Roman" w:hAnsi="Times New Roman" w:cs="Times New Roman"/>
-                <w:spacing w:val="-4"/>
-                <w:sz w:val="24"/>
-                <w:szCs w:val="24"/>
-              </w:rPr>
-              <w:t xml:space="preserve"> </w:t>
-            </w:r>
-            <w:r>
-              <w:rPr>
-                <w:rFonts w:ascii="Times New Roman" w:hAnsi="Times New Roman" w:cs="Times New Roman"/>
-                <w:sz w:val="24"/>
-                <w:szCs w:val="24"/>
-              </w:rPr>
-              <w:t>diện</w:t>
-            </w:r>
-          </w:p>
-        </w:tc>
-        <w:tc>
-          <w:tcPr>
-            <w:tcW w:w="368" w:type="dxa"/>
-          </w:tcPr>
-          <w:p>
-            <w:pPr>
-              <w:spacing w:after="0" w:line="288" w:lineRule="auto"/>
-              <w:rPr>
-                <w:rFonts w:ascii="Times New Roman" w:hAnsi="Times New Roman" w:cs="Times New Roman"/>
-                <w:sz w:val="24"/>
-                <w:szCs w:val="24"/>
-              </w:rPr>
-            </w:pPr>
-            <w:r>
-              <w:rPr>
-                <w:rFonts w:ascii="Times New Roman" w:hAnsi="Times New Roman" w:cs="Times New Roman"/>
-                <w:sz w:val="24"/>
-                <w:szCs w:val="24"/>
-              </w:rPr>
-              <w:t>:</w:t>
-            </w:r>
-          </w:p>
-        </w:tc>
-        <w:tc>
-          <w:tcPr>
-            <w:tcW w:w="7145" w:type="dxa"/>
-          </w:tcPr>
-          <w:p>
-            <w:pPr>
-              <w:spacing w:after="0" w:line="288" w:lineRule="auto"/>
-              <w:rPr>
-                <w:rFonts w:ascii="Times New Roman" w:hAnsi="Times New Roman" w:cs="Times New Roman"/>
-                <w:sz w:val="24"/>
-                <w:szCs w:val="24"/>
-              </w:rPr>
-            </w:pPr>
-            <w:r>
-              <w:rPr>
-                <w:rFonts w:ascii="Times New Roman" w:hAnsi="Times New Roman" w:cs="Times New Roman"/>
-                <w:sz w:val="24"/>
-                <w:szCs w:val="24"/>
-              </w:rPr>
-              <w:t>Ông Nguyễn Thành Ý</w:t>
-            </w:r>
-            <w:r>
-              <w:rPr>
-                <w:rFonts w:ascii="Times New Roman" w:hAnsi="Times New Roman" w:cs="Times New Roman"/>
-                <w:b/>
-                <w:bCs/>
-                <w:sz w:val="24"/>
-                <w:szCs w:val="24"/>
-              </w:rPr>
-              <w:tab/>
-            </w:r>
-            <w:r>
-              <w:rPr>
-                <w:rFonts w:ascii="Times New Roman" w:hAnsi="Times New Roman" w:cs="Times New Roman"/>
-                <w:b/>
-                <w:bCs/>
-                <w:sz w:val="24"/>
-                <w:szCs w:val="24"/>
-              </w:rPr>
-              <w:tab/>
-            </w:r>
-            <w:r>
-              <w:rPr>
-                <w:rFonts w:ascii="Times New Roman" w:hAnsi="Times New Roman" w:cs="Times New Roman"/>
-                <w:sz w:val="24"/>
-                <w:szCs w:val="24"/>
-              </w:rPr>
-              <w:t>Chức</w:t>
-            </w:r>
-            <w:r>
-              <w:rPr>
-                <w:rFonts w:ascii="Times New Roman" w:hAnsi="Times New Roman" w:cs="Times New Roman"/>
-                <w:spacing w:val="-1"/>
-                <w:sz w:val="24"/>
-                <w:szCs w:val="24"/>
-              </w:rPr>
-              <w:t xml:space="preserve"> </w:t>
-            </w:r>
-            <w:r>
-              <w:rPr>
-                <w:rFonts w:ascii="Times New Roman" w:hAnsi="Times New Roman" w:cs="Times New Roman"/>
-                <w:sz w:val="24"/>
-                <w:szCs w:val="24"/>
-              </w:rPr>
-              <w:t xml:space="preserve">vụ: </w:t>
-            </w:r>
-            <w:r>
-              <w:rPr>
-                <w:rFonts w:ascii="Times New Roman" w:hAnsi="Times New Roman" w:cs="Times New Roman"/>
-                <w:b/>
-                <w:sz w:val="24"/>
-                <w:szCs w:val="24"/>
-              </w:rPr>
-              <w:t>Giám Đốc</w:t>
+              <w:t>0105801335</w:t>
             </w:r>
           </w:p>
         </w:tc>
@@ -1060,8 +2057,18 @@
                 <w:sz w:val="24"/>
                 <w:szCs w:val="24"/>
               </w:rPr>
-              <w:t>Địa</w:t>
-            </w:r>
+              <w:t xml:space="preserve">Tài </w:t>
+            </w:r>
+            <w:proofErr w:type="spellStart"/>
+            <w:r>
+              <w:rPr>
+                <w:rFonts w:ascii="Times New Roman" w:hAnsi="Times New Roman" w:cs="Times New Roman"/>
+                <w:sz w:val="24"/>
+                <w:szCs w:val="24"/>
+              </w:rPr>
+              <w:t>khoản</w:t>
+            </w:r>
+            <w:proofErr w:type="spellEnd"/>
             <w:r>
               <w:rPr>
                 <w:rFonts w:ascii="Times New Roman" w:hAnsi="Times New Roman" w:cs="Times New Roman"/>
@@ -1071,14 +2078,16 @@
               </w:rPr>
               <w:t xml:space="preserve"> </w:t>
             </w:r>
-            <w:r>
-              <w:rPr>
-                <w:rFonts w:ascii="Times New Roman" w:hAnsi="Times New Roman" w:cs="Times New Roman"/>
-                <w:sz w:val="24"/>
-                <w:szCs w:val="24"/>
-              </w:rPr>
-              <w:t>chỉ trụ sở</w:t>
-            </w:r>
+            <w:proofErr w:type="spellStart"/>
+            <w:r>
+              <w:rPr>
+                <w:rFonts w:ascii="Times New Roman" w:hAnsi="Times New Roman" w:cs="Times New Roman"/>
+                <w:sz w:val="24"/>
+                <w:szCs w:val="24"/>
+              </w:rPr>
+              <w:t>số</w:t>
+            </w:r>
+            <w:proofErr w:type="spellEnd"/>
           </w:p>
         </w:tc>
         <w:tc>
@@ -1123,7 +2132,7 @@
                 <w:sz w:val="24"/>
                 <w:szCs w:val="24"/>
               </w:rPr>
-              <w:t>Số 2, ngách 6, ngõ 200, đường Vĩnh Hưng, Phường Vĩnh Hưng, Thành phố Hà Nội</w:t>
+              <w:t>55944447777</w:t>
             </w:r>
           </w:p>
         </w:tc>
@@ -1142,31 +2151,52 @@
                 <w:szCs w:val="24"/>
               </w:rPr>
             </w:pPr>
-            <w:r>
-              <w:rPr>
-                <w:rFonts w:ascii="Times New Roman" w:hAnsi="Times New Roman" w:cs="Times New Roman"/>
-                <w:sz w:val="24"/>
-                <w:szCs w:val="24"/>
-              </w:rPr>
-              <w:t>Điện</w:t>
-            </w:r>
-            <w:r>
-              <w:rPr>
-                <w:rFonts w:ascii="Times New Roman" w:hAnsi="Times New Roman" w:cs="Times New Roman"/>
-                <w:spacing w:val="-2"/>
+            <w:proofErr w:type="spellStart"/>
+            <w:r>
+              <w:rPr>
+                <w:rFonts w:ascii="Times New Roman" w:hAnsi="Times New Roman" w:cs="Times New Roman"/>
+                <w:sz w:val="24"/>
+                <w:szCs w:val="24"/>
+              </w:rPr>
+              <w:t>Tại</w:t>
+            </w:r>
+            <w:proofErr w:type="spellEnd"/>
+            <w:r>
+              <w:rPr>
+                <w:rFonts w:ascii="Times New Roman" w:hAnsi="Times New Roman" w:cs="Times New Roman"/>
                 <w:sz w:val="24"/>
                 <w:szCs w:val="24"/>
               </w:rPr>
               <w:t xml:space="preserve"> </w:t>
             </w:r>
-            <w:r>
-              <w:rPr>
-                <w:rFonts w:ascii="Times New Roman" w:hAnsi="Times New Roman" w:cs="Times New Roman"/>
-                <w:sz w:val="24"/>
-                <w:szCs w:val="24"/>
-              </w:rPr>
-              <w:t>thoại</w:t>
-            </w:r>
+            <w:proofErr w:type="spellStart"/>
+            <w:r>
+              <w:rPr>
+                <w:rFonts w:ascii="Times New Roman" w:hAnsi="Times New Roman" w:cs="Times New Roman"/>
+                <w:sz w:val="24"/>
+                <w:szCs w:val="24"/>
+              </w:rPr>
+              <w:t>ngân</w:t>
+            </w:r>
+            <w:proofErr w:type="spellEnd"/>
+            <w:r>
+              <w:rPr>
+                <w:rFonts w:ascii="Times New Roman" w:hAnsi="Times New Roman" w:cs="Times New Roman"/>
+                <w:sz w:val="24"/>
+                <w:szCs w:val="24"/>
+              </w:rPr>
+              <w:t xml:space="preserve"> </w:t>
+            </w:r>
+            <w:proofErr w:type="spellStart"/>
+            <w:r>
+              <w:rPr>
+                <w:rFonts w:ascii="Times New Roman" w:hAnsi="Times New Roman" w:cs="Times New Roman"/>
+                <w:sz w:val="24"/>
+                <w:szCs w:val="24"/>
+              </w:rPr>
+              <w:t>hàng</w:t>
+            </w:r>
+            <w:proofErr w:type="spellEnd"/>
           </w:p>
         </w:tc>
         <w:tc>
@@ -1201,6 +2231,7 @@
               <w:spacing w:after="0" w:line="288" w:lineRule="auto"/>
               <w:rPr>
                 <w:rFonts w:ascii="Times New Roman" w:hAnsi="Times New Roman" w:cs="Times New Roman"/>
+                <w:spacing w:val="-6"/>
                 <w:sz w:val="24"/>
                 <w:szCs w:val="24"/>
               </w:rPr>
@@ -1208,276 +2239,83 @@
             <w:r>
               <w:rPr>
                 <w:rFonts w:ascii="Times New Roman" w:hAnsi="Times New Roman" w:cs="Times New Roman"/>
-                <w:sz w:val="24"/>
-                <w:szCs w:val="24"/>
-              </w:rPr>
-              <w:t>(+84-24) 3 557-3636</w:t>
-            </w:r>
-            <w:r>
-              <w:rPr>
-                <w:rFonts w:ascii="Times New Roman" w:hAnsi="Times New Roman" w:cs="Times New Roman"/>
-                <w:sz w:val="24"/>
-                <w:szCs w:val="24"/>
-              </w:rPr>
-              <w:tab/>
-            </w:r>
-            <w:r>
-              <w:rPr>
-                <w:rFonts w:ascii="Times New Roman" w:hAnsi="Times New Roman" w:cs="Times New Roman"/>
-                <w:sz w:val="24"/>
-                <w:szCs w:val="24"/>
-              </w:rPr>
-              <w:tab/>
-            </w:r>
-            <w:r>
-              <w:rPr>
-                <w:rFonts w:ascii="Times New Roman" w:hAnsi="Times New Roman" w:cs="Times New Roman"/>
-                <w:sz w:val="24"/>
-                <w:szCs w:val="24"/>
-              </w:rPr>
-              <w:tab/>
-              <w:t>Fax: (+84-24) 3 569-0588</w:t>
-            </w:r>
-          </w:p>
-        </w:tc>
-      </w:tr>
-      <w:tr>
-        <w:tc>
-          <w:tcPr>
-            <w:tcW w:w="2093" w:type="dxa"/>
-          </w:tcPr>
-          <w:p>
-            <w:pPr>
-              <w:spacing w:after="0" w:line="288" w:lineRule="auto"/>
-              <w:rPr>
-                <w:rFonts w:ascii="Times New Roman" w:hAnsi="Times New Roman" w:cs="Times New Roman"/>
-                <w:sz w:val="24"/>
-                <w:szCs w:val="24"/>
-              </w:rPr>
-            </w:pPr>
-            <w:r>
-              <w:rPr>
-                <w:rFonts w:ascii="Times New Roman" w:hAnsi="Times New Roman" w:cs="Times New Roman"/>
-                <w:sz w:val="24"/>
-                <w:szCs w:val="24"/>
-              </w:rPr>
-              <w:t>Mã số</w:t>
-            </w:r>
-            <w:r>
-              <w:rPr>
-                <w:rFonts w:ascii="Times New Roman" w:hAnsi="Times New Roman" w:cs="Times New Roman"/>
-                <w:spacing w:val="-1"/>
+                <w:spacing w:val="-6"/>
+                <w:sz w:val="24"/>
+                <w:szCs w:val="24"/>
+              </w:rPr>
+              <w:t xml:space="preserve">Ngân </w:t>
+            </w:r>
+            <w:proofErr w:type="spellStart"/>
+            <w:r>
+              <w:rPr>
+                <w:rFonts w:ascii="Times New Roman" w:hAnsi="Times New Roman" w:cs="Times New Roman"/>
+                <w:spacing w:val="-6"/>
+                <w:sz w:val="24"/>
+                <w:szCs w:val="24"/>
+              </w:rPr>
+              <w:t>hàng</w:t>
+            </w:r>
+            <w:proofErr w:type="spellEnd"/>
+            <w:r>
+              <w:rPr>
+                <w:rFonts w:ascii="Times New Roman" w:hAnsi="Times New Roman" w:cs="Times New Roman"/>
+                <w:spacing w:val="-6"/>
+                <w:sz w:val="24"/>
+                <w:szCs w:val="24"/>
+              </w:rPr>
+              <w:t xml:space="preserve"> Thương </w:t>
+            </w:r>
+            <w:proofErr w:type="spellStart"/>
+            <w:r>
+              <w:rPr>
+                <w:rFonts w:ascii="Times New Roman" w:hAnsi="Times New Roman" w:cs="Times New Roman"/>
+                <w:spacing w:val="-6"/>
+                <w:sz w:val="24"/>
+                <w:szCs w:val="24"/>
+              </w:rPr>
+              <w:t>mại</w:t>
+            </w:r>
+            <w:proofErr w:type="spellEnd"/>
+            <w:r>
+              <w:rPr>
+                <w:rFonts w:ascii="Times New Roman" w:hAnsi="Times New Roman" w:cs="Times New Roman"/>
+                <w:spacing w:val="-6"/>
                 <w:sz w:val="24"/>
                 <w:szCs w:val="24"/>
               </w:rPr>
               <w:t xml:space="preserve"> </w:t>
             </w:r>
-            <w:r>
-              <w:rPr>
-                <w:rFonts w:ascii="Times New Roman" w:hAnsi="Times New Roman" w:cs="Times New Roman"/>
-                <w:sz w:val="24"/>
-                <w:szCs w:val="24"/>
-              </w:rPr>
-              <w:t>thuế</w:t>
-            </w:r>
-          </w:p>
-        </w:tc>
-        <w:tc>
-          <w:tcPr>
-            <w:tcW w:w="368" w:type="dxa"/>
-          </w:tcPr>
-          <w:p>
-            <w:pPr>
-              <w:spacing w:after="0" w:line="288" w:lineRule="auto"/>
-              <w:rPr>
-                <w:rFonts w:ascii="Times New Roman" w:hAnsi="Times New Roman" w:cs="Times New Roman"/>
-                <w:sz w:val="24"/>
-                <w:szCs w:val="24"/>
-              </w:rPr>
-            </w:pPr>
-            <w:r>
-              <w:rPr>
-                <w:rFonts w:ascii="Times New Roman" w:hAnsi="Times New Roman" w:cs="Times New Roman"/>
-                <w:sz w:val="24"/>
-                <w:szCs w:val="24"/>
-              </w:rPr>
-              <w:t>:</w:t>
-            </w:r>
-          </w:p>
-        </w:tc>
-        <w:tc>
-          <w:tcPr>
-            <w:tcW w:w="7145" w:type="dxa"/>
-          </w:tcPr>
-          <w:p>
-            <w:pPr>
-              <w:spacing w:after="0" w:line="288" w:lineRule="auto"/>
-              <w:rPr>
-                <w:rFonts w:ascii="Times New Roman" w:hAnsi="Times New Roman" w:cs="Times New Roman"/>
-                <w:sz w:val="24"/>
-                <w:szCs w:val="24"/>
-              </w:rPr>
-            </w:pPr>
-            <w:r>
-              <w:rPr>
-                <w:rFonts w:ascii="Times New Roman" w:hAnsi="Times New Roman" w:cs="Times New Roman"/>
-                <w:sz w:val="24"/>
-                <w:szCs w:val="24"/>
-              </w:rPr>
-              <w:t>0105801335</w:t>
-            </w:r>
-          </w:p>
-        </w:tc>
-      </w:tr>
-      <w:tr>
-        <w:tc>
-          <w:tcPr>
-            <w:tcW w:w="2093" w:type="dxa"/>
-          </w:tcPr>
-          <w:p>
-            <w:pPr>
-              <w:spacing w:after="0" w:line="288" w:lineRule="auto"/>
-              <w:rPr>
-                <w:rFonts w:ascii="Times New Roman" w:hAnsi="Times New Roman" w:cs="Times New Roman"/>
-                <w:sz w:val="24"/>
-                <w:szCs w:val="24"/>
-              </w:rPr>
-            </w:pPr>
-            <w:r>
-              <w:rPr>
-                <w:rFonts w:ascii="Times New Roman" w:hAnsi="Times New Roman" w:cs="Times New Roman"/>
-                <w:sz w:val="24"/>
-                <w:szCs w:val="24"/>
-              </w:rPr>
-              <w:t>Tài khoản</w:t>
-            </w:r>
-            <w:r>
-              <w:rPr>
-                <w:rFonts w:ascii="Times New Roman" w:hAnsi="Times New Roman" w:cs="Times New Roman"/>
-                <w:spacing w:val="-2"/>
+            <w:proofErr w:type="spellStart"/>
+            <w:r>
+              <w:rPr>
+                <w:rFonts w:ascii="Times New Roman" w:hAnsi="Times New Roman" w:cs="Times New Roman"/>
+                <w:spacing w:val="-6"/>
+                <w:sz w:val="24"/>
+                <w:szCs w:val="24"/>
+              </w:rPr>
+              <w:t>Cổ</w:t>
+            </w:r>
+            <w:proofErr w:type="spellEnd"/>
+            <w:r>
+              <w:rPr>
+                <w:rFonts w:ascii="Times New Roman" w:hAnsi="Times New Roman" w:cs="Times New Roman"/>
+                <w:spacing w:val="-6"/>
                 <w:sz w:val="24"/>
                 <w:szCs w:val="24"/>
               </w:rPr>
               <w:t xml:space="preserve"> </w:t>
             </w:r>
-            <w:r>
-              <w:rPr>
-                <w:rFonts w:ascii="Times New Roman" w:hAnsi="Times New Roman" w:cs="Times New Roman"/>
-                <w:sz w:val="24"/>
-                <w:szCs w:val="24"/>
-              </w:rPr>
-              <w:t>số</w:t>
-            </w:r>
-          </w:p>
-        </w:tc>
-        <w:tc>
-          <w:tcPr>
-            <w:tcW w:w="368" w:type="dxa"/>
-          </w:tcPr>
-          <w:p>
-            <w:pPr>
-              <w:spacing w:after="0" w:line="288" w:lineRule="auto"/>
-              <w:rPr>
-                <w:rFonts w:ascii="Times New Roman" w:hAnsi="Times New Roman" w:cs="Times New Roman"/>
-                <w:sz w:val="24"/>
-                <w:szCs w:val="24"/>
-              </w:rPr>
-            </w:pPr>
-            <w:r>
-              <w:rPr>
-                <w:rFonts w:ascii="Times New Roman" w:hAnsi="Times New Roman" w:cs="Times New Roman"/>
-                <w:sz w:val="24"/>
-                <w:szCs w:val="24"/>
-              </w:rPr>
-              <w:t>:</w:t>
-            </w:r>
-          </w:p>
-        </w:tc>
-        <w:tc>
-          <w:tcPr>
-            <w:tcW w:w="7145" w:type="dxa"/>
-          </w:tcPr>
-          <w:p>
-            <w:pPr>
-              <w:spacing w:after="0" w:line="288" w:lineRule="auto"/>
-              <w:rPr>
-                <w:rFonts w:ascii="Times New Roman" w:hAnsi="Times New Roman" w:cs="Times New Roman"/>
-                <w:sz w:val="24"/>
-                <w:szCs w:val="24"/>
-              </w:rPr>
-            </w:pPr>
-            <w:r>
-              <w:rPr>
-                <w:rFonts w:ascii="Times New Roman" w:hAnsi="Times New Roman" w:cs="Times New Roman"/>
-                <w:sz w:val="24"/>
-                <w:szCs w:val="24"/>
-              </w:rPr>
-              <w:t>55944447777</w:t>
-            </w:r>
-          </w:p>
-        </w:tc>
-      </w:tr>
-      <w:tr>
-        <w:tc>
-          <w:tcPr>
-            <w:tcW w:w="2093" w:type="dxa"/>
-          </w:tcPr>
-          <w:p>
-            <w:pPr>
-              <w:spacing w:after="0" w:line="288" w:lineRule="auto"/>
-              <w:rPr>
-                <w:rFonts w:ascii="Times New Roman" w:hAnsi="Times New Roman" w:cs="Times New Roman"/>
-                <w:sz w:val="24"/>
-                <w:szCs w:val="24"/>
-              </w:rPr>
-            </w:pPr>
-            <w:r>
-              <w:rPr>
-                <w:rFonts w:ascii="Times New Roman" w:hAnsi="Times New Roman" w:cs="Times New Roman"/>
-                <w:sz w:val="24"/>
-                <w:szCs w:val="24"/>
-              </w:rPr>
-              <w:t>Tại ngân hàng</w:t>
-            </w:r>
-          </w:p>
-        </w:tc>
-        <w:tc>
-          <w:tcPr>
-            <w:tcW w:w="368" w:type="dxa"/>
-          </w:tcPr>
-          <w:p>
-            <w:pPr>
-              <w:spacing w:after="0" w:line="288" w:lineRule="auto"/>
-              <w:rPr>
-                <w:rFonts w:ascii="Times New Roman" w:hAnsi="Times New Roman" w:cs="Times New Roman"/>
-                <w:sz w:val="24"/>
-                <w:szCs w:val="24"/>
-              </w:rPr>
-            </w:pPr>
-            <w:r>
-              <w:rPr>
-                <w:rFonts w:ascii="Times New Roman" w:hAnsi="Times New Roman" w:cs="Times New Roman"/>
-                <w:sz w:val="24"/>
-                <w:szCs w:val="24"/>
-              </w:rPr>
-              <w:t>:</w:t>
-            </w:r>
-          </w:p>
-        </w:tc>
-        <w:tc>
-          <w:tcPr>
-            <w:tcW w:w="7145" w:type="dxa"/>
-          </w:tcPr>
-          <w:p>
-            <w:pPr>
-              <w:spacing w:after="0" w:line="288" w:lineRule="auto"/>
+            <w:proofErr w:type="spellStart"/>
+            <w:r>
               <w:rPr>
                 <w:rFonts w:ascii="Times New Roman" w:hAnsi="Times New Roman" w:cs="Times New Roman"/>
                 <w:spacing w:val="-6"/>
                 <w:sz w:val="24"/>
                 <w:szCs w:val="24"/>
               </w:rPr>
-            </w:pPr>
+              <w:t>phần</w:t>
+            </w:r>
+            <w:proofErr w:type="spellEnd"/>
             <w:r>
               <w:rPr>
                 <w:rFonts w:ascii="Times New Roman" w:hAnsi="Times New Roman" w:cs="Times New Roman"/>
@@ -1485,8 +2323,39 @@
                 <w:sz w:val="24"/>
                 <w:szCs w:val="24"/>
               </w:rPr>
-              <w:t>Ngân hàng Thương mại Cổ phần Tiên Phong – PGD Hai Bà Trưng, Hà Nội</w:t>
-            </w:r>
+              <w:t xml:space="preserve"> Tiên Phong – PGD Hai </w:t>
+            </w:r>
+            <w:proofErr w:type="spellStart"/>
+            <w:r>
+              <w:rPr>
+                <w:rFonts w:ascii="Times New Roman" w:hAnsi="Times New Roman" w:cs="Times New Roman"/>
+                <w:spacing w:val="-6"/>
+                <w:sz w:val="24"/>
+                <w:szCs w:val="24"/>
+              </w:rPr>
+              <w:t>Bà</w:t>
+            </w:r>
+            <w:proofErr w:type="spellEnd"/>
+            <w:r>
+              <w:rPr>
+                <w:rFonts w:ascii="Times New Roman" w:hAnsi="Times New Roman" w:cs="Times New Roman"/>
+                <w:spacing w:val="-6"/>
+                <w:sz w:val="24"/>
+                <w:szCs w:val="24"/>
+              </w:rPr>
+              <w:t xml:space="preserve"> Trưng, Hà </w:t>
+            </w:r>
+            <w:proofErr w:type="spellStart"/>
+            <w:r>
+              <w:rPr>
+                <w:rFonts w:ascii="Times New Roman" w:hAnsi="Times New Roman" w:cs="Times New Roman"/>
+                <w:spacing w:val="-6"/>
+                <w:sz w:val="24"/>
+                <w:szCs w:val="24"/>
+              </w:rPr>
+              <w:t>Nội</w:t>
+            </w:r>
+            <w:proofErr w:type="spellEnd"/>
           </w:p>
         </w:tc>
       </w:tr>
@@ -1513,8 +2382,81 @@
           <w:szCs w:val="24"/>
           <w:lang w:val="fr-FR"/>
         </w:rPr>
-        <w:t>(Sau đây gọi tắt là “</w:t>
-      </w:r>
+        <w:t xml:space="preserve">(Sau </w:t>
+      </w:r>
+      <w:proofErr w:type="spellStart"/>
+      <w:r>
+        <w:rPr>
+          <w:rFonts w:ascii="Times New Roman" w:hAnsi="Times New Roman" w:cs="Times New Roman"/>
+          <w:i/>
+          <w:iCs/>
+          <w:sz w:val="24"/>
+          <w:szCs w:val="24"/>
+          <w:lang w:val="fr-FR"/>
+        </w:rPr>
+        <w:t>đây</w:t>
+      </w:r>
+      <w:proofErr w:type="spellEnd"/>
+      <w:r>
+        <w:rPr>
+          <w:rFonts w:ascii="Times New Roman" w:hAnsi="Times New Roman" w:cs="Times New Roman"/>
+          <w:i/>
+          <w:iCs/>
+          <w:sz w:val="24"/>
+          <w:szCs w:val="24"/>
+          <w:lang w:val="fr-FR"/>
+        </w:rPr>
+        <w:t xml:space="preserve"> </w:t>
+      </w:r>
+      <w:proofErr w:type="spellStart"/>
+      <w:r>
+        <w:rPr>
+          <w:rFonts w:ascii="Times New Roman" w:hAnsi="Times New Roman" w:cs="Times New Roman"/>
+          <w:i/>
+          <w:iCs/>
+          <w:sz w:val="24"/>
+          <w:szCs w:val="24"/>
+          <w:lang w:val="fr-FR"/>
+        </w:rPr>
+        <w:t>gọi</w:t>
+      </w:r>
+      <w:proofErr w:type="spellEnd"/>
+      <w:r>
+        <w:rPr>
+          <w:rFonts w:ascii="Times New Roman" w:hAnsi="Times New Roman" w:cs="Times New Roman"/>
+          <w:i/>
+          <w:iCs/>
+          <w:sz w:val="24"/>
+          <w:szCs w:val="24"/>
+          <w:lang w:val="fr-FR"/>
+        </w:rPr>
+        <w:t xml:space="preserve"> </w:t>
+      </w:r>
+      <w:proofErr w:type="spellStart"/>
+      <w:r>
+        <w:rPr>
+          <w:rFonts w:ascii="Times New Roman" w:hAnsi="Times New Roman" w:cs="Times New Roman"/>
+          <w:i/>
+          <w:iCs/>
+          <w:sz w:val="24"/>
+          <w:szCs w:val="24"/>
+          <w:lang w:val="fr-FR"/>
+        </w:rPr>
+        <w:t>tắt</w:t>
+      </w:r>
+      <w:proofErr w:type="spellEnd"/>
+      <w:r>
+        <w:rPr>
+          <w:rFonts w:ascii="Times New Roman" w:hAnsi="Times New Roman" w:cs="Times New Roman"/>
+          <w:i/>
+          <w:iCs/>
+          <w:sz w:val="24"/>
+          <w:szCs w:val="24"/>
+          <w:lang w:val="fr-FR"/>
+        </w:rPr>
+        <w:t xml:space="preserve"> là “</w:t>
+      </w:r>
+      <w:proofErr w:type="spellStart"/>
       <w:r>
         <w:rPr>
           <w:rFonts w:ascii="Times New Roman" w:hAnsi="Times New Roman" w:cs="Times New Roman"/>
@@ -1528,6 +2470,7 @@
         </w:rPr>
         <w:t>Bên</w:t>
       </w:r>
+      <w:proofErr w:type="spellEnd"/>
       <w:r>
         <w:rPr>
           <w:rFonts w:ascii="Times New Roman" w:hAnsi="Times New Roman" w:cs="Times New Roman"/>
@@ -1580,17 +2523,403 @@
           <w:lang w:val="fr-FR"/>
         </w:rPr>
       </w:pPr>
-      <w:r>
-        <w:rPr>
-          <w:rFonts w:ascii="Times New Roman" w:hAnsi="Times New Roman" w:cs="Times New Roman"/>
-          <w:i/>
-          <w:iCs/>
-          <w:sz w:val="24"/>
-          <w:szCs w:val="24"/>
-          <w:lang w:val="fr-FR"/>
-        </w:rPr>
-        <w:t>Tại đây, hai bên thống nhất ký kết hợp đồng với các điều khoản cụ thể như</w:t>
-      </w:r>
+      <w:proofErr w:type="spellStart"/>
+      <w:r>
+        <w:rPr>
+          <w:rFonts w:ascii="Times New Roman" w:hAnsi="Times New Roman" w:cs="Times New Roman"/>
+          <w:i/>
+          <w:iCs/>
+          <w:sz w:val="24"/>
+          <w:szCs w:val="24"/>
+          <w:lang w:val="fr-FR"/>
+        </w:rPr>
+        <w:t>Tại</w:t>
+      </w:r>
+      <w:proofErr w:type="spellEnd"/>
+      <w:r>
+        <w:rPr>
+          <w:rFonts w:ascii="Times New Roman" w:hAnsi="Times New Roman" w:cs="Times New Roman"/>
+          <w:i/>
+          <w:iCs/>
+          <w:sz w:val="24"/>
+          <w:szCs w:val="24"/>
+          <w:lang w:val="fr-FR"/>
+        </w:rPr>
+        <w:t xml:space="preserve"> </w:t>
+      </w:r>
+      <w:proofErr w:type="spellStart"/>
+      <w:r>
+        <w:rPr>
+          <w:rFonts w:ascii="Times New Roman" w:hAnsi="Times New Roman" w:cs="Times New Roman"/>
+          <w:i/>
+          <w:iCs/>
+          <w:sz w:val="24"/>
+          <w:szCs w:val="24"/>
+          <w:lang w:val="fr-FR"/>
+        </w:rPr>
+        <w:t>đây</w:t>
+      </w:r>
+      <w:proofErr w:type="spellEnd"/>
+      <w:r>
+        <w:rPr>
+          <w:rFonts w:ascii="Times New Roman" w:hAnsi="Times New Roman" w:cs="Times New Roman"/>
+          <w:i/>
+          <w:iCs/>
+          <w:sz w:val="24"/>
+          <w:szCs w:val="24"/>
+          <w:lang w:val="fr-FR"/>
+        </w:rPr>
+        <w:t xml:space="preserve">, </w:t>
+      </w:r>
+      <w:proofErr w:type="spellStart"/>
+      <w:r>
+        <w:rPr>
+          <w:rFonts w:ascii="Times New Roman" w:hAnsi="Times New Roman" w:cs="Times New Roman"/>
+          <w:i/>
+          <w:iCs/>
+          <w:sz w:val="24"/>
+          <w:szCs w:val="24"/>
+          <w:lang w:val="fr-FR"/>
+        </w:rPr>
+        <w:t>hai</w:t>
+      </w:r>
+      <w:proofErr w:type="spellEnd"/>
+      <w:r>
+        <w:rPr>
+          <w:rFonts w:ascii="Times New Roman" w:hAnsi="Times New Roman" w:cs="Times New Roman"/>
+          <w:i/>
+          <w:iCs/>
+          <w:sz w:val="24"/>
+          <w:szCs w:val="24"/>
+          <w:lang w:val="fr-FR"/>
+        </w:rPr>
+        <w:t xml:space="preserve"> </w:t>
+      </w:r>
+      <w:proofErr w:type="spellStart"/>
+      <w:r>
+        <w:rPr>
+          <w:rFonts w:ascii="Times New Roman" w:hAnsi="Times New Roman" w:cs="Times New Roman"/>
+          <w:i/>
+          <w:iCs/>
+          <w:sz w:val="24"/>
+          <w:szCs w:val="24"/>
+          <w:lang w:val="fr-FR"/>
+        </w:rPr>
+        <w:t>bên</w:t>
+      </w:r>
+      <w:proofErr w:type="spellEnd"/>
+      <w:r>
+        <w:rPr>
+          <w:rFonts w:ascii="Times New Roman" w:hAnsi="Times New Roman" w:cs="Times New Roman"/>
+          <w:i/>
+          <w:iCs/>
+          <w:sz w:val="24"/>
+          <w:szCs w:val="24"/>
+          <w:lang w:val="fr-FR"/>
+        </w:rPr>
+        <w:t xml:space="preserve"> </w:t>
+      </w:r>
+      <w:proofErr w:type="spellStart"/>
+      <w:r>
+        <w:rPr>
+          <w:rFonts w:ascii="Times New Roman" w:hAnsi="Times New Roman" w:cs="Times New Roman"/>
+          <w:i/>
+          <w:iCs/>
+          <w:sz w:val="24"/>
+          <w:szCs w:val="24"/>
+          <w:lang w:val="fr-FR"/>
+        </w:rPr>
+        <w:t>thống</w:t>
+      </w:r>
+      <w:proofErr w:type="spellEnd"/>
+      <w:r>
+        <w:rPr>
+          <w:rFonts w:ascii="Times New Roman" w:hAnsi="Times New Roman" w:cs="Times New Roman"/>
+          <w:i/>
+          <w:iCs/>
+          <w:sz w:val="24"/>
+          <w:szCs w:val="24"/>
+          <w:lang w:val="fr-FR"/>
+        </w:rPr>
+        <w:t xml:space="preserve"> </w:t>
+      </w:r>
+      <w:proofErr w:type="spellStart"/>
+      <w:r>
+        <w:rPr>
+          <w:rFonts w:ascii="Times New Roman" w:hAnsi="Times New Roman" w:cs="Times New Roman"/>
+          <w:i/>
+          <w:iCs/>
+          <w:sz w:val="24"/>
+          <w:szCs w:val="24"/>
+          <w:lang w:val="fr-FR"/>
+        </w:rPr>
+        <w:t>nhất</w:t>
+      </w:r>
+      <w:proofErr w:type="spellEnd"/>
+      <w:r>
+        <w:rPr>
+          <w:rFonts w:ascii="Times New Roman" w:hAnsi="Times New Roman" w:cs="Times New Roman"/>
+          <w:i/>
+          <w:iCs/>
+          <w:sz w:val="24"/>
+          <w:szCs w:val="24"/>
+          <w:lang w:val="fr-FR"/>
+        </w:rPr>
+        <w:t xml:space="preserve"> </w:t>
+      </w:r>
+      <w:proofErr w:type="spellStart"/>
+      <w:r>
+        <w:rPr>
+          <w:rFonts w:ascii="Times New Roman" w:hAnsi="Times New Roman" w:cs="Times New Roman"/>
+          <w:i/>
+          <w:iCs/>
+          <w:sz w:val="24"/>
+          <w:szCs w:val="24"/>
+          <w:lang w:val="fr-FR"/>
+        </w:rPr>
+        <w:t>ký</w:t>
+      </w:r>
+      <w:proofErr w:type="spellEnd"/>
+      <w:r>
+        <w:rPr>
+          <w:rFonts w:ascii="Times New Roman" w:hAnsi="Times New Roman" w:cs="Times New Roman"/>
+          <w:i/>
+          <w:iCs/>
+          <w:sz w:val="24"/>
+          <w:szCs w:val="24"/>
+          <w:lang w:val="fr-FR"/>
+        </w:rPr>
+        <w:t xml:space="preserve"> </w:t>
+      </w:r>
+      <w:proofErr w:type="spellStart"/>
+      <w:r>
+        <w:rPr>
+          <w:rFonts w:ascii="Times New Roman" w:hAnsi="Times New Roman" w:cs="Times New Roman"/>
+          <w:i/>
+          <w:iCs/>
+          <w:sz w:val="24"/>
+          <w:szCs w:val="24"/>
+          <w:lang w:val="fr-FR"/>
+        </w:rPr>
+        <w:t>kết</w:t>
+      </w:r>
+      <w:proofErr w:type="spellEnd"/>
+      <w:r>
+        <w:rPr>
+          <w:rFonts w:ascii="Times New Roman" w:hAnsi="Times New Roman" w:cs="Times New Roman"/>
+          <w:i/>
+          <w:iCs/>
+          <w:sz w:val="24"/>
+          <w:szCs w:val="24"/>
+          <w:lang w:val="fr-FR"/>
+        </w:rPr>
+        <w:t xml:space="preserve"> </w:t>
+      </w:r>
+      <w:proofErr w:type="spellStart"/>
+      <w:r>
+        <w:rPr>
+          <w:rFonts w:ascii="Times New Roman" w:hAnsi="Times New Roman" w:cs="Times New Roman"/>
+          <w:i/>
+          <w:iCs/>
+          <w:sz w:val="24"/>
+          <w:szCs w:val="24"/>
+          <w:lang w:val="fr-FR"/>
+        </w:rPr>
+        <w:t>hợp</w:t>
+      </w:r>
+      <w:proofErr w:type="spellEnd"/>
+      <w:r>
+        <w:rPr>
+          <w:rFonts w:ascii="Times New Roman" w:hAnsi="Times New Roman" w:cs="Times New Roman"/>
+          <w:i/>
+          <w:iCs/>
+          <w:sz w:val="24"/>
+          <w:szCs w:val="24"/>
+          <w:lang w:val="fr-FR"/>
+        </w:rPr>
+        <w:t xml:space="preserve"> </w:t>
+      </w:r>
+      <w:proofErr w:type="spellStart"/>
+      <w:r>
+        <w:rPr>
+          <w:rFonts w:ascii="Times New Roman" w:hAnsi="Times New Roman" w:cs="Times New Roman"/>
+          <w:i/>
+          <w:iCs/>
+          <w:sz w:val="24"/>
+          <w:szCs w:val="24"/>
+          <w:lang w:val="fr-FR"/>
+        </w:rPr>
+        <w:t>đồng</w:t>
+      </w:r>
+      <w:proofErr w:type="spellEnd"/>
+      <w:r>
+        <w:rPr>
+          <w:rFonts w:ascii="Times New Roman" w:hAnsi="Times New Roman" w:cs="Times New Roman"/>
+          <w:i/>
+          <w:iCs/>
+          <w:sz w:val="24"/>
+          <w:szCs w:val="24"/>
+          <w:lang w:val="fr-FR"/>
+        </w:rPr>
+        <w:t xml:space="preserve"> </w:t>
+      </w:r>
+      <w:proofErr w:type="spellStart"/>
+      <w:r>
+        <w:rPr>
+          <w:rFonts w:ascii="Times New Roman" w:hAnsi="Times New Roman" w:cs="Times New Roman"/>
+          <w:i/>
+          <w:iCs/>
+          <w:sz w:val="24"/>
+          <w:szCs w:val="24"/>
+          <w:lang w:val="fr-FR"/>
+        </w:rPr>
+        <w:t>với</w:t>
+      </w:r>
+      <w:proofErr w:type="spellEnd"/>
+      <w:r>
+        <w:rPr>
+          <w:rFonts w:ascii="Times New Roman" w:hAnsi="Times New Roman" w:cs="Times New Roman"/>
+          <w:i/>
+          <w:iCs/>
+          <w:sz w:val="24"/>
+          <w:szCs w:val="24"/>
+          <w:lang w:val="fr-FR"/>
+        </w:rPr>
+        <w:t xml:space="preserve"> </w:t>
+      </w:r>
+      <w:proofErr w:type="spellStart"/>
+      <w:r>
+        <w:rPr>
+          <w:rFonts w:ascii="Times New Roman" w:hAnsi="Times New Roman" w:cs="Times New Roman"/>
+          <w:i/>
+          <w:iCs/>
+          <w:sz w:val="24"/>
+          <w:szCs w:val="24"/>
+          <w:lang w:val="fr-FR"/>
+        </w:rPr>
+        <w:t>các</w:t>
+      </w:r>
+      <w:proofErr w:type="spellEnd"/>
+      <w:r>
+        <w:rPr>
+          <w:rFonts w:ascii="Times New Roman" w:hAnsi="Times New Roman" w:cs="Times New Roman"/>
+          <w:i/>
+          <w:iCs/>
+          <w:sz w:val="24"/>
+          <w:szCs w:val="24"/>
+          <w:lang w:val="fr-FR"/>
+        </w:rPr>
+        <w:t xml:space="preserve"> </w:t>
+      </w:r>
+      <w:proofErr w:type="spellStart"/>
+      <w:r>
+        <w:rPr>
+          <w:rFonts w:ascii="Times New Roman" w:hAnsi="Times New Roman" w:cs="Times New Roman"/>
+          <w:i/>
+          <w:iCs/>
+          <w:sz w:val="24"/>
+          <w:szCs w:val="24"/>
+          <w:lang w:val="fr-FR"/>
+        </w:rPr>
+        <w:t>điều</w:t>
+      </w:r>
+      <w:proofErr w:type="spellEnd"/>
+      <w:r>
+        <w:rPr>
+          <w:rFonts w:ascii="Times New Roman" w:hAnsi="Times New Roman" w:cs="Times New Roman"/>
+          <w:i/>
+          <w:iCs/>
+          <w:sz w:val="24"/>
+          <w:szCs w:val="24"/>
+          <w:lang w:val="fr-FR"/>
+        </w:rPr>
+        <w:t xml:space="preserve"> </w:t>
+      </w:r>
+      <w:proofErr w:type="spellStart"/>
+      <w:r>
+        <w:rPr>
+          <w:rFonts w:ascii="Times New Roman" w:hAnsi="Times New Roman" w:cs="Times New Roman"/>
+          <w:i/>
+          <w:iCs/>
+          <w:sz w:val="24"/>
+          <w:szCs w:val="24"/>
+          <w:lang w:val="fr-FR"/>
+        </w:rPr>
+        <w:t>khoản</w:t>
+      </w:r>
+      <w:proofErr w:type="spellEnd"/>
+      <w:r>
+        <w:rPr>
+          <w:rFonts w:ascii="Times New Roman" w:hAnsi="Times New Roman" w:cs="Times New Roman"/>
+          <w:i/>
+          <w:iCs/>
+          <w:sz w:val="24"/>
+          <w:szCs w:val="24"/>
+          <w:lang w:val="fr-FR"/>
+        </w:rPr>
+        <w:t xml:space="preserve"> </w:t>
+      </w:r>
+      <w:proofErr w:type="spellStart"/>
+      <w:r>
+        <w:rPr>
+          <w:rFonts w:ascii="Times New Roman" w:hAnsi="Times New Roman" w:cs="Times New Roman"/>
+          <w:i/>
+          <w:iCs/>
+          <w:sz w:val="24"/>
+          <w:szCs w:val="24"/>
+          <w:lang w:val="fr-FR"/>
+        </w:rPr>
+        <w:t>cụ</w:t>
+      </w:r>
+      <w:proofErr w:type="spellEnd"/>
+      <w:r>
+        <w:rPr>
+          <w:rFonts w:ascii="Times New Roman" w:hAnsi="Times New Roman" w:cs="Times New Roman"/>
+          <w:i/>
+          <w:iCs/>
+          <w:sz w:val="24"/>
+          <w:szCs w:val="24"/>
+          <w:lang w:val="fr-FR"/>
+        </w:rPr>
+        <w:t xml:space="preserve"> </w:t>
+      </w:r>
+      <w:proofErr w:type="spellStart"/>
+      <w:r>
+        <w:rPr>
+          <w:rFonts w:ascii="Times New Roman" w:hAnsi="Times New Roman" w:cs="Times New Roman"/>
+          <w:i/>
+          <w:iCs/>
+          <w:sz w:val="24"/>
+          <w:szCs w:val="24"/>
+          <w:lang w:val="fr-FR"/>
+        </w:rPr>
+        <w:t>thể</w:t>
+      </w:r>
+      <w:proofErr w:type="spellEnd"/>
+      <w:r>
+        <w:rPr>
+          <w:rFonts w:ascii="Times New Roman" w:hAnsi="Times New Roman" w:cs="Times New Roman"/>
+          <w:i/>
+          <w:iCs/>
+          <w:sz w:val="24"/>
+          <w:szCs w:val="24"/>
+          <w:lang w:val="fr-FR"/>
+        </w:rPr>
+        <w:t xml:space="preserve"> </w:t>
+      </w:r>
+      <w:proofErr w:type="spellStart"/>
+      <w:r>
+        <w:rPr>
+          <w:rFonts w:ascii="Times New Roman" w:hAnsi="Times New Roman" w:cs="Times New Roman"/>
+          <w:i/>
+          <w:iCs/>
+          <w:sz w:val="24"/>
+          <w:szCs w:val="24"/>
+          <w:lang w:val="fr-FR"/>
+        </w:rPr>
+        <w:t>như</w:t>
+      </w:r>
+      <w:proofErr w:type="spellEnd"/>
       <w:r>
         <w:rPr>
           <w:rFonts w:ascii="Times New Roman" w:hAnsi="Times New Roman" w:cs="Times New Roman"/>
@@ -1603,6 +2932,7 @@
         </w:rPr>
         <w:t xml:space="preserve"> </w:t>
       </w:r>
+      <w:proofErr w:type="spellStart"/>
       <w:proofErr w:type="gramStart"/>
       <w:r>
         <w:rPr>
@@ -1613,7 +2943,19 @@
           <w:szCs w:val="24"/>
           <w:lang w:val="fr-FR"/>
         </w:rPr>
-        <w:t>sau:</w:t>
+        <w:t>sau</w:t>
+      </w:r>
+      <w:proofErr w:type="spellEnd"/>
+      <w:r>
+        <w:rPr>
+          <w:rFonts w:ascii="Times New Roman" w:hAnsi="Times New Roman" w:cs="Times New Roman"/>
+          <w:i/>
+          <w:iCs/>
+          <w:sz w:val="24"/>
+          <w:szCs w:val="24"/>
+          <w:lang w:val="fr-FR"/>
+        </w:rPr>
+        <w:t>:</w:t>
       </w:r>
       <w:proofErr w:type="gramEnd"/>
     </w:p>
@@ -1622,12 +2964,14 @@
         <w:keepNext/>
         <w:rPr>
           <w:rFonts w:ascii="Times New Roman" w:hAnsi="Times New Roman" w:cs="Times New Roman"/>
+          <w:lang w:val="fr-FR"/>
         </w:rPr>
       </w:pPr>
       <w:r>
         <w:rPr>
           <w:rFonts w:ascii="Times New Roman" w:hAnsi="Times New Roman" w:cs="Times New Roman"/>
           <w:b/>
+          <w:lang w:val="fr-FR"/>
         </w:rPr>
         <w:t>THÔNG TIN VÀ PHẠM VI HỢP ĐỒNG</w:t>
       </w:r>
@@ -1636,13 +2980,113 @@
       <w:pPr>
         <w:rPr>
           <w:rFonts w:ascii="Times New Roman" w:hAnsi="Times New Roman" w:cs="Times New Roman"/>
-        </w:rPr>
-      </w:pPr>
-      <w:r>
-        <w:rPr>
-          <w:rFonts w:ascii="Times New Roman" w:hAnsi="Times New Roman" w:cs="Times New Roman"/>
-        </w:rPr>
-        <w:t>Thời hạn hiệu lực: từ {{EFFECTIVE_DATE}} đến {{EXPIRE_DATE}}.</w:t>
+          <w:lang w:val="fr-FR"/>
+        </w:rPr>
+      </w:pPr>
+      <w:proofErr w:type="spellStart"/>
+      <w:r>
+        <w:rPr>
+          <w:rFonts w:ascii="Times New Roman" w:hAnsi="Times New Roman" w:cs="Times New Roman"/>
+          <w:lang w:val="fr-FR"/>
+        </w:rPr>
+        <w:t>Thời</w:t>
+      </w:r>
+      <w:proofErr w:type="spellEnd"/>
+      <w:r>
+        <w:rPr>
+          <w:rFonts w:ascii="Times New Roman" w:hAnsi="Times New Roman" w:cs="Times New Roman"/>
+          <w:lang w:val="fr-FR"/>
+        </w:rPr>
+        <w:t xml:space="preserve"> </w:t>
+      </w:r>
+      <w:proofErr w:type="spellStart"/>
+      <w:r>
+        <w:rPr>
+          <w:rFonts w:ascii="Times New Roman" w:hAnsi="Times New Roman" w:cs="Times New Roman"/>
+          <w:lang w:val="fr-FR"/>
+        </w:rPr>
+        <w:t>hạn</w:t>
+      </w:r>
+      <w:proofErr w:type="spellEnd"/>
+      <w:r>
+        <w:rPr>
+          <w:rFonts w:ascii="Times New Roman" w:hAnsi="Times New Roman" w:cs="Times New Roman"/>
+          <w:lang w:val="fr-FR"/>
+        </w:rPr>
+        <w:t xml:space="preserve"> </w:t>
+      </w:r>
+      <w:proofErr w:type="spellStart"/>
+      <w:r>
+        <w:rPr>
+          <w:rFonts w:ascii="Times New Roman" w:hAnsi="Times New Roman" w:cs="Times New Roman"/>
+          <w:lang w:val="fr-FR"/>
+        </w:rPr>
+        <w:t>hiệu</w:t>
+      </w:r>
+      <w:proofErr w:type="spellEnd"/>
+      <w:r>
+        <w:rPr>
+          <w:rFonts w:ascii="Times New Roman" w:hAnsi="Times New Roman" w:cs="Times New Roman"/>
+          <w:lang w:val="fr-FR"/>
+        </w:rPr>
+        <w:t xml:space="preserve"> </w:t>
+      </w:r>
+      <w:proofErr w:type="spellStart"/>
+      <w:proofErr w:type="gramStart"/>
+      <w:r>
+        <w:rPr>
+          <w:rFonts w:ascii="Times New Roman" w:hAnsi="Times New Roman" w:cs="Times New Roman"/>
+          <w:lang w:val="fr-FR"/>
+        </w:rPr>
+        <w:t>lực</w:t>
+      </w:r>
+      <w:proofErr w:type="spellEnd"/>
+      <w:r>
+        <w:rPr>
+          <w:rFonts w:ascii="Times New Roman" w:hAnsi="Times New Roman" w:cs="Times New Roman"/>
+          <w:lang w:val="fr-FR"/>
+        </w:rPr>
+        <w:t>:</w:t>
+      </w:r>
+      <w:proofErr w:type="gramEnd"/>
+      <w:r>
+        <w:rPr>
+          <w:rFonts w:ascii="Times New Roman" w:hAnsi="Times New Roman" w:cs="Times New Roman"/>
+          <w:lang w:val="fr-FR"/>
+        </w:rPr>
+        <w:t xml:space="preserve"> </w:t>
+      </w:r>
+      <w:proofErr w:type="spellStart"/>
+      <w:r>
+        <w:rPr>
+          <w:rFonts w:ascii="Times New Roman" w:hAnsi="Times New Roman" w:cs="Times New Roman"/>
+          <w:lang w:val="fr-FR"/>
+        </w:rPr>
+        <w:t>từ</w:t>
+      </w:r>
+      <w:proofErr w:type="spellEnd"/>
+      <w:r>
+        <w:rPr>
+          <w:rFonts w:ascii="Times New Roman" w:hAnsi="Times New Roman" w:cs="Times New Roman"/>
+          <w:lang w:val="fr-FR"/>
+        </w:rPr>
+        <w:t xml:space="preserve"> {{EFFECTIVE_DATE}} </w:t>
+      </w:r>
+      <w:proofErr w:type="spellStart"/>
+      <w:r>
+        <w:rPr>
+          <w:rFonts w:ascii="Times New Roman" w:hAnsi="Times New Roman" w:cs="Times New Roman"/>
+          <w:lang w:val="fr-FR"/>
+        </w:rPr>
+        <w:t>đến</w:t>
+      </w:r>
+      <w:proofErr w:type="spellEnd"/>
+      <w:r>
+        <w:rPr>
+          <w:rFonts w:ascii="Times New Roman" w:hAnsi="Times New Roman" w:cs="Times New Roman"/>
+          <w:lang w:val="fr-FR"/>
+        </w:rPr>
+        <w:t xml:space="preserve"> {{EXPIRE_DATE}}.</w:t>
       </w:r>
     </w:p>
     <w:p>
@@ -1651,11 +3095,61 @@
           <w:rFonts w:ascii="Times New Roman" w:hAnsi="Times New Roman" w:cs="Times New Roman"/>
         </w:rPr>
       </w:pPr>
-      <w:r>
-        <w:rPr>
-          <w:rFonts w:ascii="Times New Roman" w:hAnsi="Times New Roman" w:cs="Times New Roman"/>
-        </w:rPr>
-        <w:t>Giá trị hợp đồng: {{CONTRACT_TOTAL_AMOUNT}} {{CONTRACT_CURRENCY}}.</w:t>
+      <w:proofErr w:type="spellStart"/>
+      <w:r>
+        <w:rPr>
+          <w:rFonts w:ascii="Times New Roman" w:hAnsi="Times New Roman" w:cs="Times New Roman"/>
+        </w:rPr>
+        <w:t>Giá</w:t>
+      </w:r>
+      <w:proofErr w:type="spellEnd"/>
+      <w:r>
+        <w:rPr>
+          <w:rFonts w:ascii="Times New Roman" w:hAnsi="Times New Roman" w:cs="Times New Roman"/>
+        </w:rPr>
+        <w:t xml:space="preserve"> </w:t>
+      </w:r>
+      <w:proofErr w:type="spellStart"/>
+      <w:r>
+        <w:rPr>
+          <w:rFonts w:ascii="Times New Roman" w:hAnsi="Times New Roman" w:cs="Times New Roman"/>
+        </w:rPr>
+        <w:t>trị</w:t>
+      </w:r>
+      <w:proofErr w:type="spellEnd"/>
+      <w:r>
+        <w:rPr>
+          <w:rFonts w:ascii="Times New Roman" w:hAnsi="Times New Roman" w:cs="Times New Roman"/>
+        </w:rPr>
+        <w:t xml:space="preserve"> </w:t>
+      </w:r>
+      <w:proofErr w:type="spellStart"/>
+      <w:r>
+        <w:rPr>
+          <w:rFonts w:ascii="Times New Roman" w:hAnsi="Times New Roman" w:cs="Times New Roman"/>
+        </w:rPr>
+        <w:t>hợp</w:t>
+      </w:r>
+      <w:proofErr w:type="spellEnd"/>
+      <w:r>
+        <w:rPr>
+          <w:rFonts w:ascii="Times New Roman" w:hAnsi="Times New Roman" w:cs="Times New Roman"/>
+        </w:rPr>
+        <w:t xml:space="preserve"> </w:t>
+      </w:r>
+      <w:proofErr w:type="spellStart"/>
+      <w:r>
+        <w:rPr>
+          <w:rFonts w:ascii="Times New Roman" w:hAnsi="Times New Roman" w:cs="Times New Roman"/>
+        </w:rPr>
+        <w:t>đồng</w:t>
+      </w:r>
+      <w:proofErr w:type="spellEnd"/>
+      <w:r>
+        <w:rPr>
+          <w:rFonts w:ascii="Times New Roman" w:hAnsi="Times New Roman" w:cs="Times New Roman"/>
+        </w:rPr>
+        <w:t>: {{CONTRACT_TOTAL_AMOUNT}} {{CONTRACT_CURRENCY}}.</w:t>
       </w:r>
     </w:p>
     <w:p>
@@ -1664,11 +3158,33 @@
           <w:rFonts w:ascii="Times New Roman" w:hAnsi="Times New Roman" w:cs="Times New Roman"/>
         </w:rPr>
       </w:pPr>
-      <w:r>
-        <w:rPr>
-          <w:rFonts w:ascii="Times New Roman" w:hAnsi="Times New Roman" w:cs="Times New Roman"/>
-        </w:rPr>
-        <w:t>Bằng chữ: {{CONTRACT_TOTAL_AMOUNT_IN_WORDS}}.</w:t>
+      <w:proofErr w:type="spellStart"/>
+      <w:r>
+        <w:rPr>
+          <w:rFonts w:ascii="Times New Roman" w:hAnsi="Times New Roman" w:cs="Times New Roman"/>
+        </w:rPr>
+        <w:t>Bằng</w:t>
+      </w:r>
+      <w:proofErr w:type="spellEnd"/>
+      <w:r>
+        <w:rPr>
+          <w:rFonts w:ascii="Times New Roman" w:hAnsi="Times New Roman" w:cs="Times New Roman"/>
+        </w:rPr>
+        <w:t xml:space="preserve"> </w:t>
+      </w:r>
+      <w:proofErr w:type="spellStart"/>
+      <w:r>
+        <w:rPr>
+          <w:rFonts w:ascii="Times New Roman" w:hAnsi="Times New Roman" w:cs="Times New Roman"/>
+        </w:rPr>
+        <w:t>chữ</w:t>
+      </w:r>
+      <w:proofErr w:type="spellEnd"/>
+      <w:r>
+        <w:rPr>
+          <w:rFonts w:ascii="Times New Roman" w:hAnsi="Times New Roman" w:cs="Times New Roman"/>
+        </w:rPr>
+        <w:t>: {{CONTRACT_TOTAL_AMOUNT_IN_WORDS}}.</w:t>
       </w:r>
     </w:p>
     <w:p>
@@ -1840,7 +3356,7 @@
 </file>
 
 <file path=word/endnotes.xml><?xml version="1.0" encoding="utf-8"?>
-<w:endnotes xmlns:wpc="http://schemas.microsoft.com/office/word/2010/wordprocessingCanvas" xmlns:cx="http://schemas.microsoft.com/office/drawing/2014/chartex" xmlns:cx1="http://schemas.microsoft.com/office/drawing/2015/9/8/chartex" xmlns:cx2="http://schemas.microsoft.com/office/drawing/2015/10/21/chartex" xmlns:cx3="http://schemas.microsoft.com/office/drawing/2016/5/9/chartex" xmlns:cx4="http://schemas.microsoft.com/office/drawing/2016/5/10/chartex" xmlns:cx5="http://schemas.microsoft.com/office/drawing/2016/5/11/chartex" xmlns:cx6="http://schemas.microsoft.com/office/drawing/2016/5/12/chartex" xmlns:cx7="http://schemas.microsoft.com/office/drawing/2016/5/13/chartex" xmlns:cx8="http://schemas.microsoft.com/office/drawing/2016/5/14/chartex" xmlns:mc="http://schemas.openxmlformats.org/markup-compatibility/2006" xmlns:aink="http://schemas.microsoft.com/office/drawing/2016/ink" xmlns:am3d="http://schemas.microsoft.com/office/drawing/2017/model3d" xmlns:o="urn:schemas-microsoft-com:office:office" xmlns:oel="http://schemas.microsoft.com/office/2019/extlst" xmlns:r="http://schemas.openxmlformats.org/officeDocument/2006/relationships" xmlns:m="http://schemas.openxmlformats.org/officeDocument/2006/math" xmlns:v="urn:schemas-microsoft-com:vml" xmlns:wp14="http://schemas.microsoft.com/office/word/2010/wordprocessingDrawing" xmlns:wp="http://schemas.openxmlformats.org/drawingml/2006/wordprocessingDrawing" xmlns:w10="urn:schemas-microsoft-com:office:word" xmlns:w="http://schemas.openxmlformats.org/wordprocessingml/2006/main" xmlns:w14="http://schemas.microsoft.com/office/word/2010/wordml" xmlns:w15="http://schemas.microsoft.com/office/word/2012/wordml" xmlns:w16cei="http://schemas.microsoft.com/office/word/2026/wordml/cei" xmlns:w16cex="http://schemas.microsoft.com/office/word/2018/wordml/cex" xmlns:w16cid="http://schemas.microsoft.com/office/word/2016/wordml/cid" xmlns:w16="http://schemas.microsoft.com/office/word/2018/wordml" xmlns:w16du="http://schemas.microsoft.com/office/word/2023/wordml/word16du" xmlns:w16sdtdh="http://schemas.microsoft.com/office/word/2020/wordml/sdtdatahash" xmlns:w16sdtfl="http://schemas.microsoft.com/office/word/2024/wordml/sdtformatlock" xmlns:w16se="http://schemas.microsoft.com/office/word/2015/wordml/symex" xmlns:wpg="http://schemas.microsoft.com/office/word/2010/wordprocessingGroup" xmlns:wpi="http://schemas.microsoft.com/office/word/2010/wordprocessingInk" xmlns:wne="http://schemas.microsoft.com/office/word/2006/wordml" xmlns:wps="http://schemas.microsoft.com/office/word/2010/wordprocessingShape" mc:Ignorable="w14 w15 w16se w16cid w16 w16cex w16sdtdh w16sdtfl w16du wp14">
+<w:endnotes xmlns:wpc="http://schemas.microsoft.com/office/word/2010/wordprocessingCanvas" xmlns:cx="http://schemas.microsoft.com/office/drawing/2014/chartex" xmlns:cx1="http://schemas.microsoft.com/office/drawing/2015/9/8/chartex" xmlns:cx2="http://schemas.microsoft.com/office/drawing/2015/10/21/chartex" xmlns:cx3="http://schemas.microsoft.com/office/drawing/2016/5/9/chartex" xmlns:cx4="http://schemas.microsoft.com/office/drawing/2016/5/10/chartex" xmlns:cx5="http://schemas.microsoft.com/office/drawing/2016/5/11/chartex" xmlns:cx6="http://schemas.microsoft.com/office/drawing/2016/5/12/chartex" xmlns:cx7="http://schemas.microsoft.com/office/drawing/2016/5/13/chartex" xmlns:cx8="http://schemas.microsoft.com/office/drawing/2016/5/14/chartex" xmlns:mc="http://schemas.openxmlformats.org/markup-compatibility/2006" xmlns:aink="http://schemas.microsoft.com/office/drawing/2016/ink" xmlns:am3d="http://schemas.microsoft.com/office/drawing/2017/model3d" xmlns:o="urn:schemas-microsoft-com:office:office" xmlns:oel="http://schemas.microsoft.com/office/2019/extlst" xmlns:r="http://schemas.openxmlformats.org/officeDocument/2006/relationships" xmlns:m="http://schemas.openxmlformats.org/officeDocument/2006/math" xmlns:v="urn:schemas-microsoft-com:vml" xmlns:wp14="http://schemas.microsoft.com/office/word/2010/wordprocessingDrawing" xmlns:wp="http://schemas.openxmlformats.org/drawingml/2006/wordprocessingDrawing" xmlns:w10="urn:schemas-microsoft-com:office:word" xmlns:w="http://schemas.openxmlformats.org/wordprocessingml/2006/main" xmlns:w14="http://schemas.microsoft.com/office/word/2010/wordml" xmlns:w15="http://schemas.microsoft.com/office/word/2012/wordml" xmlns:w16cex="http://schemas.microsoft.com/office/word/2018/wordml/cex" xmlns:w16cid="http://schemas.microsoft.com/office/word/2016/wordml/cid" xmlns:w16="http://schemas.microsoft.com/office/word/2018/wordml" xmlns:w16du="http://schemas.microsoft.com/office/word/2023/wordml/word16du" xmlns:w16sdtdh="http://schemas.microsoft.com/office/word/2020/wordml/sdtdatahash" xmlns:w16sdtfl="http://schemas.microsoft.com/office/word/2024/wordml/sdtformatlock" xmlns:w16se="http://schemas.microsoft.com/office/word/2015/wordml/symex" xmlns:wpg="http://schemas.microsoft.com/office/word/2010/wordprocessingGroup" xmlns:wpi="http://schemas.microsoft.com/office/word/2010/wordprocessingInk" xmlns:wne="http://schemas.microsoft.com/office/word/2006/wordml" xmlns:wps="http://schemas.microsoft.com/office/word/2010/wordprocessingShape" mc:Ignorable="w14 w15 w16se w16cid w16 w16cex w16sdtdh w16sdtfl w16du wp14">
   <w:endnote w:type="separator" w:id="-1">
     <w:p>
       <w:pPr>
@@ -1865,7 +3381,7 @@
 </file>
 
 <file path=word/footer1.xml><?xml version="1.0" encoding="utf-8"?>
-<w:ftr xmlns:wpc="http://schemas.microsoft.com/office/word/2010/wordprocessingCanvas" xmlns:cx="http://schemas.microsoft.com/office/drawing/2014/chartex" xmlns:cx1="http://schemas.microsoft.com/office/drawing/2015/9/8/chartex" xmlns:cx2="http://schemas.microsoft.com/office/drawing/2015/10/21/chartex" xmlns:cx3="http://schemas.microsoft.com/office/drawing/2016/5/9/chartex" xmlns:cx4="http://schemas.microsoft.com/office/drawing/2016/5/10/chartex" xmlns:cx5="http://schemas.microsoft.com/office/drawing/2016/5/11/chartex" xmlns:cx6="http://schemas.microsoft.com/office/drawing/2016/5/12/chartex" xmlns:cx7="http://schemas.microsoft.com/office/drawing/2016/5/13/chartex" xmlns:cx8="http://schemas.microsoft.com/office/drawing/2016/5/14/chartex" xmlns:mc="http://schemas.openxmlformats.org/markup-compatibility/2006" xmlns:aink="http://schemas.microsoft.com/office/drawing/2016/ink" xmlns:am3d="http://schemas.microsoft.com/office/drawing/2017/model3d" xmlns:o="urn:schemas-microsoft-com:office:office" xmlns:oel="http://schemas.microsoft.com/office/2019/extlst" xmlns:r="http://schemas.openxmlformats.org/officeDocument/2006/relationships" xmlns:m="http://schemas.openxmlformats.org/officeDocument/2006/math" xmlns:v="urn:schemas-microsoft-com:vml" xmlns:wp14="http://schemas.microsoft.com/office/word/2010/wordprocessingDrawing" xmlns:wp="http://schemas.openxmlformats.org/drawingml/2006/wordprocessingDrawing" xmlns:w10="urn:schemas-microsoft-com:office:word" xmlns:w="http://schemas.openxmlformats.org/wordprocessingml/2006/main" xmlns:w14="http://schemas.microsoft.com/office/word/2010/wordml" xmlns:w15="http://schemas.microsoft.com/office/word/2012/wordml" xmlns:w16cei="http://schemas.microsoft.com/office/word/2026/wordml/cei" xmlns:w16cex="http://schemas.microsoft.com/office/word/2018/wordml/cex" xmlns:w16cid="http://schemas.microsoft.com/office/word/2016/wordml/cid" xmlns:w16="http://schemas.microsoft.com/office/word/2018/wordml" xmlns:w16du="http://schemas.microsoft.com/office/word/2023/wordml/word16du" xmlns:w16sdtdh="http://schemas.microsoft.com/office/word/2020/wordml/sdtdatahash" xmlns:w16sdtfl="http://schemas.microsoft.com/office/word/2024/wordml/sdtformatlock" xmlns:w16se="http://schemas.microsoft.com/office/word/2015/wordml/symex" xmlns:wpg="http://schemas.microsoft.com/office/word/2010/wordprocessingGroup" xmlns:wpi="http://schemas.microsoft.com/office/word/2010/wordprocessingInk" xmlns:wne="http://schemas.microsoft.com/office/word/2006/wordml" xmlns:wps="http://schemas.microsoft.com/office/word/2010/wordprocessingShape" mc:Ignorable="w14 w15 w16se w16cid w16 w16cex w16sdtdh w16sdtfl w16du wp14">
+<w:ftr xmlns:wpc="http://schemas.microsoft.com/office/word/2010/wordprocessingCanvas" xmlns:cx="http://schemas.microsoft.com/office/drawing/2014/chartex" xmlns:cx1="http://schemas.microsoft.com/office/drawing/2015/9/8/chartex" xmlns:cx2="http://schemas.microsoft.com/office/drawing/2015/10/21/chartex" xmlns:cx3="http://schemas.microsoft.com/office/drawing/2016/5/9/chartex" xmlns:cx4="http://schemas.microsoft.com/office/drawing/2016/5/10/chartex" xmlns:cx5="http://schemas.microsoft.com/office/drawing/2016/5/11/chartex" xmlns:cx6="http://schemas.microsoft.com/office/drawing/2016/5/12/chartex" xmlns:cx7="http://schemas.microsoft.com/office/drawing/2016/5/13/chartex" xmlns:cx8="http://schemas.microsoft.com/office/drawing/2016/5/14/chartex" xmlns:mc="http://schemas.openxmlformats.org/markup-compatibility/2006" xmlns:aink="http://schemas.microsoft.com/office/drawing/2016/ink" xmlns:am3d="http://schemas.microsoft.com/office/drawing/2017/model3d" xmlns:o="urn:schemas-microsoft-com:office:office" xmlns:oel="http://schemas.microsoft.com/office/2019/extlst" xmlns:r="http://schemas.openxmlformats.org/officeDocument/2006/relationships" xmlns:m="http://schemas.openxmlformats.org/officeDocument/2006/math" xmlns:v="urn:schemas-microsoft-com:vml" xmlns:wp14="http://schemas.microsoft.com/office/word/2010/wordprocessingDrawing" xmlns:wp="http://schemas.openxmlformats.org/drawingml/2006/wordprocessingDrawing" xmlns:w10="urn:schemas-microsoft-com:office:word" xmlns:w="http://schemas.openxmlformats.org/wordprocessingml/2006/main" xmlns:w14="http://schemas.microsoft.com/office/word/2010/wordml" xmlns:w15="http://schemas.microsoft.com/office/word/2012/wordml" xmlns:w16cex="http://schemas.microsoft.com/office/word/2018/wordml/cex" xmlns:w16cid="http://schemas.microsoft.com/office/word/2016/wordml/cid" xmlns:w16="http://schemas.microsoft.com/office/word/2018/wordml" xmlns:w16du="http://schemas.microsoft.com/office/word/2023/wordml/word16du" xmlns:w16sdtdh="http://schemas.microsoft.com/office/word/2020/wordml/sdtdatahash" xmlns:w16sdtfl="http://schemas.microsoft.com/office/word/2024/wordml/sdtformatlock" xmlns:w16se="http://schemas.microsoft.com/office/word/2015/wordml/symex" xmlns:wpg="http://schemas.microsoft.com/office/word/2010/wordprocessingGroup" xmlns:wpi="http://schemas.microsoft.com/office/word/2010/wordprocessingInk" xmlns:wne="http://schemas.microsoft.com/office/word/2006/wordml" xmlns:wps="http://schemas.microsoft.com/office/word/2010/wordprocessingShape" mc:Ignorable="w14 w15 w16se w16cid w16 w16cex w16sdtdh w16sdtfl w16du wp14">
   <w:p>
     <w:pPr>
       <w:jc w:val="center"/>
@@ -1890,7 +3406,7 @@
 </file>
 
 <file path=word/footnotes.xml><?xml version="1.0" encoding="utf-8"?>
-<w:footnotes xmlns:wpc="http://schemas.microsoft.com/office/word/2010/wordprocessingCanvas" xmlns:cx="http://schemas.microsoft.com/office/drawing/2014/chartex" xmlns:cx1="http://schemas.microsoft.com/office/drawing/2015/9/8/chartex" xmlns:cx2="http://schemas.microsoft.com/office/drawing/2015/10/21/chartex" xmlns:cx3="http://schemas.microsoft.com/office/drawing/2016/5/9/chartex" xmlns:cx4="http://schemas.microsoft.com/office/drawing/2016/5/10/chartex" xmlns:cx5="http://schemas.microsoft.com/office/drawing/2016/5/11/chartex" xmlns:cx6="http://schemas.microsoft.com/office/drawing/2016/5/12/chartex" xmlns:cx7="http://schemas.microsoft.com/office/drawing/2016/5/13/chartex" xmlns:cx8="http://schemas.microsoft.com/office/drawing/2016/5/14/chartex" xmlns:mc="http://schemas.openxmlformats.org/markup-compatibility/2006" xmlns:aink="http://schemas.microsoft.com/office/drawing/2016/ink" xmlns:am3d="http://schemas.microsoft.com/office/drawing/2017/model3d" xmlns:o="urn:schemas-microsoft-com:office:office" xmlns:oel="http://schemas.microsoft.com/office/2019/extlst" xmlns:r="http://schemas.openxmlformats.org/officeDocument/2006/relationships" xmlns:m="http://schemas.openxmlformats.org/officeDocument/2006/math" xmlns:v="urn:schemas-microsoft-com:vml" xmlns:wp14="http://schemas.microsoft.com/office/word/2010/wordprocessingDrawing" xmlns:wp="http://schemas.openxmlformats.org/drawingml/2006/wordprocessingDrawing" xmlns:w10="urn:schemas-microsoft-com:office:word" xmlns:w="http://schemas.openxmlformats.org/wordprocessingml/2006/main" xmlns:w14="http://schemas.microsoft.com/office/word/2010/wordml" xmlns:w15="http://schemas.microsoft.com/office/word/2012/wordml" xmlns:w16cei="http://schemas.microsoft.com/office/word/2026/wordml/cei" xmlns:w16cex="http://schemas.microsoft.com/office/word/2018/wordml/cex" xmlns:w16cid="http://schemas.microsoft.com/office/word/2016/wordml/cid" xmlns:w16="http://schemas.microsoft.com/office/word/2018/wordml" xmlns:w16du="http://schemas.microsoft.com/office/word/2023/wordml/word16du" xmlns:w16sdtdh="http://schemas.microsoft.com/office/word/2020/wordml/sdtdatahash" xmlns:w16sdtfl="http://schemas.microsoft.com/office/word/2024/wordml/sdtformatlock" xmlns:w16se="http://schemas.microsoft.com/office/word/2015/wordml/symex" xmlns:wpg="http://schemas.microsoft.com/office/word/2010/wordprocessingGroup" xmlns:wpi="http://schemas.microsoft.com/office/word/2010/wordprocessingInk" xmlns:wne="http://schemas.microsoft.com/office/word/2006/wordml" xmlns:wps="http://schemas.microsoft.com/office/word/2010/wordprocessingShape" mc:Ignorable="w14 w15 w16se w16cid w16 w16cex w16sdtdh w16sdtfl w16du wp14">
+<w:footnotes xmlns:wpc="http://schemas.microsoft.com/office/word/2010/wordprocessingCanvas" xmlns:cx="http://schemas.microsoft.com/office/drawing/2014/chartex" xmlns:cx1="http://schemas.microsoft.com/office/drawing/2015/9/8/chartex" xmlns:cx2="http://schemas.microsoft.com/office/drawing/2015/10/21/chartex" xmlns:cx3="http://schemas.microsoft.com/office/drawing/2016/5/9/chartex" xmlns:cx4="http://schemas.microsoft.com/office/drawing/2016/5/10/chartex" xmlns:cx5="http://schemas.microsoft.com/office/drawing/2016/5/11/chartex" xmlns:cx6="http://schemas.microsoft.com/office/drawing/2016/5/12/chartex" xmlns:cx7="http://schemas.microsoft.com/office/drawing/2016/5/13/chartex" xmlns:cx8="http://schemas.microsoft.com/office/drawing/2016/5/14/chartex" xmlns:mc="http://schemas.openxmlformats.org/markup-compatibility/2006" xmlns:aink="http://schemas.microsoft.com/office/drawing/2016/ink" xmlns:am3d="http://schemas.microsoft.com/office/drawing/2017/model3d" xmlns:o="urn:schemas-microsoft-com:office:office" xmlns:oel="http://schemas.microsoft.com/office/2019/extlst" xmlns:r="http://schemas.openxmlformats.org/officeDocument/2006/relationships" xmlns:m="http://schemas.openxmlformats.org/officeDocument/2006/math" xmlns:v="urn:schemas-microsoft-com:vml" xmlns:wp14="http://schemas.microsoft.com/office/word/2010/wordprocessingDrawing" xmlns:wp="http://schemas.openxmlformats.org/drawingml/2006/wordprocessingDrawing" xmlns:w10="urn:schemas-microsoft-com:office:word" xmlns:w="http://schemas.openxmlformats.org/wordprocessingml/2006/main" xmlns:w14="http://schemas.microsoft.com/office/word/2010/wordml" xmlns:w15="http://schemas.microsoft.com/office/word/2012/wordml" xmlns:w16cex="http://schemas.microsoft.com/office/word/2018/wordml/cex" xmlns:w16cid="http://schemas.microsoft.com/office/word/2016/wordml/cid" xmlns:w16="http://schemas.microsoft.com/office/word/2018/wordml" xmlns:w16du="http://schemas.microsoft.com/office/word/2023/wordml/word16du" xmlns:w16sdtdh="http://schemas.microsoft.com/office/word/2020/wordml/sdtdatahash" xmlns:w16sdtfl="http://schemas.microsoft.com/office/word/2024/wordml/sdtformatlock" xmlns:w16se="http://schemas.microsoft.com/office/word/2015/wordml/symex" xmlns:wpg="http://schemas.microsoft.com/office/word/2010/wordprocessingGroup" xmlns:wpi="http://schemas.microsoft.com/office/word/2010/wordprocessingInk" xmlns:wne="http://schemas.microsoft.com/office/word/2006/wordml" xmlns:wps="http://schemas.microsoft.com/office/word/2010/wordprocessingShape" mc:Ignorable="w14 w15 w16se w16cid w16 w16cex w16sdtdh w16sdtfl w16du wp14">
   <w:footnote w:type="separator" w:id="-1">
     <w:p>
       <w:pPr>
@@ -1915,7 +3431,7 @@
 </file>
 
 <file path=word/numbering.xml><?xml version="1.0" encoding="utf-8"?>
-<w:numbering xmlns:wpc="http://schemas.microsoft.com/office/word/2010/wordprocessingCanvas" xmlns:cx="http://schemas.microsoft.com/office/drawing/2014/chartex" xmlns:cx1="http://schemas.microsoft.com/office/drawing/2015/9/8/chartex" xmlns:cx2="http://schemas.microsoft.com/office/drawing/2015/10/21/chartex" xmlns:cx3="http://schemas.microsoft.com/office/drawing/2016/5/9/chartex" xmlns:cx4="http://schemas.microsoft.com/office/drawing/2016/5/10/chartex" xmlns:cx5="http://schemas.microsoft.com/office/drawing/2016/5/11/chartex" xmlns:cx6="http://schemas.microsoft.com/office/drawing/2016/5/12/chartex" xmlns:cx7="http://schemas.microsoft.com/office/drawing/2016/5/13/chartex" xmlns:cx8="http://schemas.microsoft.com/office/drawing/2016/5/14/chartex" xmlns:mc="http://schemas.openxmlformats.org/markup-compatibility/2006" xmlns:aink="http://schemas.microsoft.com/office/drawing/2016/ink" xmlns:am3d="http://schemas.microsoft.com/office/drawing/2017/model3d" xmlns:o="urn:schemas-microsoft-com:office:office" xmlns:oel="http://schemas.microsoft.com/office/2019/extlst" xmlns:r="http://schemas.openxmlformats.org/officeDocument/2006/relationships" xmlns:m="http://schemas.openxmlformats.org/officeDocument/2006/math" xmlns:v="urn:schemas-microsoft-com:vml" xmlns:wp14="http://schemas.microsoft.com/office/word/2010/wordprocessingDrawing" xmlns:wp="http://schemas.openxmlformats.org/drawingml/2006/wordprocessingDrawing" xmlns:w10="urn:schemas-microsoft-com:office:word" xmlns:w="http://schemas.openxmlformats.org/wordprocessingml/2006/main" xmlns:w14="http://schemas.microsoft.com/office/word/2010/wordml" xmlns:w15="http://schemas.microsoft.com/office/word/2012/wordml" xmlns:w16cei="http://schemas.microsoft.com/office/word/2026/wordml/cei" xmlns:w16cex="http://schemas.microsoft.com/office/word/2018/wordml/cex" xmlns:w16cid="http://schemas.microsoft.com/office/word/2016/wordml/cid" xmlns:w16="http://schemas.microsoft.com/office/word/2018/wordml" xmlns:w16du="http://schemas.microsoft.com/office/word/2023/wordml/word16du" xmlns:w16sdtdh="http://schemas.microsoft.com/office/word/2020/wordml/sdtdatahash" xmlns:w16sdtfl="http://schemas.microsoft.com/office/word/2024/wordml/sdtformatlock" xmlns:w16se="http://schemas.microsoft.com/office/word/2015/wordml/symex" xmlns:wpg="http://schemas.microsoft.com/office/word/2010/wordprocessingGroup" xmlns:wpi="http://schemas.microsoft.com/office/word/2010/wordprocessingInk" xmlns:wne="http://schemas.microsoft.com/office/word/2006/wordml" xmlns:wps="http://schemas.microsoft.com/office/word/2010/wordprocessingShape" mc:Ignorable="w14 w15 w16se w16cid w16 w16cex w16sdtdh w16sdtfl w16du wp14">
+<w:numbering xmlns:wpc="http://schemas.microsoft.com/office/word/2010/wordprocessingCanvas" xmlns:cx="http://schemas.microsoft.com/office/drawing/2014/chartex" xmlns:cx1="http://schemas.microsoft.com/office/drawing/2015/9/8/chartex" xmlns:cx2="http://schemas.microsoft.com/office/drawing/2015/10/21/chartex" xmlns:cx3="http://schemas.microsoft.com/office/drawing/2016/5/9/chartex" xmlns:cx4="http://schemas.microsoft.com/office/drawing/2016/5/10/chartex" xmlns:cx5="http://schemas.microsoft.com/office/drawing/2016/5/11/chartex" xmlns:cx6="http://schemas.microsoft.com/office/drawing/2016/5/12/chartex" xmlns:cx7="http://schemas.microsoft.com/office/drawing/2016/5/13/chartex" xmlns:cx8="http://schemas.microsoft.com/office/drawing/2016/5/14/chartex" xmlns:mc="http://schemas.openxmlformats.org/markup-compatibility/2006" xmlns:aink="http://schemas.microsoft.com/office/drawing/2016/ink" xmlns:am3d="http://schemas.microsoft.com/office/drawing/2017/model3d" xmlns:o="urn:schemas-microsoft-com:office:office" xmlns:oel="http://schemas.microsoft.com/office/2019/extlst" xmlns:r="http://schemas.openxmlformats.org/officeDocument/2006/relationships" xmlns:m="http://schemas.openxmlformats.org/officeDocument/2006/math" xmlns:v="urn:schemas-microsoft-com:vml" xmlns:wp14="http://schemas.microsoft.com/office/word/2010/wordprocessingDrawing" xmlns:wp="http://schemas.openxmlformats.org/drawingml/2006/wordprocessingDrawing" xmlns:w10="urn:schemas-microsoft-com:office:word" xmlns:w="http://schemas.openxmlformats.org/wordprocessingml/2006/main" xmlns:w14="http://schemas.microsoft.com/office/word/2010/wordml" xmlns:w15="http://schemas.microsoft.com/office/word/2012/wordml" xmlns:w16cex="http://schemas.microsoft.com/office/word/2018/wordml/cex" xmlns:w16cid="http://schemas.microsoft.com/office/word/2016/wordml/cid" xmlns:w16="http://schemas.microsoft.com/office/word/2018/wordml" xmlns:w16du="http://schemas.microsoft.com/office/word/2023/wordml/word16du" xmlns:w16sdtdh="http://schemas.microsoft.com/office/word/2020/wordml/sdtdatahash" xmlns:w16sdtfl="http://schemas.microsoft.com/office/word/2024/wordml/sdtformatlock" xmlns:w16se="http://schemas.microsoft.com/office/word/2015/wordml/symex" xmlns:wpg="http://schemas.microsoft.com/office/word/2010/wordprocessingGroup" xmlns:wpi="http://schemas.microsoft.com/office/word/2010/wordprocessingInk" xmlns:wne="http://schemas.microsoft.com/office/word/2006/wordml" xmlns:wps="http://schemas.microsoft.com/office/word/2010/wordprocessingShape" mc:Ignorable="w14 w15 w16se w16cid w16 w16cex w16sdtdh w16sdtfl w16du wp14">
   <w:abstractNum w:abstractNumId="0" w15:restartNumberingAfterBreak="0">
     <w:nsid w:val="00294612"/>
     <w:multiLevelType w:val="multilevel"/>

</xml_diff>

<commit_message>
feat: implement tenant legal profile and customer management functionality with updated database schema and preview rendering services
</commit_message>
<xml_diff>
--- a/Source/Artifacts/ContractTemplates/Mẫu Contract Placeholder - đã gắn placeholder.docx
+++ b/Source/Artifacts/ContractTemplates/Mẫu Contract Placeholder - đã gắn placeholder.docx
@@ -111,7 +111,6 @@
           </mc:Fallback>
         </mc:AlternateContent>
       </w:r>
-      <w:proofErr w:type="spellStart"/>
       <w:r>
         <w:rPr>
           <w:rFonts w:ascii="Times New Roman" w:hAnsi="Times New Roman" w:cs="Times New Roman"/>
@@ -120,75 +119,8 @@
           <w:sz w:val="24"/>
           <w:szCs w:val="24"/>
         </w:rPr>
-        <w:t>Độc</w:t>
+        <w:t>Độc Lập - Tự Do - Hạnh</w:t>
       </w:r>
-      <w:proofErr w:type="spellEnd"/>
-      <w:r>
-        <w:rPr>
-          <w:rFonts w:ascii="Times New Roman" w:hAnsi="Times New Roman" w:cs="Times New Roman"/>
-          <w:b/>
-          <w:bCs/>
-          <w:sz w:val="24"/>
-          <w:szCs w:val="24"/>
-        </w:rPr>
-        <w:t xml:space="preserve"> </w:t>
-      </w:r>
-      <w:proofErr w:type="spellStart"/>
-      <w:r>
-        <w:rPr>
-          <w:rFonts w:ascii="Times New Roman" w:hAnsi="Times New Roman" w:cs="Times New Roman"/>
-          <w:b/>
-          <w:bCs/>
-          <w:sz w:val="24"/>
-          <w:szCs w:val="24"/>
-        </w:rPr>
-        <w:t>Lập</w:t>
-      </w:r>
-      <w:proofErr w:type="spellEnd"/>
-      <w:r>
-        <w:rPr>
-          <w:rFonts w:ascii="Times New Roman" w:hAnsi="Times New Roman" w:cs="Times New Roman"/>
-          <w:b/>
-          <w:bCs/>
-          <w:sz w:val="24"/>
-          <w:szCs w:val="24"/>
-        </w:rPr>
-        <w:t xml:space="preserve"> - </w:t>
-      </w:r>
-      <w:proofErr w:type="spellStart"/>
-      <w:r>
-        <w:rPr>
-          <w:rFonts w:ascii="Times New Roman" w:hAnsi="Times New Roman" w:cs="Times New Roman"/>
-          <w:b/>
-          <w:bCs/>
-          <w:sz w:val="24"/>
-          <w:szCs w:val="24"/>
-        </w:rPr>
-        <w:t>Tự</w:t>
-      </w:r>
-      <w:proofErr w:type="spellEnd"/>
-      <w:r>
-        <w:rPr>
-          <w:rFonts w:ascii="Times New Roman" w:hAnsi="Times New Roman" w:cs="Times New Roman"/>
-          <w:b/>
-          <w:bCs/>
-          <w:sz w:val="24"/>
-          <w:szCs w:val="24"/>
-        </w:rPr>
-        <w:t xml:space="preserve"> Do - </w:t>
-      </w:r>
-      <w:proofErr w:type="spellStart"/>
-      <w:r>
-        <w:rPr>
-          <w:rFonts w:ascii="Times New Roman" w:hAnsi="Times New Roman" w:cs="Times New Roman"/>
-          <w:b/>
-          <w:bCs/>
-          <w:sz w:val="24"/>
-          <w:szCs w:val="24"/>
-        </w:rPr>
-        <w:t>Hạnh</w:t>
-      </w:r>
-      <w:proofErr w:type="spellEnd"/>
       <w:r>
         <w:rPr>
           <w:rFonts w:ascii="Times New Roman" w:hAnsi="Times New Roman" w:cs="Times New Roman"/>
@@ -246,7 +178,6 @@
           <w:szCs w:val="24"/>
         </w:rPr>
       </w:pPr>
-      <w:proofErr w:type="spellStart"/>
       <w:proofErr w:type="gramStart"/>
       <w:r>
         <w:rPr>
@@ -255,17 +186,7 @@
           <w:sz w:val="24"/>
           <w:szCs w:val="24"/>
         </w:rPr>
-        <w:t>Số</w:t>
-      </w:r>
-      <w:proofErr w:type="spellEnd"/>
-      <w:r>
-        <w:rPr>
-          <w:rFonts w:ascii="Times New Roman" w:hAnsi="Times New Roman" w:cs="Times New Roman"/>
-          <w:iCs/>
-          <w:sz w:val="24"/>
-          <w:szCs w:val="24"/>
-        </w:rPr>
-        <w:t>: {{</w:t>
+        <w:t>Số: {{</w:t>
       </w:r>
       <w:proofErr w:type="gramEnd"/>
       <w:r>
@@ -290,7 +211,6 @@
           <w:szCs w:val="24"/>
         </w:rPr>
       </w:pPr>
-      <w:proofErr w:type="spellStart"/>
       <w:r>
         <w:rPr>
           <w:rFonts w:ascii="Times New Roman" w:hAnsi="Times New Roman" w:cs="Times New Roman"/>
@@ -299,106 +219,7 @@
           <w:sz w:val="24"/>
           <w:szCs w:val="24"/>
         </w:rPr>
-        <w:t>Hôm</w:t>
-      </w:r>
-      <w:proofErr w:type="spellEnd"/>
-      <w:r>
-        <w:rPr>
-          <w:rFonts w:ascii="Times New Roman" w:hAnsi="Times New Roman" w:cs="Times New Roman"/>
-          <w:i/>
-          <w:iCs/>
-          <w:sz w:val="24"/>
-          <w:szCs w:val="24"/>
-        </w:rPr>
-        <w:t xml:space="preserve"> nay, {{CONTRACT_DATE}}, </w:t>
-      </w:r>
-      <w:proofErr w:type="spellStart"/>
-      <w:r>
-        <w:rPr>
-          <w:rFonts w:ascii="Times New Roman" w:hAnsi="Times New Roman" w:cs="Times New Roman"/>
-          <w:i/>
-          <w:iCs/>
-          <w:sz w:val="24"/>
-          <w:szCs w:val="24"/>
-        </w:rPr>
-        <w:t>chúng</w:t>
-      </w:r>
-      <w:proofErr w:type="spellEnd"/>
-      <w:r>
-        <w:rPr>
-          <w:rFonts w:ascii="Times New Roman" w:hAnsi="Times New Roman" w:cs="Times New Roman"/>
-          <w:i/>
-          <w:iCs/>
-          <w:sz w:val="24"/>
-          <w:szCs w:val="24"/>
-        </w:rPr>
-        <w:t xml:space="preserve"> </w:t>
-      </w:r>
-      <w:proofErr w:type="spellStart"/>
-      <w:r>
-        <w:rPr>
-          <w:rFonts w:ascii="Times New Roman" w:hAnsi="Times New Roman" w:cs="Times New Roman"/>
-          <w:i/>
-          <w:iCs/>
-          <w:sz w:val="24"/>
-          <w:szCs w:val="24"/>
-        </w:rPr>
-        <w:t>tôi</w:t>
-      </w:r>
-      <w:proofErr w:type="spellEnd"/>
-      <w:r>
-        <w:rPr>
-          <w:rFonts w:ascii="Times New Roman" w:hAnsi="Times New Roman" w:cs="Times New Roman"/>
-          <w:i/>
-          <w:iCs/>
-          <w:sz w:val="24"/>
-          <w:szCs w:val="24"/>
-        </w:rPr>
-        <w:t xml:space="preserve"> </w:t>
-      </w:r>
-      <w:proofErr w:type="spellStart"/>
-      <w:r>
-        <w:rPr>
-          <w:rFonts w:ascii="Times New Roman" w:hAnsi="Times New Roman" w:cs="Times New Roman"/>
-          <w:i/>
-          <w:iCs/>
-          <w:sz w:val="24"/>
-          <w:szCs w:val="24"/>
-        </w:rPr>
-        <w:t>gồm</w:t>
-      </w:r>
-      <w:proofErr w:type="spellEnd"/>
-      <w:r>
-        <w:rPr>
-          <w:rFonts w:ascii="Times New Roman" w:hAnsi="Times New Roman" w:cs="Times New Roman"/>
-          <w:i/>
-          <w:iCs/>
-          <w:sz w:val="24"/>
-          <w:szCs w:val="24"/>
-        </w:rPr>
-        <w:t xml:space="preserve"> </w:t>
-      </w:r>
-      <w:proofErr w:type="spellStart"/>
-      <w:r>
-        <w:rPr>
-          <w:rFonts w:ascii="Times New Roman" w:hAnsi="Times New Roman" w:cs="Times New Roman"/>
-          <w:i/>
-          <w:iCs/>
-          <w:sz w:val="24"/>
-          <w:szCs w:val="24"/>
-        </w:rPr>
-        <w:t>có</w:t>
-      </w:r>
-      <w:proofErr w:type="spellEnd"/>
-      <w:r>
-        <w:rPr>
-          <w:rFonts w:ascii="Times New Roman" w:hAnsi="Times New Roman" w:cs="Times New Roman"/>
-          <w:i/>
-          <w:iCs/>
-          <w:sz w:val="24"/>
-          <w:szCs w:val="24"/>
-        </w:rPr>
-        <w:t>:</w:t>
+        <w:t>Hôm nay, {{CONTRACT_DATE}}, chúng tôi gồm có:</w:t>
       </w:r>
     </w:p>
     <w:p>
@@ -437,6 +258,7 @@
           <w:insideH w:val="none" w:sz="0" w:space="0" w:color="auto"/>
           <w:insideV w:val="none" w:sz="0" w:space="0" w:color="auto"/>
         </w:tblBorders>
+        <w:tblLayout w:type="fixed"/>
         <w:tblLook w:val="04A0" w:firstRow="1" w:lastRow="0" w:firstColumn="1" w:lastColumn="0" w:noHBand="0" w:noVBand="1"/>
       </w:tblPr>
       <w:tblGrid>
@@ -459,44 +281,23 @@
                 <w:szCs w:val="24"/>
               </w:rPr>
             </w:pPr>
-            <w:proofErr w:type="spellStart"/>
-            <w:r>
-              <w:rPr>
-                <w:rFonts w:ascii="Times New Roman" w:hAnsi="Times New Roman" w:cs="Times New Roman"/>
-                <w:sz w:val="24"/>
-                <w:szCs w:val="24"/>
-              </w:rPr>
-              <w:t>Người</w:t>
-            </w:r>
-            <w:proofErr w:type="spellEnd"/>
-            <w:r>
-              <w:rPr>
-                <w:rFonts w:ascii="Times New Roman" w:hAnsi="Times New Roman" w:cs="Times New Roman"/>
+            <w:r>
+              <w:rPr>
+                <w:rFonts w:ascii="Times New Roman" w:hAnsi="Times New Roman" w:cs="Times New Roman"/>
+                <w:sz w:val="24"/>
+                <w:szCs w:val="24"/>
+              </w:rPr>
+              <w:t>Người đại</w:t>
+            </w:r>
+            <w:r>
+              <w:rPr>
+                <w:rFonts w:ascii="Times New Roman" w:hAnsi="Times New Roman" w:cs="Times New Roman"/>
+                <w:spacing w:val="-4"/>
                 <w:sz w:val="24"/>
                 <w:szCs w:val="24"/>
               </w:rPr>
               <w:t xml:space="preserve"> </w:t>
             </w:r>
-            <w:proofErr w:type="spellStart"/>
-            <w:r>
-              <w:rPr>
-                <w:rFonts w:ascii="Times New Roman" w:hAnsi="Times New Roman" w:cs="Times New Roman"/>
-                <w:sz w:val="24"/>
-                <w:szCs w:val="24"/>
-              </w:rPr>
-              <w:t>đại</w:t>
-            </w:r>
-            <w:proofErr w:type="spellEnd"/>
-            <w:r>
-              <w:rPr>
-                <w:rFonts w:ascii="Times New Roman" w:hAnsi="Times New Roman" w:cs="Times New Roman"/>
-                <w:spacing w:val="-4"/>
-                <w:sz w:val="24"/>
-                <w:szCs w:val="24"/>
-              </w:rPr>
-              <w:t xml:space="preserve"> </w:t>
-            </w:r>
-            <w:proofErr w:type="spellStart"/>
             <w:r>
               <w:rPr>
                 <w:rFonts w:ascii="Times New Roman" w:hAnsi="Times New Roman" w:cs="Times New Roman"/>
@@ -505,7 +306,6 @@
               </w:rPr>
               <w:t>diện</w:t>
             </w:r>
-            <w:proofErr w:type="spellEnd"/>
           </w:p>
         </w:tc>
         <w:tc>
@@ -568,41 +368,37 @@
                 <w:szCs w:val="24"/>
               </w:rPr>
             </w:pPr>
-            <w:proofErr w:type="spellStart"/>
-            <w:r>
-              <w:rPr>
-                <w:rFonts w:ascii="Times New Roman" w:hAnsi="Times New Roman" w:cs="Times New Roman"/>
-                <w:sz w:val="24"/>
-                <w:szCs w:val="24"/>
-              </w:rPr>
-              <w:t>Chức</w:t>
-            </w:r>
-            <w:proofErr w:type="spellEnd"/>
-            <w:r>
-              <w:rPr>
-                <w:rFonts w:ascii="Times New Roman" w:hAnsi="Times New Roman" w:cs="Times New Roman"/>
-                <w:sz w:val="24"/>
-                <w:szCs w:val="24"/>
-              </w:rPr>
-              <w:t xml:space="preserve"> </w:t>
-            </w:r>
-            <w:proofErr w:type="spellStart"/>
-            <w:r>
-              <w:rPr>
-                <w:rFonts w:ascii="Times New Roman" w:hAnsi="Times New Roman" w:cs="Times New Roman"/>
-                <w:sz w:val="24"/>
-                <w:szCs w:val="24"/>
-              </w:rPr>
-              <w:t>vụ</w:t>
-            </w:r>
-            <w:proofErr w:type="spellEnd"/>
-            <w:r>
-              <w:rPr>
-                <w:rFonts w:ascii="Times New Roman" w:hAnsi="Times New Roman" w:cs="Times New Roman"/>
-                <w:sz w:val="24"/>
-                <w:szCs w:val="24"/>
-              </w:rPr>
-              <w:t>: ................................</w:t>
+            <w:r>
+              <w:rPr>
+                <w:rFonts w:ascii="Times New Roman" w:hAnsi="Times New Roman" w:cs="Times New Roman"/>
+                <w:sz w:val="24"/>
+                <w:szCs w:val="24"/>
+              </w:rPr>
+              <w:t>Chức vụ:</w:t>
+            </w:r>
+            <w:r>
+              <w:rPr>
+                <w:rFonts w:ascii="Times New Roman" w:hAnsi="Times New Roman" w:cs="Times New Roman"/>
+                <w:sz w:val="24"/>
+                <w:szCs w:val="24"/>
+              </w:rPr>
+              <w:t xml:space="preserve"> {{</w:t>
+            </w:r>
+            <w:r>
+              <w:rPr>
+                <w:rFonts w:ascii="Times New Roman" w:hAnsi="Times New Roman" w:cs="Times New Roman"/>
+                <w:sz w:val="24"/>
+                <w:szCs w:val="24"/>
+              </w:rPr>
+              <w:t>CUSTOMER_REPRESENTATIVE_TITLE</w:t>
+            </w:r>
+            <w:r>
+              <w:rPr>
+                <w:rFonts w:ascii="Times New Roman" w:hAnsi="Times New Roman" w:cs="Times New Roman"/>
+                <w:sz w:val="24"/>
+                <w:szCs w:val="24"/>
+              </w:rPr>
+              <w:t>}}</w:t>
             </w:r>
           </w:p>
         </w:tc>
@@ -621,7 +417,6 @@
                 <w:szCs w:val="24"/>
               </w:rPr>
             </w:pPr>
-            <w:proofErr w:type="spellStart"/>
             <w:r>
               <w:rPr>
                 <w:rFonts w:ascii="Times New Roman" w:hAnsi="Times New Roman" w:cs="Times New Roman"/>
@@ -630,7 +425,6 @@
               </w:rPr>
               <w:t>Địa</w:t>
             </w:r>
-            <w:proofErr w:type="spellEnd"/>
             <w:r>
               <w:rPr>
                 <w:rFonts w:ascii="Times New Roman" w:hAnsi="Times New Roman" w:cs="Times New Roman"/>
@@ -640,7 +434,6 @@
               </w:rPr>
               <w:t xml:space="preserve"> </w:t>
             </w:r>
-            <w:proofErr w:type="spellStart"/>
             <w:r>
               <w:rPr>
                 <w:rFonts w:ascii="Times New Roman" w:hAnsi="Times New Roman" w:cs="Times New Roman"/>
@@ -649,7 +442,6 @@
               </w:rPr>
               <w:t>chỉ</w:t>
             </w:r>
-            <w:proofErr w:type="spellEnd"/>
           </w:p>
         </w:tc>
         <w:tc>
@@ -677,7 +469,8 @@
         </w:tc>
         <w:tc>
           <w:tcPr>
-            <w:tcW w:w="3421" w:type="dxa"/>
+            <w:tcW w:w="7145" w:type="dxa"/>
+            <w:gridSpan w:val="2"/>
           </w:tcPr>
           <w:p>
             <w:pPr>
@@ -696,21 +489,6 @@
               </w:rPr>
               <w:t>{{CUSTOMER_ADDRESS}}</w:t>
             </w:r>
-          </w:p>
-        </w:tc>
-        <w:tc>
-          <w:tcPr>
-            <w:tcW w:w="3724" w:type="dxa"/>
-          </w:tcPr>
-          <w:p>
-            <w:pPr>
-              <w:spacing w:after="0" w:line="288" w:lineRule="auto"/>
-              <w:rPr>
-                <w:rFonts w:ascii="Times New Roman" w:hAnsi="Times New Roman" w:cs="Times New Roman"/>
-                <w:sz w:val="24"/>
-                <w:szCs w:val="24"/>
-              </w:rPr>
-            </w:pPr>
           </w:p>
         </w:tc>
       </w:tr>
@@ -728,7 +506,6 @@
                 <w:szCs w:val="24"/>
               </w:rPr>
             </w:pPr>
-            <w:proofErr w:type="spellStart"/>
             <w:r>
               <w:rPr>
                 <w:rFonts w:ascii="Times New Roman" w:hAnsi="Times New Roman" w:cs="Times New Roman"/>
@@ -737,7 +514,6 @@
               </w:rPr>
               <w:t>Điện</w:t>
             </w:r>
-            <w:proofErr w:type="spellEnd"/>
             <w:r>
               <w:rPr>
                 <w:rFonts w:ascii="Times New Roman" w:hAnsi="Times New Roman" w:cs="Times New Roman"/>
@@ -747,7 +523,6 @@
               </w:rPr>
               <w:t xml:space="preserve"> </w:t>
             </w:r>
-            <w:proofErr w:type="spellStart"/>
             <w:r>
               <w:rPr>
                 <w:rFonts w:ascii="Times New Roman" w:hAnsi="Times New Roman" w:cs="Times New Roman"/>
@@ -756,7 +531,6 @@
               </w:rPr>
               <w:t>thoại</w:t>
             </w:r>
-            <w:proofErr w:type="spellEnd"/>
           </w:p>
         </w:tc>
         <w:tc>
@@ -833,6 +607,9 @@
         </w:tc>
       </w:tr>
       <w:tr>
+        <w:trPr>
+          <w:trHeight w:val="276"/>
+        </w:trPr>
         <w:tc>
           <w:tcPr>
             <w:tcW w:w="2093" w:type="dxa"/>
@@ -846,125 +623,13 @@
                 <w:szCs w:val="24"/>
               </w:rPr>
             </w:pPr>
-            <w:proofErr w:type="spellStart"/>
-            <w:r>
-              <w:rPr>
-                <w:rFonts w:ascii="Times New Roman" w:hAnsi="Times New Roman" w:cs="Times New Roman"/>
-                <w:sz w:val="24"/>
-                <w:szCs w:val="24"/>
-              </w:rPr>
-              <w:t>Mã</w:t>
-            </w:r>
-            <w:proofErr w:type="spellEnd"/>
-            <w:r>
-              <w:rPr>
-                <w:rFonts w:ascii="Times New Roman" w:hAnsi="Times New Roman" w:cs="Times New Roman"/>
-                <w:sz w:val="24"/>
-                <w:szCs w:val="24"/>
-              </w:rPr>
-              <w:t xml:space="preserve"> </w:t>
-            </w:r>
-            <w:proofErr w:type="spellStart"/>
-            <w:r>
-              <w:rPr>
-                <w:rFonts w:ascii="Times New Roman" w:hAnsi="Times New Roman" w:cs="Times New Roman"/>
-                <w:sz w:val="24"/>
-                <w:szCs w:val="24"/>
-              </w:rPr>
-              <w:t>khách</w:t>
-            </w:r>
-            <w:proofErr w:type="spellEnd"/>
-            <w:r>
-              <w:rPr>
-                <w:rFonts w:ascii="Times New Roman" w:hAnsi="Times New Roman" w:cs="Times New Roman"/>
-                <w:sz w:val="24"/>
-                <w:szCs w:val="24"/>
-              </w:rPr>
-              <w:t xml:space="preserve"> </w:t>
-            </w:r>
-            <w:proofErr w:type="spellStart"/>
-            <w:r>
-              <w:rPr>
-                <w:rFonts w:ascii="Times New Roman" w:hAnsi="Times New Roman" w:cs="Times New Roman"/>
-                <w:sz w:val="24"/>
-                <w:szCs w:val="24"/>
-              </w:rPr>
-              <w:t>hàng</w:t>
-            </w:r>
-            <w:proofErr w:type="spellEnd"/>
-          </w:p>
-          <w:p>
-            <w:pPr>
-              <w:spacing w:after="0" w:line="288" w:lineRule="auto"/>
-              <w:rPr>
-                <w:rFonts w:ascii="Times New Roman" w:hAnsi="Times New Roman" w:cs="Times New Roman"/>
-                <w:sz w:val="24"/>
-                <w:szCs w:val="24"/>
-              </w:rPr>
-            </w:pPr>
-            <w:proofErr w:type="spellStart"/>
-            <w:r>
-              <w:rPr>
-                <w:rFonts w:ascii="Times New Roman" w:hAnsi="Times New Roman" w:cs="Times New Roman"/>
-                <w:sz w:val="24"/>
-                <w:szCs w:val="24"/>
-              </w:rPr>
-              <w:t>Mã</w:t>
-            </w:r>
-            <w:proofErr w:type="spellEnd"/>
-            <w:r>
-              <w:rPr>
-                <w:rFonts w:ascii="Times New Roman" w:hAnsi="Times New Roman" w:cs="Times New Roman"/>
-                <w:sz w:val="24"/>
-                <w:szCs w:val="24"/>
-              </w:rPr>
-              <w:t xml:space="preserve"> </w:t>
-            </w:r>
-            <w:proofErr w:type="spellStart"/>
-            <w:r>
-              <w:rPr>
-                <w:rFonts w:ascii="Times New Roman" w:hAnsi="Times New Roman" w:cs="Times New Roman"/>
-                <w:sz w:val="24"/>
-                <w:szCs w:val="24"/>
-              </w:rPr>
-              <w:t>số</w:t>
-            </w:r>
-            <w:proofErr w:type="spellEnd"/>
-            <w:r>
-              <w:rPr>
-                <w:rFonts w:ascii="Times New Roman" w:hAnsi="Times New Roman" w:cs="Times New Roman"/>
-                <w:sz w:val="24"/>
-                <w:szCs w:val="24"/>
-              </w:rPr>
-              <w:t xml:space="preserve"> </w:t>
-            </w:r>
-            <w:proofErr w:type="spellStart"/>
-            <w:r>
-              <w:rPr>
-                <w:rFonts w:ascii="Times New Roman" w:hAnsi="Times New Roman" w:cs="Times New Roman"/>
-                <w:sz w:val="24"/>
-                <w:szCs w:val="24"/>
-              </w:rPr>
-              <w:t>thuế</w:t>
-            </w:r>
-            <w:proofErr w:type="spellEnd"/>
-          </w:p>
-          <w:p>
-            <w:pPr>
-              <w:spacing w:after="0" w:line="288" w:lineRule="auto"/>
-              <w:rPr>
-                <w:rFonts w:ascii="Times New Roman" w:hAnsi="Times New Roman" w:cs="Times New Roman"/>
-                <w:sz w:val="24"/>
-                <w:szCs w:val="24"/>
-              </w:rPr>
-            </w:pPr>
-            <w:r>
-              <w:rPr>
-                <w:rFonts w:ascii="Times New Roman" w:hAnsi="Times New Roman" w:cs="Times New Roman"/>
-                <w:sz w:val="24"/>
-                <w:szCs w:val="24"/>
-              </w:rPr>
-              <w:t>Email</w:t>
+            <w:r>
+              <w:rPr>
+                <w:rFonts w:ascii="Times New Roman" w:hAnsi="Times New Roman" w:cs="Times New Roman"/>
+                <w:sz w:val="24"/>
+                <w:szCs w:val="24"/>
+              </w:rPr>
+              <w:t>Mã khách hàng</w:t>
             </w:r>
           </w:p>
         </w:tc>
@@ -990,46 +655,11 @@
               <w:t>:</w:t>
             </w:r>
           </w:p>
-          <w:p>
-            <w:pPr>
-              <w:spacing w:after="0" w:line="288" w:lineRule="auto"/>
-              <w:rPr>
-                <w:rFonts w:ascii="Times New Roman" w:hAnsi="Times New Roman" w:cs="Times New Roman"/>
-                <w:sz w:val="24"/>
-                <w:szCs w:val="24"/>
-              </w:rPr>
-            </w:pPr>
-            <w:r>
-              <w:rPr>
-                <w:rFonts w:ascii="Times New Roman" w:hAnsi="Times New Roman" w:cs="Times New Roman"/>
-                <w:sz w:val="24"/>
-                <w:szCs w:val="24"/>
-              </w:rPr>
-              <w:t>:</w:t>
-            </w:r>
-          </w:p>
-          <w:p>
-            <w:pPr>
-              <w:spacing w:after="0" w:line="288" w:lineRule="auto"/>
-              <w:rPr>
-                <w:rFonts w:ascii="Times New Roman" w:hAnsi="Times New Roman" w:cs="Times New Roman"/>
-                <w:sz w:val="24"/>
-                <w:szCs w:val="24"/>
-              </w:rPr>
-            </w:pPr>
-            <w:r>
-              <w:rPr>
-                <w:rFonts w:ascii="Times New Roman" w:hAnsi="Times New Roman" w:cs="Times New Roman"/>
-                <w:sz w:val="24"/>
-                <w:szCs w:val="24"/>
-              </w:rPr>
-              <w:t>:</w:t>
-            </w:r>
-          </w:p>
         </w:tc>
         <w:tc>
           <w:tcPr>
-            <w:tcW w:w="3421" w:type="dxa"/>
+            <w:tcW w:w="7145" w:type="dxa"/>
+            <w:gridSpan w:val="2"/>
           </w:tcPr>
           <w:p>
             <w:pPr>
@@ -1049,297 +679,12 @@
               <w:t>{{CUSTOMER_CODE}}</w:t>
             </w:r>
           </w:p>
-          <w:p>
-            <w:pPr>
-              <w:spacing w:after="0" w:line="288" w:lineRule="auto"/>
-              <w:rPr>
-                <w:rFonts w:ascii="Times New Roman" w:hAnsi="Times New Roman" w:cs="Times New Roman"/>
-                <w:sz w:val="24"/>
-                <w:szCs w:val="24"/>
-              </w:rPr>
-            </w:pPr>
-            <w:r>
-              <w:rPr>
-                <w:rFonts w:ascii="Times New Roman" w:hAnsi="Times New Roman" w:cs="Times New Roman"/>
-                <w:sz w:val="24"/>
-                <w:szCs w:val="24"/>
-              </w:rPr>
-              <w:t>{{CUSTOMER_TAX_CODE}}</w:t>
-            </w:r>
-          </w:p>
-          <w:p>
-            <w:pPr>
-              <w:spacing w:after="0" w:line="288" w:lineRule="auto"/>
-              <w:rPr>
-                <w:rFonts w:ascii="Times New Roman" w:hAnsi="Times New Roman" w:cs="Times New Roman"/>
-                <w:sz w:val="24"/>
-                <w:szCs w:val="24"/>
-              </w:rPr>
-            </w:pPr>
-            <w:r>
-              <w:rPr>
-                <w:rFonts w:ascii="Times New Roman" w:hAnsi="Times New Roman" w:cs="Times New Roman"/>
-                <w:sz w:val="24"/>
-                <w:szCs w:val="24"/>
-              </w:rPr>
-              <w:t>{{CUSTOMER_EMAIL}}</w:t>
-            </w:r>
-          </w:p>
-        </w:tc>
-        <w:tc>
-          <w:tcPr>
-            <w:tcW w:w="3724" w:type="dxa"/>
-          </w:tcPr>
-          <w:p>
-            <w:pPr>
-              <w:spacing w:after="160" w:line="278" w:lineRule="auto"/>
-              <w:rPr>
-                <w:rFonts w:ascii="Times New Roman" w:hAnsi="Times New Roman" w:cs="Times New Roman"/>
-                <w:sz w:val="24"/>
-                <w:szCs w:val="24"/>
-              </w:rPr>
-            </w:pPr>
-          </w:p>
-          <w:p>
-            <w:pPr>
-              <w:spacing w:after="0" w:line="288" w:lineRule="auto"/>
-              <w:rPr>
-                <w:rFonts w:ascii="Times New Roman" w:hAnsi="Times New Roman" w:cs="Times New Roman"/>
-                <w:sz w:val="24"/>
-                <w:szCs w:val="24"/>
-              </w:rPr>
-            </w:pPr>
-          </w:p>
         </w:tc>
       </w:tr>
-    </w:tbl>
-    <w:p>
-      <w:pPr>
-        <w:spacing w:after="0" w:line="288" w:lineRule="auto"/>
-        <w:rPr>
-          <w:rFonts w:ascii="Times New Roman" w:hAnsi="Times New Roman" w:cs="Times New Roman"/>
-          <w:sz w:val="24"/>
-          <w:szCs w:val="24"/>
-        </w:rPr>
-      </w:pPr>
-    </w:p>
-    <w:p>
-      <w:pPr>
-        <w:spacing w:after="0" w:line="288" w:lineRule="auto"/>
-        <w:rPr>
-          <w:rFonts w:ascii="Times New Roman" w:hAnsi="Times New Roman" w:cs="Times New Roman"/>
-          <w:i/>
-          <w:iCs/>
-          <w:sz w:val="24"/>
-          <w:szCs w:val="24"/>
-          <w:lang w:val="fr-FR"/>
-        </w:rPr>
-      </w:pPr>
-      <w:r>
-        <w:rPr>
-          <w:rFonts w:ascii="Times New Roman" w:hAnsi="Times New Roman" w:cs="Times New Roman"/>
-          <w:i/>
-          <w:iCs/>
-          <w:sz w:val="24"/>
-          <w:szCs w:val="24"/>
-          <w:lang w:val="fr-FR"/>
-        </w:rPr>
-        <w:t xml:space="preserve">(Sau </w:t>
-      </w:r>
-      <w:proofErr w:type="spellStart"/>
-      <w:r>
-        <w:rPr>
-          <w:rFonts w:ascii="Times New Roman" w:hAnsi="Times New Roman" w:cs="Times New Roman"/>
-          <w:i/>
-          <w:iCs/>
-          <w:sz w:val="24"/>
-          <w:szCs w:val="24"/>
-          <w:lang w:val="fr-FR"/>
-        </w:rPr>
-        <w:t>đây</w:t>
-      </w:r>
-      <w:proofErr w:type="spellEnd"/>
-      <w:r>
-        <w:rPr>
-          <w:rFonts w:ascii="Times New Roman" w:hAnsi="Times New Roman" w:cs="Times New Roman"/>
-          <w:i/>
-          <w:iCs/>
-          <w:sz w:val="24"/>
-          <w:szCs w:val="24"/>
-          <w:lang w:val="fr-FR"/>
-        </w:rPr>
-        <w:t xml:space="preserve"> </w:t>
-      </w:r>
-      <w:proofErr w:type="spellStart"/>
-      <w:r>
-        <w:rPr>
-          <w:rFonts w:ascii="Times New Roman" w:hAnsi="Times New Roman" w:cs="Times New Roman"/>
-          <w:i/>
-          <w:iCs/>
-          <w:sz w:val="24"/>
-          <w:szCs w:val="24"/>
-          <w:lang w:val="fr-FR"/>
-        </w:rPr>
-        <w:t>gọi</w:t>
-      </w:r>
-      <w:proofErr w:type="spellEnd"/>
-      <w:r>
-        <w:rPr>
-          <w:rFonts w:ascii="Times New Roman" w:hAnsi="Times New Roman" w:cs="Times New Roman"/>
-          <w:i/>
-          <w:iCs/>
-          <w:sz w:val="24"/>
-          <w:szCs w:val="24"/>
-          <w:lang w:val="fr-FR"/>
-        </w:rPr>
-        <w:t xml:space="preserve"> </w:t>
-      </w:r>
-      <w:proofErr w:type="spellStart"/>
-      <w:r>
-        <w:rPr>
-          <w:rFonts w:ascii="Times New Roman" w:hAnsi="Times New Roman" w:cs="Times New Roman"/>
-          <w:i/>
-          <w:iCs/>
-          <w:sz w:val="24"/>
-          <w:szCs w:val="24"/>
-          <w:lang w:val="fr-FR"/>
-        </w:rPr>
-        <w:t>tắt</w:t>
-      </w:r>
-      <w:proofErr w:type="spellEnd"/>
-      <w:r>
-        <w:rPr>
-          <w:rFonts w:ascii="Times New Roman" w:hAnsi="Times New Roman" w:cs="Times New Roman"/>
-          <w:i/>
-          <w:iCs/>
-          <w:sz w:val="24"/>
-          <w:szCs w:val="24"/>
-          <w:lang w:val="fr-FR"/>
-        </w:rPr>
-        <w:t xml:space="preserve"> là “</w:t>
-      </w:r>
-      <w:proofErr w:type="spellStart"/>
-      <w:r>
-        <w:rPr>
-          <w:rFonts w:ascii="Times New Roman" w:hAnsi="Times New Roman" w:cs="Times New Roman"/>
-          <w:b/>
-          <w:bCs/>
-          <w:i/>
-          <w:iCs/>
-          <w:sz w:val="24"/>
-          <w:szCs w:val="24"/>
-          <w:lang w:val="fr-FR"/>
-        </w:rPr>
-        <w:t>Bên</w:t>
-      </w:r>
-      <w:proofErr w:type="spellEnd"/>
-      <w:r>
-        <w:rPr>
-          <w:rFonts w:ascii="Times New Roman" w:hAnsi="Times New Roman" w:cs="Times New Roman"/>
-          <w:b/>
-          <w:bCs/>
-          <w:i/>
-          <w:iCs/>
-          <w:spacing w:val="-3"/>
-          <w:sz w:val="24"/>
-          <w:szCs w:val="24"/>
-          <w:lang w:val="fr-FR"/>
-        </w:rPr>
-        <w:t xml:space="preserve"> </w:t>
-      </w:r>
-      <w:r>
-        <w:rPr>
-          <w:rFonts w:ascii="Times New Roman" w:hAnsi="Times New Roman" w:cs="Times New Roman"/>
-          <w:b/>
-          <w:bCs/>
-          <w:i/>
-          <w:iCs/>
-          <w:sz w:val="24"/>
-          <w:szCs w:val="24"/>
-          <w:lang w:val="fr-FR"/>
-        </w:rPr>
-        <w:t>A</w:t>
-      </w:r>
-      <w:r>
-        <w:rPr>
-          <w:rFonts w:ascii="Times New Roman" w:hAnsi="Times New Roman" w:cs="Times New Roman"/>
-          <w:i/>
-          <w:iCs/>
-          <w:sz w:val="24"/>
-          <w:szCs w:val="24"/>
-          <w:lang w:val="fr-FR"/>
-        </w:rPr>
-        <w:t>”)</w:t>
-      </w:r>
-    </w:p>
-    <w:p>
-      <w:pPr>
-        <w:spacing w:before="120" w:after="120" w:line="288" w:lineRule="auto"/>
-        <w:rPr>
-          <w:rFonts w:ascii="Times New Roman" w:hAnsi="Times New Roman" w:cs="Times New Roman"/>
-          <w:b/>
-          <w:bCs/>
-          <w:sz w:val="24"/>
-          <w:szCs w:val="24"/>
-          <w:lang w:val="fr-FR"/>
-        </w:rPr>
-      </w:pPr>
-      <w:r>
-        <w:rPr>
-          <w:rFonts w:ascii="Times New Roman" w:hAnsi="Times New Roman" w:cs="Times New Roman"/>
-          <w:b/>
-          <w:bCs/>
-          <w:sz w:val="24"/>
-          <w:szCs w:val="24"/>
-          <w:lang w:val="fr-FR"/>
-        </w:rPr>
-        <w:t xml:space="preserve">BÊN </w:t>
-      </w:r>
-      <w:proofErr w:type="gramStart"/>
-      <w:r>
-        <w:rPr>
-          <w:rFonts w:ascii="Times New Roman" w:hAnsi="Times New Roman" w:cs="Times New Roman"/>
-          <w:b/>
-          <w:bCs/>
-          <w:sz w:val="24"/>
-          <w:szCs w:val="24"/>
-          <w:lang w:val="fr-FR"/>
-        </w:rPr>
-        <w:t>B:</w:t>
-      </w:r>
-      <w:proofErr w:type="gramEnd"/>
-      <w:r>
-        <w:rPr>
-          <w:rFonts w:ascii="Times New Roman" w:hAnsi="Times New Roman" w:cs="Times New Roman"/>
-          <w:b/>
-          <w:bCs/>
-          <w:sz w:val="24"/>
-          <w:szCs w:val="24"/>
-          <w:lang w:val="fr-FR"/>
-        </w:rPr>
-        <w:t xml:space="preserve"> CÔNG TY TNHH CÔNG NGHỆ ỨNG DỤNG VÀ TRUYỀN THÔNG DTC</w:t>
-      </w:r>
-    </w:p>
-    <w:tbl>
-      <w:tblPr>
-        <w:tblStyle w:val="TableGrid"/>
-        <w:tblW w:w="0" w:type="auto"/>
-        <w:tblBorders>
-          <w:top w:val="none" w:sz="0" w:space="0" w:color="auto"/>
-          <w:left w:val="none" w:sz="0" w:space="0" w:color="auto"/>
-          <w:bottom w:val="none" w:sz="0" w:space="0" w:color="auto"/>
-          <w:right w:val="none" w:sz="0" w:space="0" w:color="auto"/>
-          <w:insideH w:val="none" w:sz="0" w:space="0" w:color="auto"/>
-          <w:insideV w:val="none" w:sz="0" w:space="0" w:color="auto"/>
-        </w:tblBorders>
-        <w:tblLook w:val="04A0" w:firstRow="1" w:lastRow="0" w:firstColumn="1" w:lastColumn="0" w:noHBand="0" w:noVBand="1"/>
-      </w:tblPr>
-      <w:tblGrid>
-        <w:gridCol w:w="2093"/>
-        <w:gridCol w:w="368"/>
-        <w:gridCol w:w="7145"/>
-      </w:tblGrid>
       <w:tr>
+        <w:trPr>
+          <w:trHeight w:val="275"/>
+        </w:trPr>
         <w:tc>
           <w:tcPr>
             <w:tcW w:w="2093" w:type="dxa"/>
@@ -1353,53 +698,14 @@
                 <w:szCs w:val="24"/>
               </w:rPr>
             </w:pPr>
-            <w:proofErr w:type="spellStart"/>
-            <w:r>
-              <w:rPr>
-                <w:rFonts w:ascii="Times New Roman" w:hAnsi="Times New Roman" w:cs="Times New Roman"/>
-                <w:sz w:val="24"/>
-                <w:szCs w:val="24"/>
-              </w:rPr>
-              <w:t>Người</w:t>
-            </w:r>
-            <w:proofErr w:type="spellEnd"/>
-            <w:r>
-              <w:rPr>
-                <w:rFonts w:ascii="Times New Roman" w:hAnsi="Times New Roman" w:cs="Times New Roman"/>
-                <w:sz w:val="24"/>
-                <w:szCs w:val="24"/>
-              </w:rPr>
-              <w:t xml:space="preserve"> </w:t>
-            </w:r>
-            <w:proofErr w:type="spellStart"/>
-            <w:r>
-              <w:rPr>
-                <w:rFonts w:ascii="Times New Roman" w:hAnsi="Times New Roman" w:cs="Times New Roman"/>
-                <w:sz w:val="24"/>
-                <w:szCs w:val="24"/>
-              </w:rPr>
-              <w:t>đại</w:t>
-            </w:r>
-            <w:proofErr w:type="spellEnd"/>
-            <w:r>
-              <w:rPr>
-                <w:rFonts w:ascii="Times New Roman" w:hAnsi="Times New Roman" w:cs="Times New Roman"/>
-                <w:spacing w:val="-4"/>
-                <w:sz w:val="24"/>
-                <w:szCs w:val="24"/>
-              </w:rPr>
-              <w:t xml:space="preserve"> </w:t>
-            </w:r>
-            <w:proofErr w:type="spellStart"/>
-            <w:r>
-              <w:rPr>
-                <w:rFonts w:ascii="Times New Roman" w:hAnsi="Times New Roman" w:cs="Times New Roman"/>
-                <w:sz w:val="24"/>
-                <w:szCs w:val="24"/>
-              </w:rPr>
-              <w:t>diện</w:t>
-            </w:r>
-            <w:proofErr w:type="spellEnd"/>
+            <w:r>
+              <w:rPr>
+                <w:rFonts w:ascii="Times New Roman" w:hAnsi="Times New Roman" w:cs="Times New Roman"/>
+                <w:sz w:val="24"/>
+                <w:szCs w:val="24"/>
+              </w:rPr>
+              <w:t>Mã số thuế</w:t>
+            </w:r>
           </w:p>
         </w:tc>
         <w:tc>
@@ -1428,6 +734,7 @@
         <w:tc>
           <w:tcPr>
             <w:tcW w:w="7145" w:type="dxa"/>
+            <w:gridSpan w:val="2"/>
           </w:tcPr>
           <w:p>
             <w:pPr>
@@ -1438,105 +745,29 @@
                 <w:szCs w:val="24"/>
               </w:rPr>
             </w:pPr>
-            <w:proofErr w:type="spellStart"/>
-            <w:r>
-              <w:rPr>
-                <w:rFonts w:ascii="Times New Roman" w:hAnsi="Times New Roman" w:cs="Times New Roman"/>
-                <w:sz w:val="24"/>
-                <w:szCs w:val="24"/>
-              </w:rPr>
-              <w:t>Ông</w:t>
-            </w:r>
-            <w:proofErr w:type="spellEnd"/>
-            <w:r>
-              <w:rPr>
-                <w:rFonts w:ascii="Times New Roman" w:hAnsi="Times New Roman" w:cs="Times New Roman"/>
-                <w:sz w:val="24"/>
-                <w:szCs w:val="24"/>
-              </w:rPr>
-              <w:t xml:space="preserve"> Nguyễn Thành Ý</w:t>
-            </w:r>
-            <w:r>
-              <w:rPr>
-                <w:rFonts w:ascii="Times New Roman" w:hAnsi="Times New Roman" w:cs="Times New Roman"/>
-                <w:b/>
-                <w:bCs/>
-                <w:sz w:val="24"/>
-                <w:szCs w:val="24"/>
-              </w:rPr>
-              <w:tab/>
-            </w:r>
-            <w:r>
-              <w:rPr>
-                <w:rFonts w:ascii="Times New Roman" w:hAnsi="Times New Roman" w:cs="Times New Roman"/>
-                <w:b/>
-                <w:bCs/>
-                <w:sz w:val="24"/>
-                <w:szCs w:val="24"/>
-              </w:rPr>
-              <w:tab/>
-            </w:r>
-            <w:proofErr w:type="spellStart"/>
-            <w:r>
-              <w:rPr>
-                <w:rFonts w:ascii="Times New Roman" w:hAnsi="Times New Roman" w:cs="Times New Roman"/>
-                <w:sz w:val="24"/>
-                <w:szCs w:val="24"/>
-              </w:rPr>
-              <w:t>Chức</w:t>
-            </w:r>
-            <w:proofErr w:type="spellEnd"/>
-            <w:r>
-              <w:rPr>
-                <w:rFonts w:ascii="Times New Roman" w:hAnsi="Times New Roman" w:cs="Times New Roman"/>
-                <w:spacing w:val="-1"/>
-                <w:sz w:val="24"/>
-                <w:szCs w:val="24"/>
-              </w:rPr>
-              <w:t xml:space="preserve"> </w:t>
-            </w:r>
-            <w:proofErr w:type="spellStart"/>
-            <w:r>
-              <w:rPr>
-                <w:rFonts w:ascii="Times New Roman" w:hAnsi="Times New Roman" w:cs="Times New Roman"/>
-                <w:sz w:val="24"/>
-                <w:szCs w:val="24"/>
-              </w:rPr>
-              <w:t>vụ</w:t>
-            </w:r>
-            <w:proofErr w:type="spellEnd"/>
-            <w:r>
-              <w:rPr>
-                <w:rFonts w:ascii="Times New Roman" w:hAnsi="Times New Roman" w:cs="Times New Roman"/>
-                <w:sz w:val="24"/>
-                <w:szCs w:val="24"/>
-              </w:rPr>
-              <w:t xml:space="preserve">: </w:t>
-            </w:r>
-            <w:proofErr w:type="spellStart"/>
-            <w:r>
-              <w:rPr>
-                <w:rFonts w:ascii="Times New Roman" w:hAnsi="Times New Roman" w:cs="Times New Roman"/>
-                <w:b/>
-                <w:sz w:val="24"/>
-                <w:szCs w:val="24"/>
-              </w:rPr>
-              <w:t>Giám</w:t>
-            </w:r>
-            <w:proofErr w:type="spellEnd"/>
-            <w:r>
-              <w:rPr>
-                <w:rFonts w:ascii="Times New Roman" w:hAnsi="Times New Roman" w:cs="Times New Roman"/>
-                <w:b/>
-                <w:sz w:val="24"/>
-                <w:szCs w:val="24"/>
-              </w:rPr>
-              <w:t xml:space="preserve"> Đốc</w:t>
+            <w:r>
+              <w:rPr>
+                <w:rFonts w:ascii="Times New Roman" w:hAnsi="Times New Roman" w:cs="Times New Roman"/>
+                <w:sz w:val="24"/>
+                <w:szCs w:val="24"/>
+              </w:rPr>
+              <w:t>{{CUSTOMER_TAX_CODE}</w:t>
+            </w:r>
+            <w:r>
+              <w:rPr>
+                <w:rFonts w:ascii="Times New Roman" w:hAnsi="Times New Roman" w:cs="Times New Roman"/>
+                <w:sz w:val="24"/>
+                <w:szCs w:val="24"/>
+              </w:rPr>
+              <w:t>}</w:t>
             </w:r>
           </w:p>
         </w:tc>
       </w:tr>
       <w:tr>
+        <w:trPr>
+          <w:trHeight w:val="275"/>
+        </w:trPr>
         <w:tc>
           <w:tcPr>
             <w:tcW w:w="2093" w:type="dxa"/>
@@ -1550,71 +781,14 @@
                 <w:szCs w:val="24"/>
               </w:rPr>
             </w:pPr>
-            <w:proofErr w:type="spellStart"/>
-            <w:r>
-              <w:rPr>
-                <w:rFonts w:ascii="Times New Roman" w:hAnsi="Times New Roman" w:cs="Times New Roman"/>
-                <w:sz w:val="24"/>
-                <w:szCs w:val="24"/>
-              </w:rPr>
-              <w:t>Địa</w:t>
-            </w:r>
-            <w:proofErr w:type="spellEnd"/>
-            <w:r>
-              <w:rPr>
-                <w:rFonts w:ascii="Times New Roman" w:hAnsi="Times New Roman" w:cs="Times New Roman"/>
-                <w:spacing w:val="-2"/>
-                <w:sz w:val="24"/>
-                <w:szCs w:val="24"/>
-              </w:rPr>
-              <w:t xml:space="preserve"> </w:t>
-            </w:r>
-            <w:proofErr w:type="spellStart"/>
-            <w:r>
-              <w:rPr>
-                <w:rFonts w:ascii="Times New Roman" w:hAnsi="Times New Roman" w:cs="Times New Roman"/>
-                <w:sz w:val="24"/>
-                <w:szCs w:val="24"/>
-              </w:rPr>
-              <w:t>chỉ</w:t>
-            </w:r>
-            <w:proofErr w:type="spellEnd"/>
-            <w:r>
-              <w:rPr>
-                <w:rFonts w:ascii="Times New Roman" w:hAnsi="Times New Roman" w:cs="Times New Roman"/>
-                <w:sz w:val="24"/>
-                <w:szCs w:val="24"/>
-              </w:rPr>
-              <w:t xml:space="preserve"> </w:t>
-            </w:r>
-            <w:proofErr w:type="spellStart"/>
-            <w:r>
-              <w:rPr>
-                <w:rFonts w:ascii="Times New Roman" w:hAnsi="Times New Roman" w:cs="Times New Roman"/>
-                <w:sz w:val="24"/>
-                <w:szCs w:val="24"/>
-              </w:rPr>
-              <w:t>trụ</w:t>
-            </w:r>
-            <w:proofErr w:type="spellEnd"/>
-            <w:r>
-              <w:rPr>
-                <w:rFonts w:ascii="Times New Roman" w:hAnsi="Times New Roman" w:cs="Times New Roman"/>
-                <w:sz w:val="24"/>
-                <w:szCs w:val="24"/>
-              </w:rPr>
-              <w:t xml:space="preserve"> </w:t>
-            </w:r>
-            <w:proofErr w:type="spellStart"/>
-            <w:r>
-              <w:rPr>
-                <w:rFonts w:ascii="Times New Roman" w:hAnsi="Times New Roman" w:cs="Times New Roman"/>
-                <w:sz w:val="24"/>
-                <w:szCs w:val="24"/>
-              </w:rPr>
-              <w:t>sở</w:t>
-            </w:r>
-            <w:proofErr w:type="spellEnd"/>
+            <w:r>
+              <w:rPr>
+                <w:rFonts w:ascii="Times New Roman" w:hAnsi="Times New Roman" w:cs="Times New Roman"/>
+                <w:sz w:val="24"/>
+                <w:szCs w:val="24"/>
+              </w:rPr>
+              <w:t>Email</w:t>
+            </w:r>
           </w:p>
         </w:tc>
         <w:tc>
@@ -1643,6 +817,7 @@
         <w:tc>
           <w:tcPr>
             <w:tcW w:w="7145" w:type="dxa"/>
+            <w:gridSpan w:val="2"/>
           </w:tcPr>
           <w:p>
             <w:pPr>
@@ -1653,164 +828,21 @@
                 <w:szCs w:val="24"/>
               </w:rPr>
             </w:pPr>
-            <w:proofErr w:type="spellStart"/>
-            <w:r>
-              <w:rPr>
-                <w:rFonts w:ascii="Times New Roman" w:hAnsi="Times New Roman" w:cs="Times New Roman"/>
-                <w:sz w:val="24"/>
-                <w:szCs w:val="24"/>
-              </w:rPr>
-              <w:t>Số</w:t>
-            </w:r>
-            <w:proofErr w:type="spellEnd"/>
-            <w:r>
-              <w:rPr>
-                <w:rFonts w:ascii="Times New Roman" w:hAnsi="Times New Roman" w:cs="Times New Roman"/>
-                <w:sz w:val="24"/>
-                <w:szCs w:val="24"/>
-              </w:rPr>
-              <w:t xml:space="preserve"> 2, </w:t>
-            </w:r>
-            <w:proofErr w:type="spellStart"/>
-            <w:r>
-              <w:rPr>
-                <w:rFonts w:ascii="Times New Roman" w:hAnsi="Times New Roman" w:cs="Times New Roman"/>
-                <w:sz w:val="24"/>
-                <w:szCs w:val="24"/>
-              </w:rPr>
-              <w:t>ngách</w:t>
-            </w:r>
-            <w:proofErr w:type="spellEnd"/>
-            <w:r>
-              <w:rPr>
-                <w:rFonts w:ascii="Times New Roman" w:hAnsi="Times New Roman" w:cs="Times New Roman"/>
-                <w:sz w:val="24"/>
-                <w:szCs w:val="24"/>
-              </w:rPr>
-              <w:t xml:space="preserve"> 6, </w:t>
-            </w:r>
-            <w:proofErr w:type="spellStart"/>
-            <w:r>
-              <w:rPr>
-                <w:rFonts w:ascii="Times New Roman" w:hAnsi="Times New Roman" w:cs="Times New Roman"/>
-                <w:sz w:val="24"/>
-                <w:szCs w:val="24"/>
-              </w:rPr>
-              <w:t>ngõ</w:t>
-            </w:r>
-            <w:proofErr w:type="spellEnd"/>
-            <w:r>
-              <w:rPr>
-                <w:rFonts w:ascii="Times New Roman" w:hAnsi="Times New Roman" w:cs="Times New Roman"/>
-                <w:sz w:val="24"/>
-                <w:szCs w:val="24"/>
-              </w:rPr>
-              <w:t xml:space="preserve"> 200, </w:t>
-            </w:r>
-            <w:proofErr w:type="spellStart"/>
-            <w:r>
-              <w:rPr>
-                <w:rFonts w:ascii="Times New Roman" w:hAnsi="Times New Roman" w:cs="Times New Roman"/>
-                <w:sz w:val="24"/>
-                <w:szCs w:val="24"/>
-              </w:rPr>
-              <w:t>đường</w:t>
-            </w:r>
-            <w:proofErr w:type="spellEnd"/>
-            <w:r>
-              <w:rPr>
-                <w:rFonts w:ascii="Times New Roman" w:hAnsi="Times New Roman" w:cs="Times New Roman"/>
-                <w:sz w:val="24"/>
-                <w:szCs w:val="24"/>
-              </w:rPr>
-              <w:t xml:space="preserve"> </w:t>
-            </w:r>
-            <w:proofErr w:type="spellStart"/>
-            <w:r>
-              <w:rPr>
-                <w:rFonts w:ascii="Times New Roman" w:hAnsi="Times New Roman" w:cs="Times New Roman"/>
-                <w:sz w:val="24"/>
-                <w:szCs w:val="24"/>
-              </w:rPr>
-              <w:t>Vĩnh</w:t>
-            </w:r>
-            <w:proofErr w:type="spellEnd"/>
-            <w:r>
-              <w:rPr>
-                <w:rFonts w:ascii="Times New Roman" w:hAnsi="Times New Roman" w:cs="Times New Roman"/>
-                <w:sz w:val="24"/>
-                <w:szCs w:val="24"/>
-              </w:rPr>
-              <w:t xml:space="preserve"> Hưng, </w:t>
-            </w:r>
-            <w:proofErr w:type="spellStart"/>
-            <w:r>
-              <w:rPr>
-                <w:rFonts w:ascii="Times New Roman" w:hAnsi="Times New Roman" w:cs="Times New Roman"/>
-                <w:sz w:val="24"/>
-                <w:szCs w:val="24"/>
-              </w:rPr>
-              <w:t>Phường</w:t>
-            </w:r>
-            <w:proofErr w:type="spellEnd"/>
-            <w:r>
-              <w:rPr>
-                <w:rFonts w:ascii="Times New Roman" w:hAnsi="Times New Roman" w:cs="Times New Roman"/>
-                <w:sz w:val="24"/>
-                <w:szCs w:val="24"/>
-              </w:rPr>
-              <w:t xml:space="preserve"> </w:t>
-            </w:r>
-            <w:proofErr w:type="spellStart"/>
-            <w:r>
-              <w:rPr>
-                <w:rFonts w:ascii="Times New Roman" w:hAnsi="Times New Roman" w:cs="Times New Roman"/>
-                <w:sz w:val="24"/>
-                <w:szCs w:val="24"/>
-              </w:rPr>
-              <w:t>Vĩnh</w:t>
-            </w:r>
-            <w:proofErr w:type="spellEnd"/>
-            <w:r>
-              <w:rPr>
-                <w:rFonts w:ascii="Times New Roman" w:hAnsi="Times New Roman" w:cs="Times New Roman"/>
-                <w:sz w:val="24"/>
-                <w:szCs w:val="24"/>
-              </w:rPr>
-              <w:t xml:space="preserve"> Hưng, Thành </w:t>
-            </w:r>
-            <w:proofErr w:type="spellStart"/>
-            <w:r>
-              <w:rPr>
-                <w:rFonts w:ascii="Times New Roman" w:hAnsi="Times New Roman" w:cs="Times New Roman"/>
-                <w:sz w:val="24"/>
-                <w:szCs w:val="24"/>
-              </w:rPr>
-              <w:t>phố</w:t>
-            </w:r>
-            <w:proofErr w:type="spellEnd"/>
-            <w:r>
-              <w:rPr>
-                <w:rFonts w:ascii="Times New Roman" w:hAnsi="Times New Roman" w:cs="Times New Roman"/>
-                <w:sz w:val="24"/>
-                <w:szCs w:val="24"/>
-              </w:rPr>
-              <w:t xml:space="preserve"> Hà </w:t>
-            </w:r>
-            <w:proofErr w:type="spellStart"/>
-            <w:r>
-              <w:rPr>
-                <w:rFonts w:ascii="Times New Roman" w:hAnsi="Times New Roman" w:cs="Times New Roman"/>
-                <w:sz w:val="24"/>
-                <w:szCs w:val="24"/>
-              </w:rPr>
-              <w:t>Nội</w:t>
-            </w:r>
-            <w:proofErr w:type="spellEnd"/>
+            <w:r>
+              <w:rPr>
+                <w:rFonts w:ascii="Times New Roman" w:hAnsi="Times New Roman" w:cs="Times New Roman"/>
+                <w:sz w:val="24"/>
+                <w:szCs w:val="24"/>
+              </w:rPr>
+              <w:t>{{CUSTOMER_EMAIL}}</w:t>
+            </w:r>
           </w:p>
         </w:tc>
       </w:tr>
       <w:tr>
+        <w:trPr>
+          <w:trHeight w:val="275"/>
+        </w:trPr>
         <w:tc>
           <w:tcPr>
             <w:tcW w:w="2093" w:type="dxa"/>
@@ -1824,16 +856,14 @@
                 <w:szCs w:val="24"/>
               </w:rPr>
             </w:pPr>
-            <w:proofErr w:type="spellStart"/>
-            <w:r>
-              <w:rPr>
-                <w:rFonts w:ascii="Times New Roman" w:hAnsi="Times New Roman" w:cs="Times New Roman"/>
-                <w:sz w:val="24"/>
-                <w:szCs w:val="24"/>
-              </w:rPr>
-              <w:t>Điện</w:t>
-            </w:r>
-            <w:proofErr w:type="spellEnd"/>
+            <w:r>
+              <w:rPr>
+                <w:rFonts w:ascii="Times New Roman" w:hAnsi="Times New Roman" w:cs="Times New Roman"/>
+                <w:sz w:val="24"/>
+                <w:szCs w:val="24"/>
+              </w:rPr>
+              <w:t>Tài khoản</w:t>
+            </w:r>
             <w:r>
               <w:rPr>
                 <w:rFonts w:ascii="Times New Roman" w:hAnsi="Times New Roman" w:cs="Times New Roman"/>
@@ -1843,16 +873,14 @@
               </w:rPr>
               <w:t xml:space="preserve"> </w:t>
             </w:r>
-            <w:proofErr w:type="spellStart"/>
-            <w:r>
-              <w:rPr>
-                <w:rFonts w:ascii="Times New Roman" w:hAnsi="Times New Roman" w:cs="Times New Roman"/>
-                <w:sz w:val="24"/>
-                <w:szCs w:val="24"/>
-              </w:rPr>
-              <w:t>thoại</w:t>
-            </w:r>
-            <w:proofErr w:type="spellEnd"/>
+            <w:r>
+              <w:rPr>
+                <w:rFonts w:ascii="Times New Roman" w:hAnsi="Times New Roman" w:cs="Times New Roman"/>
+                <w:sz w:val="24"/>
+                <w:szCs w:val="24"/>
+              </w:rPr>
+              <w:t>số</w:t>
+            </w:r>
           </w:p>
         </w:tc>
         <w:tc>
@@ -1881,6 +909,7 @@
         <w:tc>
           <w:tcPr>
             <w:tcW w:w="7145" w:type="dxa"/>
+            <w:gridSpan w:val="2"/>
           </w:tcPr>
           <w:p>
             <w:pPr>
@@ -1897,37 +926,31 @@
                 <w:sz w:val="24"/>
                 <w:szCs w:val="24"/>
               </w:rPr>
-              <w:t>(+84-24) 3 557-3636</w:t>
-            </w:r>
-            <w:r>
-              <w:rPr>
-                <w:rFonts w:ascii="Times New Roman" w:hAnsi="Times New Roman" w:cs="Times New Roman"/>
-                <w:sz w:val="24"/>
-                <w:szCs w:val="24"/>
-              </w:rPr>
-              <w:tab/>
-            </w:r>
-            <w:r>
-              <w:rPr>
-                <w:rFonts w:ascii="Times New Roman" w:hAnsi="Times New Roman" w:cs="Times New Roman"/>
-                <w:sz w:val="24"/>
-                <w:szCs w:val="24"/>
-              </w:rPr>
-              <w:tab/>
-            </w:r>
-            <w:r>
-              <w:rPr>
-                <w:rFonts w:ascii="Times New Roman" w:hAnsi="Times New Roman" w:cs="Times New Roman"/>
-                <w:sz w:val="24"/>
-                <w:szCs w:val="24"/>
-              </w:rPr>
-              <w:tab/>
-              <w:t>Fax: (+84-24) 3 569-0588</w:t>
+              <w:t>{{</w:t>
+            </w:r>
+            <w:r>
+              <w:rPr>
+                <w:rFonts w:ascii="Times New Roman" w:hAnsi="Times New Roman" w:cs="Times New Roman"/>
+                <w:sz w:val="24"/>
+                <w:szCs w:val="24"/>
+              </w:rPr>
+              <w:t>CUSTOMER_BANK_ACCOUNT_NUMBER</w:t>
+            </w:r>
+            <w:r>
+              <w:rPr>
+                <w:rFonts w:ascii="Times New Roman" w:hAnsi="Times New Roman" w:cs="Times New Roman"/>
+                <w:sz w:val="24"/>
+                <w:szCs w:val="24"/>
+              </w:rPr>
+              <w:t>}}</w:t>
             </w:r>
           </w:p>
         </w:tc>
       </w:tr>
       <w:tr>
+        <w:trPr>
+          <w:trHeight w:val="275"/>
+        </w:trPr>
         <w:tc>
           <w:tcPr>
             <w:tcW w:w="2093" w:type="dxa"/>
@@ -1941,53 +964,14 @@
                 <w:szCs w:val="24"/>
               </w:rPr>
             </w:pPr>
-            <w:proofErr w:type="spellStart"/>
-            <w:r>
-              <w:rPr>
-                <w:rFonts w:ascii="Times New Roman" w:hAnsi="Times New Roman" w:cs="Times New Roman"/>
-                <w:sz w:val="24"/>
-                <w:szCs w:val="24"/>
-              </w:rPr>
-              <w:t>Mã</w:t>
-            </w:r>
-            <w:proofErr w:type="spellEnd"/>
-            <w:r>
-              <w:rPr>
-                <w:rFonts w:ascii="Times New Roman" w:hAnsi="Times New Roman" w:cs="Times New Roman"/>
-                <w:sz w:val="24"/>
-                <w:szCs w:val="24"/>
-              </w:rPr>
-              <w:t xml:space="preserve"> </w:t>
-            </w:r>
-            <w:proofErr w:type="spellStart"/>
-            <w:r>
-              <w:rPr>
-                <w:rFonts w:ascii="Times New Roman" w:hAnsi="Times New Roman" w:cs="Times New Roman"/>
-                <w:sz w:val="24"/>
-                <w:szCs w:val="24"/>
-              </w:rPr>
-              <w:t>số</w:t>
-            </w:r>
-            <w:proofErr w:type="spellEnd"/>
-            <w:r>
-              <w:rPr>
-                <w:rFonts w:ascii="Times New Roman" w:hAnsi="Times New Roman" w:cs="Times New Roman"/>
-                <w:spacing w:val="-1"/>
-                <w:sz w:val="24"/>
-                <w:szCs w:val="24"/>
-              </w:rPr>
-              <w:t xml:space="preserve"> </w:t>
-            </w:r>
-            <w:proofErr w:type="spellStart"/>
-            <w:r>
-              <w:rPr>
-                <w:rFonts w:ascii="Times New Roman" w:hAnsi="Times New Roman" w:cs="Times New Roman"/>
-                <w:sz w:val="24"/>
-                <w:szCs w:val="24"/>
-              </w:rPr>
-              <w:t>thuế</w:t>
-            </w:r>
-            <w:proofErr w:type="spellEnd"/>
+            <w:r>
+              <w:rPr>
+                <w:rFonts w:ascii="Times New Roman" w:hAnsi="Times New Roman" w:cs="Times New Roman"/>
+                <w:sz w:val="24"/>
+                <w:szCs w:val="24"/>
+              </w:rPr>
+              <w:t>Tại ngân hàng</w:t>
+            </w:r>
           </w:p>
         </w:tc>
         <w:tc>
@@ -2016,12 +1000,14 @@
         <w:tc>
           <w:tcPr>
             <w:tcW w:w="7145" w:type="dxa"/>
+            <w:gridSpan w:val="2"/>
           </w:tcPr>
           <w:p>
             <w:pPr>
               <w:spacing w:after="0" w:line="288" w:lineRule="auto"/>
               <w:rPr>
                 <w:rFonts w:ascii="Times New Roman" w:hAnsi="Times New Roman" w:cs="Times New Roman"/>
+                <w:spacing w:val="-6"/>
                 <w:sz w:val="24"/>
                 <w:szCs w:val="24"/>
               </w:rPr>
@@ -2029,213 +1015,12 @@
             <w:r>
               <w:rPr>
                 <w:rFonts w:ascii="Times New Roman" w:hAnsi="Times New Roman" w:cs="Times New Roman"/>
-                <w:sz w:val="24"/>
-                <w:szCs w:val="24"/>
-              </w:rPr>
-              <w:t>0105801335</w:t>
-            </w:r>
-          </w:p>
-        </w:tc>
-      </w:tr>
-      <w:tr>
-        <w:tc>
-          <w:tcPr>
-            <w:tcW w:w="2093" w:type="dxa"/>
-          </w:tcPr>
-          <w:p>
-            <w:pPr>
-              <w:spacing w:after="0" w:line="288" w:lineRule="auto"/>
-              <w:rPr>
-                <w:rFonts w:ascii="Times New Roman" w:hAnsi="Times New Roman" w:cs="Times New Roman"/>
-                <w:sz w:val="24"/>
-                <w:szCs w:val="24"/>
-              </w:rPr>
-            </w:pPr>
-            <w:r>
-              <w:rPr>
-                <w:rFonts w:ascii="Times New Roman" w:hAnsi="Times New Roman" w:cs="Times New Roman"/>
-                <w:sz w:val="24"/>
-                <w:szCs w:val="24"/>
-              </w:rPr>
-              <w:t xml:space="preserve">Tài </w:t>
-            </w:r>
-            <w:proofErr w:type="spellStart"/>
-            <w:r>
-              <w:rPr>
-                <w:rFonts w:ascii="Times New Roman" w:hAnsi="Times New Roman" w:cs="Times New Roman"/>
-                <w:sz w:val="24"/>
-                <w:szCs w:val="24"/>
-              </w:rPr>
-              <w:t>khoản</w:t>
-            </w:r>
-            <w:proofErr w:type="spellEnd"/>
-            <w:r>
-              <w:rPr>
-                <w:rFonts w:ascii="Times New Roman" w:hAnsi="Times New Roman" w:cs="Times New Roman"/>
-                <w:spacing w:val="-2"/>
-                <w:sz w:val="24"/>
-                <w:szCs w:val="24"/>
-              </w:rPr>
-              <w:t xml:space="preserve"> </w:t>
-            </w:r>
-            <w:proofErr w:type="spellStart"/>
-            <w:r>
-              <w:rPr>
-                <w:rFonts w:ascii="Times New Roman" w:hAnsi="Times New Roman" w:cs="Times New Roman"/>
-                <w:sz w:val="24"/>
-                <w:szCs w:val="24"/>
-              </w:rPr>
-              <w:t>số</w:t>
-            </w:r>
-            <w:proofErr w:type="spellEnd"/>
-          </w:p>
-        </w:tc>
-        <w:tc>
-          <w:tcPr>
-            <w:tcW w:w="368" w:type="dxa"/>
-          </w:tcPr>
-          <w:p>
-            <w:pPr>
-              <w:spacing w:after="0" w:line="288" w:lineRule="auto"/>
-              <w:rPr>
-                <w:rFonts w:ascii="Times New Roman" w:hAnsi="Times New Roman" w:cs="Times New Roman"/>
-                <w:sz w:val="24"/>
-                <w:szCs w:val="24"/>
-              </w:rPr>
-            </w:pPr>
-            <w:r>
-              <w:rPr>
-                <w:rFonts w:ascii="Times New Roman" w:hAnsi="Times New Roman" w:cs="Times New Roman"/>
-                <w:sz w:val="24"/>
-                <w:szCs w:val="24"/>
-              </w:rPr>
-              <w:t>:</w:t>
-            </w:r>
-          </w:p>
-        </w:tc>
-        <w:tc>
-          <w:tcPr>
-            <w:tcW w:w="7145" w:type="dxa"/>
-          </w:tcPr>
-          <w:p>
-            <w:pPr>
-              <w:spacing w:after="0" w:line="288" w:lineRule="auto"/>
-              <w:rPr>
-                <w:rFonts w:ascii="Times New Roman" w:hAnsi="Times New Roman" w:cs="Times New Roman"/>
-                <w:sz w:val="24"/>
-                <w:szCs w:val="24"/>
-              </w:rPr>
-            </w:pPr>
-            <w:r>
-              <w:rPr>
-                <w:rFonts w:ascii="Times New Roman" w:hAnsi="Times New Roman" w:cs="Times New Roman"/>
-                <w:sz w:val="24"/>
-                <w:szCs w:val="24"/>
-              </w:rPr>
-              <w:t>55944447777</w:t>
-            </w:r>
-          </w:p>
-        </w:tc>
-      </w:tr>
-      <w:tr>
-        <w:tc>
-          <w:tcPr>
-            <w:tcW w:w="2093" w:type="dxa"/>
-          </w:tcPr>
-          <w:p>
-            <w:pPr>
-              <w:spacing w:after="0" w:line="288" w:lineRule="auto"/>
-              <w:rPr>
-                <w:rFonts w:ascii="Times New Roman" w:hAnsi="Times New Roman" w:cs="Times New Roman"/>
-                <w:sz w:val="24"/>
-                <w:szCs w:val="24"/>
-              </w:rPr>
-            </w:pPr>
-            <w:proofErr w:type="spellStart"/>
-            <w:r>
-              <w:rPr>
-                <w:rFonts w:ascii="Times New Roman" w:hAnsi="Times New Roman" w:cs="Times New Roman"/>
-                <w:sz w:val="24"/>
-                <w:szCs w:val="24"/>
-              </w:rPr>
-              <w:t>Tại</w:t>
-            </w:r>
-            <w:proofErr w:type="spellEnd"/>
-            <w:r>
-              <w:rPr>
-                <w:rFonts w:ascii="Times New Roman" w:hAnsi="Times New Roman" w:cs="Times New Roman"/>
-                <w:sz w:val="24"/>
-                <w:szCs w:val="24"/>
-              </w:rPr>
-              <w:t xml:space="preserve"> </w:t>
-            </w:r>
-            <w:proofErr w:type="spellStart"/>
-            <w:r>
-              <w:rPr>
-                <w:rFonts w:ascii="Times New Roman" w:hAnsi="Times New Roman" w:cs="Times New Roman"/>
-                <w:sz w:val="24"/>
-                <w:szCs w:val="24"/>
-              </w:rPr>
-              <w:t>ngân</w:t>
-            </w:r>
-            <w:proofErr w:type="spellEnd"/>
-            <w:r>
-              <w:rPr>
-                <w:rFonts w:ascii="Times New Roman" w:hAnsi="Times New Roman" w:cs="Times New Roman"/>
-                <w:sz w:val="24"/>
-                <w:szCs w:val="24"/>
-              </w:rPr>
-              <w:t xml:space="preserve"> </w:t>
-            </w:r>
-            <w:proofErr w:type="spellStart"/>
-            <w:r>
-              <w:rPr>
-                <w:rFonts w:ascii="Times New Roman" w:hAnsi="Times New Roman" w:cs="Times New Roman"/>
-                <w:sz w:val="24"/>
-                <w:szCs w:val="24"/>
-              </w:rPr>
-              <w:t>hàng</w:t>
-            </w:r>
-            <w:proofErr w:type="spellEnd"/>
-          </w:p>
-        </w:tc>
-        <w:tc>
-          <w:tcPr>
-            <w:tcW w:w="368" w:type="dxa"/>
-          </w:tcPr>
-          <w:p>
-            <w:pPr>
-              <w:spacing w:after="0" w:line="288" w:lineRule="auto"/>
-              <w:rPr>
-                <w:rFonts w:ascii="Times New Roman" w:hAnsi="Times New Roman" w:cs="Times New Roman"/>
-                <w:sz w:val="24"/>
-                <w:szCs w:val="24"/>
-              </w:rPr>
-            </w:pPr>
-            <w:r>
-              <w:rPr>
-                <w:rFonts w:ascii="Times New Roman" w:hAnsi="Times New Roman" w:cs="Times New Roman"/>
-                <w:sz w:val="24"/>
-                <w:szCs w:val="24"/>
-              </w:rPr>
-              <w:t>:</w:t>
-            </w:r>
-          </w:p>
-        </w:tc>
-        <w:tc>
-          <w:tcPr>
-            <w:tcW w:w="7145" w:type="dxa"/>
-          </w:tcPr>
-          <w:p>
-            <w:pPr>
-              <w:spacing w:after="0" w:line="288" w:lineRule="auto"/>
-              <w:rPr>
-                <w:rFonts w:ascii="Times New Roman" w:hAnsi="Times New Roman" w:cs="Times New Roman"/>
                 <w:spacing w:val="-6"/>
                 <w:sz w:val="24"/>
                 <w:szCs w:val="24"/>
               </w:rPr>
-            </w:pPr>
+              <w:t>{{</w:t>
+            </w:r>
             <w:r>
               <w:rPr>
                 <w:rFonts w:ascii="Times New Roman" w:hAnsi="Times New Roman" w:cs="Times New Roman"/>
@@ -2243,9 +1028,8 @@
                 <w:sz w:val="24"/>
                 <w:szCs w:val="24"/>
               </w:rPr>
-              <w:t xml:space="preserve">Ngân </w:t>
-            </w:r>
-            <w:proofErr w:type="spellStart"/>
+              <w:t>CUSTOMER_BANK_NAME</w:t>
+            </w:r>
             <w:r>
               <w:rPr>
                 <w:rFonts w:ascii="Times New Roman" w:hAnsi="Times New Roman" w:cs="Times New Roman"/>
@@ -2253,109 +1037,8 @@
                 <w:sz w:val="24"/>
                 <w:szCs w:val="24"/>
               </w:rPr>
-              <w:t>hàng</w:t>
-            </w:r>
-            <w:proofErr w:type="spellEnd"/>
-            <w:r>
-              <w:rPr>
-                <w:rFonts w:ascii="Times New Roman" w:hAnsi="Times New Roman" w:cs="Times New Roman"/>
-                <w:spacing w:val="-6"/>
-                <w:sz w:val="24"/>
-                <w:szCs w:val="24"/>
-              </w:rPr>
-              <w:t xml:space="preserve"> Thương </w:t>
-            </w:r>
-            <w:proofErr w:type="spellStart"/>
-            <w:r>
-              <w:rPr>
-                <w:rFonts w:ascii="Times New Roman" w:hAnsi="Times New Roman" w:cs="Times New Roman"/>
-                <w:spacing w:val="-6"/>
-                <w:sz w:val="24"/>
-                <w:szCs w:val="24"/>
-              </w:rPr>
-              <w:t>mại</w:t>
-            </w:r>
-            <w:proofErr w:type="spellEnd"/>
-            <w:r>
-              <w:rPr>
-                <w:rFonts w:ascii="Times New Roman" w:hAnsi="Times New Roman" w:cs="Times New Roman"/>
-                <w:spacing w:val="-6"/>
-                <w:sz w:val="24"/>
-                <w:szCs w:val="24"/>
-              </w:rPr>
-              <w:t xml:space="preserve"> </w:t>
-            </w:r>
-            <w:proofErr w:type="spellStart"/>
-            <w:r>
-              <w:rPr>
-                <w:rFonts w:ascii="Times New Roman" w:hAnsi="Times New Roman" w:cs="Times New Roman"/>
-                <w:spacing w:val="-6"/>
-                <w:sz w:val="24"/>
-                <w:szCs w:val="24"/>
-              </w:rPr>
-              <w:t>Cổ</w:t>
-            </w:r>
-            <w:proofErr w:type="spellEnd"/>
-            <w:r>
-              <w:rPr>
-                <w:rFonts w:ascii="Times New Roman" w:hAnsi="Times New Roman" w:cs="Times New Roman"/>
-                <w:spacing w:val="-6"/>
-                <w:sz w:val="24"/>
-                <w:szCs w:val="24"/>
-              </w:rPr>
-              <w:t xml:space="preserve"> </w:t>
-            </w:r>
-            <w:proofErr w:type="spellStart"/>
-            <w:r>
-              <w:rPr>
-                <w:rFonts w:ascii="Times New Roman" w:hAnsi="Times New Roman" w:cs="Times New Roman"/>
-                <w:spacing w:val="-6"/>
-                <w:sz w:val="24"/>
-                <w:szCs w:val="24"/>
-              </w:rPr>
-              <w:t>phần</w:t>
-            </w:r>
-            <w:proofErr w:type="spellEnd"/>
-            <w:r>
-              <w:rPr>
-                <w:rFonts w:ascii="Times New Roman" w:hAnsi="Times New Roman" w:cs="Times New Roman"/>
-                <w:spacing w:val="-6"/>
-                <w:sz w:val="24"/>
-                <w:szCs w:val="24"/>
-              </w:rPr>
-              <w:t xml:space="preserve"> Tiên Phong – PGD Hai </w:t>
-            </w:r>
-            <w:proofErr w:type="spellStart"/>
-            <w:r>
-              <w:rPr>
-                <w:rFonts w:ascii="Times New Roman" w:hAnsi="Times New Roman" w:cs="Times New Roman"/>
-                <w:spacing w:val="-6"/>
-                <w:sz w:val="24"/>
-                <w:szCs w:val="24"/>
-              </w:rPr>
-              <w:t>Bà</w:t>
-            </w:r>
-            <w:proofErr w:type="spellEnd"/>
-            <w:r>
-              <w:rPr>
-                <w:rFonts w:ascii="Times New Roman" w:hAnsi="Times New Roman" w:cs="Times New Roman"/>
-                <w:spacing w:val="-6"/>
-                <w:sz w:val="24"/>
-                <w:szCs w:val="24"/>
-              </w:rPr>
-              <w:t xml:space="preserve"> Trưng, Hà </w:t>
-            </w:r>
-            <w:proofErr w:type="spellStart"/>
-            <w:r>
-              <w:rPr>
-                <w:rFonts w:ascii="Times New Roman" w:hAnsi="Times New Roman" w:cs="Times New Roman"/>
-                <w:spacing w:val="-6"/>
-                <w:sz w:val="24"/>
-                <w:szCs w:val="24"/>
-              </w:rPr>
-              <w:t>Nội</w:t>
-            </w:r>
-            <w:proofErr w:type="spellEnd"/>
+              <w:t>}}</w:t>
+            </w:r>
           </w:p>
         </w:tc>
       </w:tr>
@@ -2363,7 +1046,6 @@
     <w:p>
       <w:pPr>
         <w:spacing w:after="0" w:line="288" w:lineRule="auto"/>
-        <w:jc w:val="both"/>
         <w:rPr>
           <w:rFonts w:ascii="Times New Roman" w:hAnsi="Times New Roman" w:cs="Times New Roman"/>
           <w:i/>
@@ -2382,81 +1064,8 @@
           <w:szCs w:val="24"/>
           <w:lang w:val="fr-FR"/>
         </w:rPr>
-        <w:t xml:space="preserve">(Sau </w:t>
+        <w:t>(Sau đây gọi tắt là “</w:t>
       </w:r>
-      <w:proofErr w:type="spellStart"/>
-      <w:r>
-        <w:rPr>
-          <w:rFonts w:ascii="Times New Roman" w:hAnsi="Times New Roman" w:cs="Times New Roman"/>
-          <w:i/>
-          <w:iCs/>
-          <w:sz w:val="24"/>
-          <w:szCs w:val="24"/>
-          <w:lang w:val="fr-FR"/>
-        </w:rPr>
-        <w:t>đây</w:t>
-      </w:r>
-      <w:proofErr w:type="spellEnd"/>
-      <w:r>
-        <w:rPr>
-          <w:rFonts w:ascii="Times New Roman" w:hAnsi="Times New Roman" w:cs="Times New Roman"/>
-          <w:i/>
-          <w:iCs/>
-          <w:sz w:val="24"/>
-          <w:szCs w:val="24"/>
-          <w:lang w:val="fr-FR"/>
-        </w:rPr>
-        <w:t xml:space="preserve"> </w:t>
-      </w:r>
-      <w:proofErr w:type="spellStart"/>
-      <w:r>
-        <w:rPr>
-          <w:rFonts w:ascii="Times New Roman" w:hAnsi="Times New Roman" w:cs="Times New Roman"/>
-          <w:i/>
-          <w:iCs/>
-          <w:sz w:val="24"/>
-          <w:szCs w:val="24"/>
-          <w:lang w:val="fr-FR"/>
-        </w:rPr>
-        <w:t>gọi</w:t>
-      </w:r>
-      <w:proofErr w:type="spellEnd"/>
-      <w:r>
-        <w:rPr>
-          <w:rFonts w:ascii="Times New Roman" w:hAnsi="Times New Roman" w:cs="Times New Roman"/>
-          <w:i/>
-          <w:iCs/>
-          <w:sz w:val="24"/>
-          <w:szCs w:val="24"/>
-          <w:lang w:val="fr-FR"/>
-        </w:rPr>
-        <w:t xml:space="preserve"> </w:t>
-      </w:r>
-      <w:proofErr w:type="spellStart"/>
-      <w:r>
-        <w:rPr>
-          <w:rFonts w:ascii="Times New Roman" w:hAnsi="Times New Roman" w:cs="Times New Roman"/>
-          <w:i/>
-          <w:iCs/>
-          <w:sz w:val="24"/>
-          <w:szCs w:val="24"/>
-          <w:lang w:val="fr-FR"/>
-        </w:rPr>
-        <w:t>tắt</w:t>
-      </w:r>
-      <w:proofErr w:type="spellEnd"/>
-      <w:r>
-        <w:rPr>
-          <w:rFonts w:ascii="Times New Roman" w:hAnsi="Times New Roman" w:cs="Times New Roman"/>
-          <w:i/>
-          <w:iCs/>
-          <w:sz w:val="24"/>
-          <w:szCs w:val="24"/>
-          <w:lang w:val="fr-FR"/>
-        </w:rPr>
-        <w:t xml:space="preserve"> là “</w:t>
-      </w:r>
-      <w:proofErr w:type="spellStart"/>
       <w:r>
         <w:rPr>
           <w:rFonts w:ascii="Times New Roman" w:hAnsi="Times New Roman" w:cs="Times New Roman"/>
@@ -2470,7 +1079,6 @@
         </w:rPr>
         <w:t>Bên</w:t>
       </w:r>
-      <w:proofErr w:type="spellEnd"/>
       <w:r>
         <w:rPr>
           <w:rFonts w:ascii="Times New Roman" w:hAnsi="Times New Roman" w:cs="Times New Roman"/>
@@ -2496,7 +1104,7 @@
           <w:szCs w:val="24"/>
           <w:lang w:val="fr-FR"/>
         </w:rPr>
-        <w:t>B</w:t>
+        <w:t>A</w:t>
       </w:r>
       <w:r>
         <w:rPr>
@@ -2513,7 +1121,6 @@
     <w:p>
       <w:pPr>
         <w:spacing w:after="0" w:line="288" w:lineRule="auto"/>
-        <w:jc w:val="both"/>
         <w:rPr>
           <w:rFonts w:ascii="Times New Roman" w:hAnsi="Times New Roman" w:cs="Times New Roman"/>
           <w:i/>
@@ -2523,8 +1130,859 @@
           <w:lang w:val="fr-FR"/>
         </w:rPr>
       </w:pPr>
-      <w:proofErr w:type="spellStart"/>
+    </w:p>
+    <w:p>
+      <w:pPr>
+        <w:spacing w:before="120" w:after="120" w:line="288" w:lineRule="auto"/>
+        <w:rPr>
+          <w:rFonts w:ascii="Times New Roman" w:hAnsi="Times New Roman" w:cs="Times New Roman"/>
+          <w:b/>
+          <w:bCs/>
+          <w:sz w:val="24"/>
+          <w:szCs w:val="24"/>
+        </w:rPr>
+      </w:pPr>
       <w:r>
+        <w:rPr>
+          <w:rFonts w:ascii="Times New Roman" w:hAnsi="Times New Roman" w:cs="Times New Roman"/>
+          <w:b/>
+          <w:bCs/>
+          <w:sz w:val="24"/>
+          <w:szCs w:val="24"/>
+          <w:lang w:val="fr-FR"/>
+        </w:rPr>
+        <w:t xml:space="preserve">BÊN </w:t>
+      </w:r>
+      <w:proofErr w:type="gramStart"/>
+      <w:r>
+        <w:rPr>
+          <w:rFonts w:ascii="Times New Roman" w:hAnsi="Times New Roman" w:cs="Times New Roman"/>
+          <w:b/>
+          <w:bCs/>
+          <w:sz w:val="24"/>
+          <w:szCs w:val="24"/>
+          <w:lang w:val="fr-FR"/>
+        </w:rPr>
+        <w:t>B:</w:t>
+      </w:r>
+      <w:proofErr w:type="gramEnd"/>
+      <w:r>
+        <w:rPr>
+          <w:rFonts w:ascii="Times New Roman" w:hAnsi="Times New Roman" w:cs="Times New Roman"/>
+          <w:b/>
+          <w:bCs/>
+          <w:sz w:val="24"/>
+          <w:szCs w:val="24"/>
+          <w:lang w:val="fr-FR"/>
+        </w:rPr>
+        <w:t xml:space="preserve"> </w:t>
+      </w:r>
+      <w:r>
+        <w:rPr>
+          <w:rFonts w:ascii="Times New Roman" w:hAnsi="Times New Roman" w:cs="Times New Roman"/>
+          <w:b/>
+          <w:bCs/>
+          <w:sz w:val="24"/>
+          <w:szCs w:val="24"/>
+          <w:lang w:val="fr-FR"/>
+        </w:rPr>
+        <w:t>{{</w:t>
+      </w:r>
+      <w:r>
+        <w:rPr>
+          <w:rFonts w:ascii="Times New Roman" w:hAnsi="Times New Roman" w:cs="Times New Roman"/>
+          <w:b/>
+          <w:bCs/>
+          <w:sz w:val="24"/>
+          <w:szCs w:val="24"/>
+        </w:rPr>
+        <w:t>PROVIDER_LEGAL_NAM</w:t>
+      </w:r>
+      <w:r>
+        <w:rPr>
+          <w:rFonts w:ascii="Times New Roman" w:hAnsi="Times New Roman" w:cs="Times New Roman"/>
+          <w:b/>
+          <w:bCs/>
+          <w:sz w:val="24"/>
+          <w:szCs w:val="24"/>
+        </w:rPr>
+        <w:t>E</w:t>
+      </w:r>
+      <w:r>
+        <w:rPr>
+          <w:rFonts w:ascii="Times New Roman" w:hAnsi="Times New Roman" w:cs="Times New Roman"/>
+          <w:b/>
+          <w:bCs/>
+          <w:sz w:val="24"/>
+          <w:szCs w:val="24"/>
+          <w:lang w:val="fr-FR"/>
+        </w:rPr>
+        <w:t>}}</w:t>
+      </w:r>
+    </w:p>
+    <w:tbl>
+      <w:tblPr>
+        <w:tblStyle w:val="TableGrid"/>
+        <w:tblW w:w="10632" w:type="dxa"/>
+        <w:tblBorders>
+          <w:top w:val="none" w:sz="0" w:space="0" w:color="auto"/>
+          <w:left w:val="none" w:sz="0" w:space="0" w:color="auto"/>
+          <w:bottom w:val="none" w:sz="0" w:space="0" w:color="auto"/>
+          <w:right w:val="none" w:sz="0" w:space="0" w:color="auto"/>
+          <w:insideH w:val="none" w:sz="0" w:space="0" w:color="auto"/>
+          <w:insideV w:val="none" w:sz="0" w:space="0" w:color="auto"/>
+        </w:tblBorders>
+        <w:tblLayout w:type="fixed"/>
+        <w:tblLook w:val="04A0" w:firstRow="1" w:lastRow="0" w:firstColumn="1" w:lastColumn="0" w:noHBand="0" w:noVBand="1"/>
+      </w:tblPr>
+      <w:tblGrid>
+        <w:gridCol w:w="2070"/>
+        <w:gridCol w:w="450"/>
+        <w:gridCol w:w="3330"/>
+        <w:gridCol w:w="4782"/>
+      </w:tblGrid>
+      <w:tr>
+        <w:tc>
+          <w:tcPr>
+            <w:tcW w:w="2070" w:type="dxa"/>
+          </w:tcPr>
+          <w:p>
+            <w:pPr>
+              <w:spacing w:after="0" w:line="288" w:lineRule="auto"/>
+              <w:rPr>
+                <w:rFonts w:ascii="Times New Roman" w:hAnsi="Times New Roman" w:cs="Times New Roman"/>
+                <w:sz w:val="24"/>
+                <w:szCs w:val="24"/>
+              </w:rPr>
+            </w:pPr>
+            <w:r>
+              <w:rPr>
+                <w:rFonts w:ascii="Times New Roman" w:hAnsi="Times New Roman" w:cs="Times New Roman"/>
+                <w:sz w:val="24"/>
+                <w:szCs w:val="24"/>
+              </w:rPr>
+              <w:t>Người đại</w:t>
+            </w:r>
+            <w:r>
+              <w:rPr>
+                <w:rFonts w:ascii="Times New Roman" w:hAnsi="Times New Roman" w:cs="Times New Roman"/>
+                <w:spacing w:val="-4"/>
+                <w:sz w:val="24"/>
+                <w:szCs w:val="24"/>
+              </w:rPr>
+              <w:t xml:space="preserve"> </w:t>
+            </w:r>
+            <w:r>
+              <w:rPr>
+                <w:rFonts w:ascii="Times New Roman" w:hAnsi="Times New Roman" w:cs="Times New Roman"/>
+                <w:sz w:val="24"/>
+                <w:szCs w:val="24"/>
+              </w:rPr>
+              <w:t>diện</w:t>
+            </w:r>
+          </w:p>
+        </w:tc>
+        <w:tc>
+          <w:tcPr>
+            <w:tcW w:w="450" w:type="dxa"/>
+          </w:tcPr>
+          <w:p>
+            <w:pPr>
+              <w:spacing w:after="0" w:line="288" w:lineRule="auto"/>
+              <w:rPr>
+                <w:rFonts w:ascii="Times New Roman" w:hAnsi="Times New Roman" w:cs="Times New Roman"/>
+                <w:sz w:val="24"/>
+                <w:szCs w:val="24"/>
+              </w:rPr>
+            </w:pPr>
+            <w:r>
+              <w:rPr>
+                <w:rFonts w:ascii="Times New Roman" w:hAnsi="Times New Roman" w:cs="Times New Roman"/>
+                <w:sz w:val="24"/>
+                <w:szCs w:val="24"/>
+              </w:rPr>
+              <w:t>:</w:t>
+            </w:r>
+          </w:p>
+        </w:tc>
+        <w:tc>
+          <w:tcPr>
+            <w:tcW w:w="3330" w:type="dxa"/>
+          </w:tcPr>
+          <w:p>
+            <w:pPr>
+              <w:spacing w:after="0" w:line="288" w:lineRule="auto"/>
+              <w:ind w:right="-131"/>
+              <w:rPr>
+                <w:rFonts w:ascii="Times New Roman" w:hAnsi="Times New Roman" w:cs="Times New Roman"/>
+                <w:sz w:val="24"/>
+                <w:szCs w:val="24"/>
+              </w:rPr>
+            </w:pPr>
+            <w:r>
+              <w:rPr>
+                <w:rFonts w:ascii="Times New Roman" w:hAnsi="Times New Roman" w:cs="Times New Roman"/>
+                <w:sz w:val="24"/>
+                <w:szCs w:val="24"/>
+              </w:rPr>
+              <w:t>{{</w:t>
+            </w:r>
+            <w:r>
+              <w:rPr>
+                <w:rFonts w:ascii="Times New Roman" w:hAnsi="Times New Roman" w:cs="Times New Roman"/>
+                <w:sz w:val="24"/>
+                <w:szCs w:val="24"/>
+              </w:rPr>
+              <w:t>PROVIDER_REPRESENTATIVE_NAME</w:t>
+            </w:r>
+            <w:r>
+              <w:rPr>
+                <w:rFonts w:ascii="Times New Roman" w:hAnsi="Times New Roman" w:cs="Times New Roman"/>
+                <w:sz w:val="24"/>
+                <w:szCs w:val="24"/>
+              </w:rPr>
+              <w:t>}}</w:t>
+            </w:r>
+            <w:r>
+              <w:rPr>
+                <w:rFonts w:ascii="Times New Roman" w:hAnsi="Times New Roman" w:cs="Times New Roman"/>
+                <w:sz w:val="24"/>
+                <w:szCs w:val="24"/>
+              </w:rPr>
+              <w:t xml:space="preserve"> </w:t>
+            </w:r>
+          </w:p>
+        </w:tc>
+        <w:tc>
+          <w:tcPr>
+            <w:tcW w:w="4782" w:type="dxa"/>
+          </w:tcPr>
+          <w:p>
+            <w:pPr>
+              <w:spacing w:after="0" w:line="288" w:lineRule="auto"/>
+              <w:rPr>
+                <w:rFonts w:ascii="Times New Roman" w:hAnsi="Times New Roman" w:cs="Times New Roman"/>
+                <w:sz w:val="24"/>
+                <w:szCs w:val="24"/>
+              </w:rPr>
+            </w:pPr>
+            <w:r>
+              <w:rPr>
+                <w:rFonts w:ascii="Times New Roman" w:hAnsi="Times New Roman" w:cs="Times New Roman"/>
+                <w:sz w:val="24"/>
+                <w:szCs w:val="24"/>
+              </w:rPr>
+              <w:t>Chức</w:t>
+            </w:r>
+            <w:r>
+              <w:rPr>
+                <w:rFonts w:ascii="Times New Roman" w:hAnsi="Times New Roman" w:cs="Times New Roman"/>
+                <w:spacing w:val="-1"/>
+                <w:sz w:val="24"/>
+                <w:szCs w:val="24"/>
+              </w:rPr>
+              <w:t xml:space="preserve"> </w:t>
+            </w:r>
+            <w:r>
+              <w:rPr>
+                <w:rFonts w:ascii="Times New Roman" w:hAnsi="Times New Roman" w:cs="Times New Roman"/>
+                <w:sz w:val="24"/>
+                <w:szCs w:val="24"/>
+              </w:rPr>
+              <w:t xml:space="preserve">vụ: </w:t>
+            </w:r>
+            <w:r>
+              <w:rPr>
+                <w:rFonts w:ascii="Times New Roman" w:hAnsi="Times New Roman" w:cs="Times New Roman"/>
+                <w:sz w:val="24"/>
+                <w:szCs w:val="24"/>
+              </w:rPr>
+              <w:t>{{</w:t>
+            </w:r>
+            <w:r>
+              <w:rPr>
+                <w:rFonts w:ascii="Times New Roman" w:hAnsi="Times New Roman" w:cs="Times New Roman"/>
+                <w:sz w:val="24"/>
+                <w:szCs w:val="24"/>
+              </w:rPr>
+              <w:t>PROVIDER_REPRESENTATIVE_TITLE</w:t>
+            </w:r>
+            <w:r>
+              <w:rPr>
+                <w:rFonts w:ascii="Times New Roman" w:hAnsi="Times New Roman" w:cs="Times New Roman"/>
+                <w:sz w:val="24"/>
+                <w:szCs w:val="24"/>
+              </w:rPr>
+              <w:t>}}</w:t>
+            </w:r>
+          </w:p>
+        </w:tc>
+      </w:tr>
+      <w:tr>
+        <w:tc>
+          <w:tcPr>
+            <w:tcW w:w="2070" w:type="dxa"/>
+          </w:tcPr>
+          <w:p>
+            <w:pPr>
+              <w:spacing w:after="0" w:line="288" w:lineRule="auto"/>
+              <w:rPr>
+                <w:rFonts w:ascii="Times New Roman" w:hAnsi="Times New Roman" w:cs="Times New Roman"/>
+                <w:sz w:val="24"/>
+                <w:szCs w:val="24"/>
+              </w:rPr>
+            </w:pPr>
+            <w:r>
+              <w:rPr>
+                <w:rFonts w:ascii="Times New Roman" w:hAnsi="Times New Roman" w:cs="Times New Roman"/>
+                <w:sz w:val="24"/>
+                <w:szCs w:val="24"/>
+              </w:rPr>
+              <w:t>Địa</w:t>
+            </w:r>
+            <w:r>
+              <w:rPr>
+                <w:rFonts w:ascii="Times New Roman" w:hAnsi="Times New Roman" w:cs="Times New Roman"/>
+                <w:spacing w:val="-2"/>
+                <w:sz w:val="24"/>
+                <w:szCs w:val="24"/>
+              </w:rPr>
+              <w:t xml:space="preserve"> </w:t>
+            </w:r>
+            <w:r>
+              <w:rPr>
+                <w:rFonts w:ascii="Times New Roman" w:hAnsi="Times New Roman" w:cs="Times New Roman"/>
+                <w:sz w:val="24"/>
+                <w:szCs w:val="24"/>
+              </w:rPr>
+              <w:t>chỉ trụ sở</w:t>
+            </w:r>
+          </w:p>
+        </w:tc>
+        <w:tc>
+          <w:tcPr>
+            <w:tcW w:w="450" w:type="dxa"/>
+          </w:tcPr>
+          <w:p>
+            <w:pPr>
+              <w:spacing w:after="0" w:line="288" w:lineRule="auto"/>
+              <w:rPr>
+                <w:rFonts w:ascii="Times New Roman" w:hAnsi="Times New Roman" w:cs="Times New Roman"/>
+                <w:sz w:val="24"/>
+                <w:szCs w:val="24"/>
+              </w:rPr>
+            </w:pPr>
+            <w:r>
+              <w:rPr>
+                <w:rFonts w:ascii="Times New Roman" w:hAnsi="Times New Roman" w:cs="Times New Roman"/>
+                <w:sz w:val="24"/>
+                <w:szCs w:val="24"/>
+              </w:rPr>
+              <w:t>:</w:t>
+            </w:r>
+          </w:p>
+        </w:tc>
+        <w:tc>
+          <w:tcPr>
+            <w:tcW w:w="8112" w:type="dxa"/>
+            <w:gridSpan w:val="2"/>
+          </w:tcPr>
+          <w:p>
+            <w:pPr>
+              <w:spacing w:after="0" w:line="288" w:lineRule="auto"/>
+              <w:rPr>
+                <w:rFonts w:ascii="Times New Roman" w:hAnsi="Times New Roman" w:cs="Times New Roman"/>
+                <w:sz w:val="24"/>
+                <w:szCs w:val="24"/>
+              </w:rPr>
+            </w:pPr>
+            <w:r>
+              <w:rPr>
+                <w:rFonts w:ascii="Times New Roman" w:hAnsi="Times New Roman" w:cs="Times New Roman"/>
+                <w:sz w:val="24"/>
+                <w:szCs w:val="24"/>
+              </w:rPr>
+              <w:t>{{</w:t>
+            </w:r>
+            <w:r>
+              <w:rPr>
+                <w:rFonts w:ascii="Times New Roman" w:hAnsi="Times New Roman" w:cs="Times New Roman"/>
+                <w:sz w:val="24"/>
+                <w:szCs w:val="24"/>
+              </w:rPr>
+              <w:t>PROVIDER_ADDRESS</w:t>
+            </w:r>
+            <w:r>
+              <w:rPr>
+                <w:rFonts w:ascii="Times New Roman" w:hAnsi="Times New Roman" w:cs="Times New Roman"/>
+                <w:sz w:val="24"/>
+                <w:szCs w:val="24"/>
+              </w:rPr>
+              <w:t>}}</w:t>
+            </w:r>
+          </w:p>
+        </w:tc>
+      </w:tr>
+      <w:tr>
+        <w:tc>
+          <w:tcPr>
+            <w:tcW w:w="2070" w:type="dxa"/>
+          </w:tcPr>
+          <w:p>
+            <w:pPr>
+              <w:spacing w:after="0" w:line="288" w:lineRule="auto"/>
+              <w:rPr>
+                <w:rFonts w:ascii="Times New Roman" w:hAnsi="Times New Roman" w:cs="Times New Roman"/>
+                <w:sz w:val="24"/>
+                <w:szCs w:val="24"/>
+              </w:rPr>
+            </w:pPr>
+            <w:r>
+              <w:rPr>
+                <w:rFonts w:ascii="Times New Roman" w:hAnsi="Times New Roman" w:cs="Times New Roman"/>
+                <w:sz w:val="24"/>
+                <w:szCs w:val="24"/>
+              </w:rPr>
+              <w:t>Điện</w:t>
+            </w:r>
+            <w:r>
+              <w:rPr>
+                <w:rFonts w:ascii="Times New Roman" w:hAnsi="Times New Roman" w:cs="Times New Roman"/>
+                <w:spacing w:val="-2"/>
+                <w:sz w:val="24"/>
+                <w:szCs w:val="24"/>
+              </w:rPr>
+              <w:t xml:space="preserve"> </w:t>
+            </w:r>
+            <w:r>
+              <w:rPr>
+                <w:rFonts w:ascii="Times New Roman" w:hAnsi="Times New Roman" w:cs="Times New Roman"/>
+                <w:sz w:val="24"/>
+                <w:szCs w:val="24"/>
+              </w:rPr>
+              <w:t>thoại</w:t>
+            </w:r>
+          </w:p>
+        </w:tc>
+        <w:tc>
+          <w:tcPr>
+            <w:tcW w:w="450" w:type="dxa"/>
+          </w:tcPr>
+          <w:p>
+            <w:pPr>
+              <w:spacing w:after="0" w:line="288" w:lineRule="auto"/>
+              <w:rPr>
+                <w:rFonts w:ascii="Times New Roman" w:hAnsi="Times New Roman" w:cs="Times New Roman"/>
+                <w:sz w:val="24"/>
+                <w:szCs w:val="24"/>
+              </w:rPr>
+            </w:pPr>
+            <w:r>
+              <w:rPr>
+                <w:rFonts w:ascii="Times New Roman" w:hAnsi="Times New Roman" w:cs="Times New Roman"/>
+                <w:sz w:val="24"/>
+                <w:szCs w:val="24"/>
+              </w:rPr>
+              <w:t>:</w:t>
+            </w:r>
+          </w:p>
+        </w:tc>
+        <w:tc>
+          <w:tcPr>
+            <w:tcW w:w="3330" w:type="dxa"/>
+          </w:tcPr>
+          <w:p>
+            <w:pPr>
+              <w:spacing w:after="0" w:line="288" w:lineRule="auto"/>
+              <w:rPr>
+                <w:rFonts w:ascii="Times New Roman" w:hAnsi="Times New Roman" w:cs="Times New Roman"/>
+                <w:sz w:val="24"/>
+                <w:szCs w:val="24"/>
+              </w:rPr>
+            </w:pPr>
+            <w:r>
+              <w:rPr>
+                <w:rFonts w:ascii="Times New Roman" w:hAnsi="Times New Roman" w:cs="Times New Roman"/>
+                <w:sz w:val="24"/>
+                <w:szCs w:val="24"/>
+              </w:rPr>
+              <w:t>{{</w:t>
+            </w:r>
+            <w:r>
+              <w:rPr>
+                <w:rFonts w:ascii="Times New Roman" w:hAnsi="Times New Roman" w:cs="Times New Roman"/>
+                <w:sz w:val="24"/>
+                <w:szCs w:val="24"/>
+              </w:rPr>
+              <w:t>PROVIDER_PHONE</w:t>
+            </w:r>
+            <w:r>
+              <w:rPr>
+                <w:rFonts w:ascii="Times New Roman" w:hAnsi="Times New Roman" w:cs="Times New Roman"/>
+                <w:sz w:val="24"/>
+                <w:szCs w:val="24"/>
+              </w:rPr>
+              <w:t>}}</w:t>
+            </w:r>
+          </w:p>
+        </w:tc>
+        <w:tc>
+          <w:tcPr>
+            <w:tcW w:w="4782" w:type="dxa"/>
+          </w:tcPr>
+          <w:p>
+            <w:pPr>
+              <w:spacing w:after="0" w:line="288" w:lineRule="auto"/>
+              <w:rPr>
+                <w:rFonts w:ascii="Times New Roman" w:hAnsi="Times New Roman" w:cs="Times New Roman"/>
+                <w:sz w:val="24"/>
+                <w:szCs w:val="24"/>
+              </w:rPr>
+            </w:pPr>
+            <w:proofErr w:type="gramStart"/>
+            <w:r>
+              <w:rPr>
+                <w:rFonts w:ascii="Times New Roman" w:hAnsi="Times New Roman" w:cs="Times New Roman"/>
+                <w:sz w:val="24"/>
+                <w:szCs w:val="24"/>
+              </w:rPr>
+              <w:t xml:space="preserve">Fax: </w:t>
+            </w:r>
+            <w:r>
+              <w:rPr>
+                <w:rFonts w:ascii="Times New Roman" w:hAnsi="Times New Roman" w:cs="Times New Roman"/>
+                <w:sz w:val="24"/>
+                <w:szCs w:val="24"/>
+              </w:rPr>
+              <w:t>{{</w:t>
+            </w:r>
+            <w:proofErr w:type="gramEnd"/>
+            <w:r>
+              <w:rPr>
+                <w:rFonts w:ascii="Times New Roman" w:hAnsi="Times New Roman" w:cs="Times New Roman"/>
+                <w:sz w:val="24"/>
+                <w:szCs w:val="24"/>
+              </w:rPr>
+              <w:t>PROVIDER_FAX</w:t>
+            </w:r>
+            <w:r>
+              <w:rPr>
+                <w:rFonts w:ascii="Times New Roman" w:hAnsi="Times New Roman" w:cs="Times New Roman"/>
+                <w:sz w:val="24"/>
+                <w:szCs w:val="24"/>
+              </w:rPr>
+              <w:t>}}</w:t>
+            </w:r>
+          </w:p>
+        </w:tc>
+      </w:tr>
+      <w:tr>
+        <w:tc>
+          <w:tcPr>
+            <w:tcW w:w="2070" w:type="dxa"/>
+          </w:tcPr>
+          <w:p>
+            <w:pPr>
+              <w:spacing w:after="0" w:line="288" w:lineRule="auto"/>
+              <w:rPr>
+                <w:rFonts w:ascii="Times New Roman" w:hAnsi="Times New Roman" w:cs="Times New Roman"/>
+                <w:sz w:val="24"/>
+                <w:szCs w:val="24"/>
+              </w:rPr>
+            </w:pPr>
+            <w:r>
+              <w:rPr>
+                <w:rFonts w:ascii="Times New Roman" w:hAnsi="Times New Roman" w:cs="Times New Roman"/>
+                <w:sz w:val="24"/>
+                <w:szCs w:val="24"/>
+              </w:rPr>
+              <w:t>Mã số</w:t>
+            </w:r>
+            <w:r>
+              <w:rPr>
+                <w:rFonts w:ascii="Times New Roman" w:hAnsi="Times New Roman" w:cs="Times New Roman"/>
+                <w:spacing w:val="-1"/>
+                <w:sz w:val="24"/>
+                <w:szCs w:val="24"/>
+              </w:rPr>
+              <w:t xml:space="preserve"> </w:t>
+            </w:r>
+            <w:r>
+              <w:rPr>
+                <w:rFonts w:ascii="Times New Roman" w:hAnsi="Times New Roman" w:cs="Times New Roman"/>
+                <w:sz w:val="24"/>
+                <w:szCs w:val="24"/>
+              </w:rPr>
+              <w:t>thuế</w:t>
+            </w:r>
+          </w:p>
+        </w:tc>
+        <w:tc>
+          <w:tcPr>
+            <w:tcW w:w="450" w:type="dxa"/>
+          </w:tcPr>
+          <w:p>
+            <w:pPr>
+              <w:spacing w:after="0" w:line="288" w:lineRule="auto"/>
+              <w:rPr>
+                <w:rFonts w:ascii="Times New Roman" w:hAnsi="Times New Roman" w:cs="Times New Roman"/>
+                <w:sz w:val="24"/>
+                <w:szCs w:val="24"/>
+              </w:rPr>
+            </w:pPr>
+            <w:r>
+              <w:rPr>
+                <w:rFonts w:ascii="Times New Roman" w:hAnsi="Times New Roman" w:cs="Times New Roman"/>
+                <w:sz w:val="24"/>
+                <w:szCs w:val="24"/>
+              </w:rPr>
+              <w:t>:</w:t>
+            </w:r>
+          </w:p>
+        </w:tc>
+        <w:tc>
+          <w:tcPr>
+            <w:tcW w:w="8112" w:type="dxa"/>
+            <w:gridSpan w:val="2"/>
+          </w:tcPr>
+          <w:p>
+            <w:pPr>
+              <w:spacing w:after="0" w:line="288" w:lineRule="auto"/>
+              <w:rPr>
+                <w:rFonts w:ascii="Times New Roman" w:hAnsi="Times New Roman" w:cs="Times New Roman"/>
+                <w:sz w:val="24"/>
+                <w:szCs w:val="24"/>
+              </w:rPr>
+            </w:pPr>
+            <w:r>
+              <w:rPr>
+                <w:rFonts w:ascii="Times New Roman" w:hAnsi="Times New Roman" w:cs="Times New Roman"/>
+                <w:sz w:val="24"/>
+                <w:szCs w:val="24"/>
+              </w:rPr>
+              <w:t>{{</w:t>
+            </w:r>
+            <w:r>
+              <w:rPr>
+                <w:rFonts w:ascii="Times New Roman" w:hAnsi="Times New Roman" w:cs="Times New Roman"/>
+                <w:sz w:val="24"/>
+                <w:szCs w:val="24"/>
+              </w:rPr>
+              <w:t>PROVIDER_TAX_CODE</w:t>
+            </w:r>
+            <w:r>
+              <w:rPr>
+                <w:rFonts w:ascii="Times New Roman" w:hAnsi="Times New Roman" w:cs="Times New Roman"/>
+                <w:sz w:val="24"/>
+                <w:szCs w:val="24"/>
+              </w:rPr>
+              <w:t>}}</w:t>
+            </w:r>
+          </w:p>
+        </w:tc>
+      </w:tr>
+      <w:tr>
+        <w:tc>
+          <w:tcPr>
+            <w:tcW w:w="2070" w:type="dxa"/>
+          </w:tcPr>
+          <w:p>
+            <w:pPr>
+              <w:spacing w:after="0" w:line="288" w:lineRule="auto"/>
+              <w:rPr>
+                <w:rFonts w:ascii="Times New Roman" w:hAnsi="Times New Roman" w:cs="Times New Roman"/>
+                <w:sz w:val="24"/>
+                <w:szCs w:val="24"/>
+              </w:rPr>
+            </w:pPr>
+            <w:r>
+              <w:rPr>
+                <w:rFonts w:ascii="Times New Roman" w:hAnsi="Times New Roman" w:cs="Times New Roman"/>
+                <w:sz w:val="24"/>
+                <w:szCs w:val="24"/>
+              </w:rPr>
+              <w:t>Tài khoản</w:t>
+            </w:r>
+            <w:r>
+              <w:rPr>
+                <w:rFonts w:ascii="Times New Roman" w:hAnsi="Times New Roman" w:cs="Times New Roman"/>
+                <w:spacing w:val="-2"/>
+                <w:sz w:val="24"/>
+                <w:szCs w:val="24"/>
+              </w:rPr>
+              <w:t xml:space="preserve"> </w:t>
+            </w:r>
+            <w:r>
+              <w:rPr>
+                <w:rFonts w:ascii="Times New Roman" w:hAnsi="Times New Roman" w:cs="Times New Roman"/>
+                <w:sz w:val="24"/>
+                <w:szCs w:val="24"/>
+              </w:rPr>
+              <w:t>số</w:t>
+            </w:r>
+          </w:p>
+        </w:tc>
+        <w:tc>
+          <w:tcPr>
+            <w:tcW w:w="450" w:type="dxa"/>
+          </w:tcPr>
+          <w:p>
+            <w:pPr>
+              <w:spacing w:after="0" w:line="288" w:lineRule="auto"/>
+              <w:rPr>
+                <w:rFonts w:ascii="Times New Roman" w:hAnsi="Times New Roman" w:cs="Times New Roman"/>
+                <w:sz w:val="24"/>
+                <w:szCs w:val="24"/>
+              </w:rPr>
+            </w:pPr>
+            <w:r>
+              <w:rPr>
+                <w:rFonts w:ascii="Times New Roman" w:hAnsi="Times New Roman" w:cs="Times New Roman"/>
+                <w:sz w:val="24"/>
+                <w:szCs w:val="24"/>
+              </w:rPr>
+              <w:t>:</w:t>
+            </w:r>
+          </w:p>
+        </w:tc>
+        <w:tc>
+          <w:tcPr>
+            <w:tcW w:w="8112" w:type="dxa"/>
+            <w:gridSpan w:val="2"/>
+          </w:tcPr>
+          <w:p>
+            <w:pPr>
+              <w:spacing w:after="0" w:line="288" w:lineRule="auto"/>
+              <w:rPr>
+                <w:rFonts w:ascii="Times New Roman" w:hAnsi="Times New Roman" w:cs="Times New Roman"/>
+                <w:sz w:val="24"/>
+                <w:szCs w:val="24"/>
+              </w:rPr>
+            </w:pPr>
+            <w:r>
+              <w:rPr>
+                <w:rFonts w:ascii="Times New Roman" w:hAnsi="Times New Roman" w:cs="Times New Roman"/>
+                <w:sz w:val="24"/>
+                <w:szCs w:val="24"/>
+              </w:rPr>
+              <w:t>{{</w:t>
+            </w:r>
+            <w:r>
+              <w:rPr>
+                <w:rFonts w:ascii="Times New Roman" w:hAnsi="Times New Roman" w:cs="Times New Roman"/>
+                <w:sz w:val="24"/>
+                <w:szCs w:val="24"/>
+              </w:rPr>
+              <w:t>PROVIDER_BANK_ACCOUNT_NUMBER</w:t>
+            </w:r>
+            <w:r>
+              <w:rPr>
+                <w:rFonts w:ascii="Times New Roman" w:hAnsi="Times New Roman" w:cs="Times New Roman"/>
+                <w:sz w:val="24"/>
+                <w:szCs w:val="24"/>
+              </w:rPr>
+              <w:t>}}</w:t>
+            </w:r>
+          </w:p>
+        </w:tc>
+      </w:tr>
+      <w:tr>
+        <w:tc>
+          <w:tcPr>
+            <w:tcW w:w="2070" w:type="dxa"/>
+          </w:tcPr>
+          <w:p>
+            <w:pPr>
+              <w:spacing w:after="0" w:line="288" w:lineRule="auto"/>
+              <w:rPr>
+                <w:rFonts w:ascii="Times New Roman" w:hAnsi="Times New Roman" w:cs="Times New Roman"/>
+                <w:sz w:val="24"/>
+                <w:szCs w:val="24"/>
+              </w:rPr>
+            </w:pPr>
+            <w:r>
+              <w:rPr>
+                <w:rFonts w:ascii="Times New Roman" w:hAnsi="Times New Roman" w:cs="Times New Roman"/>
+                <w:sz w:val="24"/>
+                <w:szCs w:val="24"/>
+              </w:rPr>
+              <w:t>Tại ngân hàng</w:t>
+            </w:r>
+          </w:p>
+        </w:tc>
+        <w:tc>
+          <w:tcPr>
+            <w:tcW w:w="450" w:type="dxa"/>
+          </w:tcPr>
+          <w:p>
+            <w:pPr>
+              <w:spacing w:after="0" w:line="288" w:lineRule="auto"/>
+              <w:rPr>
+                <w:rFonts w:ascii="Times New Roman" w:hAnsi="Times New Roman" w:cs="Times New Roman"/>
+                <w:sz w:val="24"/>
+                <w:szCs w:val="24"/>
+              </w:rPr>
+            </w:pPr>
+            <w:r>
+              <w:rPr>
+                <w:rFonts w:ascii="Times New Roman" w:hAnsi="Times New Roman" w:cs="Times New Roman"/>
+                <w:sz w:val="24"/>
+                <w:szCs w:val="24"/>
+              </w:rPr>
+              <w:t>:</w:t>
+            </w:r>
+          </w:p>
+        </w:tc>
+        <w:tc>
+          <w:tcPr>
+            <w:tcW w:w="8112" w:type="dxa"/>
+            <w:gridSpan w:val="2"/>
+          </w:tcPr>
+          <w:p>
+            <w:pPr>
+              <w:spacing w:after="0" w:line="288" w:lineRule="auto"/>
+              <w:rPr>
+                <w:rFonts w:ascii="Times New Roman" w:hAnsi="Times New Roman" w:cs="Times New Roman"/>
+                <w:spacing w:val="-6"/>
+                <w:sz w:val="24"/>
+                <w:szCs w:val="24"/>
+              </w:rPr>
+            </w:pPr>
+            <w:r>
+              <w:rPr>
+                <w:rFonts w:ascii="Times New Roman" w:hAnsi="Times New Roman" w:cs="Times New Roman"/>
+                <w:spacing w:val="-6"/>
+                <w:sz w:val="24"/>
+                <w:szCs w:val="24"/>
+              </w:rPr>
+              <w:t>{{</w:t>
+            </w:r>
+            <w:r>
+              <w:rPr>
+                <w:rFonts w:ascii="Times New Roman" w:hAnsi="Times New Roman" w:cs="Times New Roman"/>
+                <w:spacing w:val="-6"/>
+                <w:sz w:val="24"/>
+                <w:szCs w:val="24"/>
+              </w:rPr>
+              <w:t>PROVIDER_BANK_NAME</w:t>
+            </w:r>
+            <w:r>
+              <w:rPr>
+                <w:rFonts w:ascii="Times New Roman" w:hAnsi="Times New Roman" w:cs="Times New Roman"/>
+                <w:spacing w:val="-6"/>
+                <w:sz w:val="24"/>
+                <w:szCs w:val="24"/>
+              </w:rPr>
+              <w:t>}}</w:t>
+            </w:r>
+          </w:p>
+        </w:tc>
+      </w:tr>
+    </w:tbl>
+    <w:p>
+      <w:pPr>
+        <w:spacing w:after="0" w:line="288" w:lineRule="auto"/>
+        <w:jc w:val="both"/>
         <w:rPr>
           <w:rFonts w:ascii="Times New Roman" w:hAnsi="Times New Roman" w:cs="Times New Roman"/>
           <w:i/>
@@ -2533,9 +1991,7 @@
           <w:szCs w:val="24"/>
           <w:lang w:val="fr-FR"/>
         </w:rPr>
-        <w:t>Tại</w:t>
-      </w:r>
-      <w:proofErr w:type="spellEnd"/>
+      </w:pPr>
       <w:r>
         <w:rPr>
           <w:rFonts w:ascii="Times New Roman" w:hAnsi="Times New Roman" w:cs="Times New Roman"/>
@@ -2545,33 +2001,48 @@
           <w:szCs w:val="24"/>
           <w:lang w:val="fr-FR"/>
         </w:rPr>
-        <w:t xml:space="preserve"> </w:t>
+        <w:t>(Sau đây gọi tắt là “</w:t>
       </w:r>
-      <w:proofErr w:type="spellStart"/>
       <w:r>
         <w:rPr>
           <w:rFonts w:ascii="Times New Roman" w:hAnsi="Times New Roman" w:cs="Times New Roman"/>
+          <w:b/>
+          <w:bCs/>
           <w:i/>
           <w:iCs/>
           <w:sz w:val="24"/>
           <w:szCs w:val="24"/>
           <w:lang w:val="fr-FR"/>
         </w:rPr>
-        <w:t>đây</w:t>
+        <w:t>Bên</w:t>
       </w:r>
-      <w:proofErr w:type="spellEnd"/>
       <w:r>
         <w:rPr>
           <w:rFonts w:ascii="Times New Roman" w:hAnsi="Times New Roman" w:cs="Times New Roman"/>
+          <w:b/>
+          <w:bCs/>
+          <w:i/>
+          <w:iCs/>
+          <w:spacing w:val="-3"/>
+          <w:sz w:val="24"/>
+          <w:szCs w:val="24"/>
+          <w:lang w:val="fr-FR"/>
+        </w:rPr>
+        <w:t xml:space="preserve"> </w:t>
+      </w:r>
+      <w:r>
+        <w:rPr>
+          <w:rFonts w:ascii="Times New Roman" w:hAnsi="Times New Roman" w:cs="Times New Roman"/>
+          <w:b/>
+          <w:bCs/>
           <w:i/>
           <w:iCs/>
           <w:sz w:val="24"/>
           <w:szCs w:val="24"/>
           <w:lang w:val="fr-FR"/>
         </w:rPr>
-        <w:t xml:space="preserve">, </w:t>
+        <w:t>B</w:t>
       </w:r>
-      <w:proofErr w:type="spellStart"/>
       <w:r>
         <w:rPr>
           <w:rFonts w:ascii="Times New Roman" w:hAnsi="Times New Roman" w:cs="Times New Roman"/>
@@ -2581,10 +2052,13 @@
           <w:szCs w:val="24"/>
           <w:lang w:val="fr-FR"/>
         </w:rPr>
-        <w:t>hai</w:t>
+        <w:t>”)</w:t>
       </w:r>
-      <w:proofErr w:type="spellEnd"/>
-      <w:r>
+    </w:p>
+    <w:p>
+      <w:pPr>
+        <w:spacing w:after="0" w:line="288" w:lineRule="auto"/>
+        <w:jc w:val="both"/>
         <w:rPr>
           <w:rFonts w:ascii="Times New Roman" w:hAnsi="Times New Roman" w:cs="Times New Roman"/>
           <w:i/>
@@ -2593,9 +2067,7 @@
           <w:szCs w:val="24"/>
           <w:lang w:val="fr-FR"/>
         </w:rPr>
-        <w:t xml:space="preserve"> </w:t>
-      </w:r>
-      <w:proofErr w:type="spellStart"/>
+      </w:pPr>
       <w:r>
         <w:rPr>
           <w:rFonts w:ascii="Times New Roman" w:hAnsi="Times New Roman" w:cs="Times New Roman"/>
@@ -2605,321 +2077,8 @@
           <w:szCs w:val="24"/>
           <w:lang w:val="fr-FR"/>
         </w:rPr>
-        <w:t>bên</w:t>
+        <w:t>Tại đây, hai bên thống nhất ký kết hợp đồng với các điều khoản cụ thể như</w:t>
       </w:r>
-      <w:proofErr w:type="spellEnd"/>
-      <w:r>
-        <w:rPr>
-          <w:rFonts w:ascii="Times New Roman" w:hAnsi="Times New Roman" w:cs="Times New Roman"/>
-          <w:i/>
-          <w:iCs/>
-          <w:sz w:val="24"/>
-          <w:szCs w:val="24"/>
-          <w:lang w:val="fr-FR"/>
-        </w:rPr>
-        <w:t xml:space="preserve"> </w:t>
-      </w:r>
-      <w:proofErr w:type="spellStart"/>
-      <w:r>
-        <w:rPr>
-          <w:rFonts w:ascii="Times New Roman" w:hAnsi="Times New Roman" w:cs="Times New Roman"/>
-          <w:i/>
-          <w:iCs/>
-          <w:sz w:val="24"/>
-          <w:szCs w:val="24"/>
-          <w:lang w:val="fr-FR"/>
-        </w:rPr>
-        <w:t>thống</w:t>
-      </w:r>
-      <w:proofErr w:type="spellEnd"/>
-      <w:r>
-        <w:rPr>
-          <w:rFonts w:ascii="Times New Roman" w:hAnsi="Times New Roman" w:cs="Times New Roman"/>
-          <w:i/>
-          <w:iCs/>
-          <w:sz w:val="24"/>
-          <w:szCs w:val="24"/>
-          <w:lang w:val="fr-FR"/>
-        </w:rPr>
-        <w:t xml:space="preserve"> </w:t>
-      </w:r>
-      <w:proofErr w:type="spellStart"/>
-      <w:r>
-        <w:rPr>
-          <w:rFonts w:ascii="Times New Roman" w:hAnsi="Times New Roman" w:cs="Times New Roman"/>
-          <w:i/>
-          <w:iCs/>
-          <w:sz w:val="24"/>
-          <w:szCs w:val="24"/>
-          <w:lang w:val="fr-FR"/>
-        </w:rPr>
-        <w:t>nhất</w:t>
-      </w:r>
-      <w:proofErr w:type="spellEnd"/>
-      <w:r>
-        <w:rPr>
-          <w:rFonts w:ascii="Times New Roman" w:hAnsi="Times New Roman" w:cs="Times New Roman"/>
-          <w:i/>
-          <w:iCs/>
-          <w:sz w:val="24"/>
-          <w:szCs w:val="24"/>
-          <w:lang w:val="fr-FR"/>
-        </w:rPr>
-        <w:t xml:space="preserve"> </w:t>
-      </w:r>
-      <w:proofErr w:type="spellStart"/>
-      <w:r>
-        <w:rPr>
-          <w:rFonts w:ascii="Times New Roman" w:hAnsi="Times New Roman" w:cs="Times New Roman"/>
-          <w:i/>
-          <w:iCs/>
-          <w:sz w:val="24"/>
-          <w:szCs w:val="24"/>
-          <w:lang w:val="fr-FR"/>
-        </w:rPr>
-        <w:t>ký</w:t>
-      </w:r>
-      <w:proofErr w:type="spellEnd"/>
-      <w:r>
-        <w:rPr>
-          <w:rFonts w:ascii="Times New Roman" w:hAnsi="Times New Roman" w:cs="Times New Roman"/>
-          <w:i/>
-          <w:iCs/>
-          <w:sz w:val="24"/>
-          <w:szCs w:val="24"/>
-          <w:lang w:val="fr-FR"/>
-        </w:rPr>
-        <w:t xml:space="preserve"> </w:t>
-      </w:r>
-      <w:proofErr w:type="spellStart"/>
-      <w:r>
-        <w:rPr>
-          <w:rFonts w:ascii="Times New Roman" w:hAnsi="Times New Roman" w:cs="Times New Roman"/>
-          <w:i/>
-          <w:iCs/>
-          <w:sz w:val="24"/>
-          <w:szCs w:val="24"/>
-          <w:lang w:val="fr-FR"/>
-        </w:rPr>
-        <w:t>kết</w:t>
-      </w:r>
-      <w:proofErr w:type="spellEnd"/>
-      <w:r>
-        <w:rPr>
-          <w:rFonts w:ascii="Times New Roman" w:hAnsi="Times New Roman" w:cs="Times New Roman"/>
-          <w:i/>
-          <w:iCs/>
-          <w:sz w:val="24"/>
-          <w:szCs w:val="24"/>
-          <w:lang w:val="fr-FR"/>
-        </w:rPr>
-        <w:t xml:space="preserve"> </w:t>
-      </w:r>
-      <w:proofErr w:type="spellStart"/>
-      <w:r>
-        <w:rPr>
-          <w:rFonts w:ascii="Times New Roman" w:hAnsi="Times New Roman" w:cs="Times New Roman"/>
-          <w:i/>
-          <w:iCs/>
-          <w:sz w:val="24"/>
-          <w:szCs w:val="24"/>
-          <w:lang w:val="fr-FR"/>
-        </w:rPr>
-        <w:t>hợp</w:t>
-      </w:r>
-      <w:proofErr w:type="spellEnd"/>
-      <w:r>
-        <w:rPr>
-          <w:rFonts w:ascii="Times New Roman" w:hAnsi="Times New Roman" w:cs="Times New Roman"/>
-          <w:i/>
-          <w:iCs/>
-          <w:sz w:val="24"/>
-          <w:szCs w:val="24"/>
-          <w:lang w:val="fr-FR"/>
-        </w:rPr>
-        <w:t xml:space="preserve"> </w:t>
-      </w:r>
-      <w:proofErr w:type="spellStart"/>
-      <w:r>
-        <w:rPr>
-          <w:rFonts w:ascii="Times New Roman" w:hAnsi="Times New Roman" w:cs="Times New Roman"/>
-          <w:i/>
-          <w:iCs/>
-          <w:sz w:val="24"/>
-          <w:szCs w:val="24"/>
-          <w:lang w:val="fr-FR"/>
-        </w:rPr>
-        <w:t>đồng</w:t>
-      </w:r>
-      <w:proofErr w:type="spellEnd"/>
-      <w:r>
-        <w:rPr>
-          <w:rFonts w:ascii="Times New Roman" w:hAnsi="Times New Roman" w:cs="Times New Roman"/>
-          <w:i/>
-          <w:iCs/>
-          <w:sz w:val="24"/>
-          <w:szCs w:val="24"/>
-          <w:lang w:val="fr-FR"/>
-        </w:rPr>
-        <w:t xml:space="preserve"> </w:t>
-      </w:r>
-      <w:proofErr w:type="spellStart"/>
-      <w:r>
-        <w:rPr>
-          <w:rFonts w:ascii="Times New Roman" w:hAnsi="Times New Roman" w:cs="Times New Roman"/>
-          <w:i/>
-          <w:iCs/>
-          <w:sz w:val="24"/>
-          <w:szCs w:val="24"/>
-          <w:lang w:val="fr-FR"/>
-        </w:rPr>
-        <w:t>với</w:t>
-      </w:r>
-      <w:proofErr w:type="spellEnd"/>
-      <w:r>
-        <w:rPr>
-          <w:rFonts w:ascii="Times New Roman" w:hAnsi="Times New Roman" w:cs="Times New Roman"/>
-          <w:i/>
-          <w:iCs/>
-          <w:sz w:val="24"/>
-          <w:szCs w:val="24"/>
-          <w:lang w:val="fr-FR"/>
-        </w:rPr>
-        <w:t xml:space="preserve"> </w:t>
-      </w:r>
-      <w:proofErr w:type="spellStart"/>
-      <w:r>
-        <w:rPr>
-          <w:rFonts w:ascii="Times New Roman" w:hAnsi="Times New Roman" w:cs="Times New Roman"/>
-          <w:i/>
-          <w:iCs/>
-          <w:sz w:val="24"/>
-          <w:szCs w:val="24"/>
-          <w:lang w:val="fr-FR"/>
-        </w:rPr>
-        <w:t>các</w:t>
-      </w:r>
-      <w:proofErr w:type="spellEnd"/>
-      <w:r>
-        <w:rPr>
-          <w:rFonts w:ascii="Times New Roman" w:hAnsi="Times New Roman" w:cs="Times New Roman"/>
-          <w:i/>
-          <w:iCs/>
-          <w:sz w:val="24"/>
-          <w:szCs w:val="24"/>
-          <w:lang w:val="fr-FR"/>
-        </w:rPr>
-        <w:t xml:space="preserve"> </w:t>
-      </w:r>
-      <w:proofErr w:type="spellStart"/>
-      <w:r>
-        <w:rPr>
-          <w:rFonts w:ascii="Times New Roman" w:hAnsi="Times New Roman" w:cs="Times New Roman"/>
-          <w:i/>
-          <w:iCs/>
-          <w:sz w:val="24"/>
-          <w:szCs w:val="24"/>
-          <w:lang w:val="fr-FR"/>
-        </w:rPr>
-        <w:t>điều</w:t>
-      </w:r>
-      <w:proofErr w:type="spellEnd"/>
-      <w:r>
-        <w:rPr>
-          <w:rFonts w:ascii="Times New Roman" w:hAnsi="Times New Roman" w:cs="Times New Roman"/>
-          <w:i/>
-          <w:iCs/>
-          <w:sz w:val="24"/>
-          <w:szCs w:val="24"/>
-          <w:lang w:val="fr-FR"/>
-        </w:rPr>
-        <w:t xml:space="preserve"> </w:t>
-      </w:r>
-      <w:proofErr w:type="spellStart"/>
-      <w:r>
-        <w:rPr>
-          <w:rFonts w:ascii="Times New Roman" w:hAnsi="Times New Roman" w:cs="Times New Roman"/>
-          <w:i/>
-          <w:iCs/>
-          <w:sz w:val="24"/>
-          <w:szCs w:val="24"/>
-          <w:lang w:val="fr-FR"/>
-        </w:rPr>
-        <w:t>khoản</w:t>
-      </w:r>
-      <w:proofErr w:type="spellEnd"/>
-      <w:r>
-        <w:rPr>
-          <w:rFonts w:ascii="Times New Roman" w:hAnsi="Times New Roman" w:cs="Times New Roman"/>
-          <w:i/>
-          <w:iCs/>
-          <w:sz w:val="24"/>
-          <w:szCs w:val="24"/>
-          <w:lang w:val="fr-FR"/>
-        </w:rPr>
-        <w:t xml:space="preserve"> </w:t>
-      </w:r>
-      <w:proofErr w:type="spellStart"/>
-      <w:r>
-        <w:rPr>
-          <w:rFonts w:ascii="Times New Roman" w:hAnsi="Times New Roman" w:cs="Times New Roman"/>
-          <w:i/>
-          <w:iCs/>
-          <w:sz w:val="24"/>
-          <w:szCs w:val="24"/>
-          <w:lang w:val="fr-FR"/>
-        </w:rPr>
-        <w:t>cụ</w:t>
-      </w:r>
-      <w:proofErr w:type="spellEnd"/>
-      <w:r>
-        <w:rPr>
-          <w:rFonts w:ascii="Times New Roman" w:hAnsi="Times New Roman" w:cs="Times New Roman"/>
-          <w:i/>
-          <w:iCs/>
-          <w:sz w:val="24"/>
-          <w:szCs w:val="24"/>
-          <w:lang w:val="fr-FR"/>
-        </w:rPr>
-        <w:t xml:space="preserve"> </w:t>
-      </w:r>
-      <w:proofErr w:type="spellStart"/>
-      <w:r>
-        <w:rPr>
-          <w:rFonts w:ascii="Times New Roman" w:hAnsi="Times New Roman" w:cs="Times New Roman"/>
-          <w:i/>
-          <w:iCs/>
-          <w:sz w:val="24"/>
-          <w:szCs w:val="24"/>
-          <w:lang w:val="fr-FR"/>
-        </w:rPr>
-        <w:t>thể</w:t>
-      </w:r>
-      <w:proofErr w:type="spellEnd"/>
-      <w:r>
-        <w:rPr>
-          <w:rFonts w:ascii="Times New Roman" w:hAnsi="Times New Roman" w:cs="Times New Roman"/>
-          <w:i/>
-          <w:iCs/>
-          <w:sz w:val="24"/>
-          <w:szCs w:val="24"/>
-          <w:lang w:val="fr-FR"/>
-        </w:rPr>
-        <w:t xml:space="preserve"> </w:t>
-      </w:r>
-      <w:proofErr w:type="spellStart"/>
-      <w:r>
-        <w:rPr>
-          <w:rFonts w:ascii="Times New Roman" w:hAnsi="Times New Roman" w:cs="Times New Roman"/>
-          <w:i/>
-          <w:iCs/>
-          <w:sz w:val="24"/>
-          <w:szCs w:val="24"/>
-          <w:lang w:val="fr-FR"/>
-        </w:rPr>
-        <w:t>như</w:t>
-      </w:r>
-      <w:proofErr w:type="spellEnd"/>
       <w:r>
         <w:rPr>
           <w:rFonts w:ascii="Times New Roman" w:hAnsi="Times New Roman" w:cs="Times New Roman"/>
@@ -2932,7 +2091,6 @@
         </w:rPr>
         <w:t xml:space="preserve"> </w:t>
       </w:r>
-      <w:proofErr w:type="spellStart"/>
       <w:proofErr w:type="gramStart"/>
       <w:r>
         <w:rPr>
@@ -2943,19 +2101,7 @@
           <w:szCs w:val="24"/>
           <w:lang w:val="fr-FR"/>
         </w:rPr>
-        <w:t>sau</w:t>
-      </w:r>
-      <w:proofErr w:type="spellEnd"/>
-      <w:r>
-        <w:rPr>
-          <w:rFonts w:ascii="Times New Roman" w:hAnsi="Times New Roman" w:cs="Times New Roman"/>
-          <w:i/>
-          <w:iCs/>
-          <w:sz w:val="24"/>
-          <w:szCs w:val="24"/>
-          <w:lang w:val="fr-FR"/>
-        </w:rPr>
-        <w:t>:</w:t>
+        <w:t>sau:</w:t>
       </w:r>
       <w:proofErr w:type="gramEnd"/>
     </w:p>
@@ -2983,70 +2129,20 @@
           <w:lang w:val="fr-FR"/>
         </w:rPr>
       </w:pPr>
-      <w:proofErr w:type="spellStart"/>
       <w:r>
         <w:rPr>
           <w:rFonts w:ascii="Times New Roman" w:hAnsi="Times New Roman" w:cs="Times New Roman"/>
           <w:lang w:val="fr-FR"/>
         </w:rPr>
-        <w:t>Thời</w:t>
+        <w:t xml:space="preserve">Thời hạn hiệu </w:t>
       </w:r>
-      <w:proofErr w:type="spellEnd"/>
-      <w:r>
-        <w:rPr>
-          <w:rFonts w:ascii="Times New Roman" w:hAnsi="Times New Roman" w:cs="Times New Roman"/>
-          <w:lang w:val="fr-FR"/>
-        </w:rPr>
-        <w:t xml:space="preserve"> </w:t>
-      </w:r>
-      <w:proofErr w:type="spellStart"/>
-      <w:r>
-        <w:rPr>
-          <w:rFonts w:ascii="Times New Roman" w:hAnsi="Times New Roman" w:cs="Times New Roman"/>
-          <w:lang w:val="fr-FR"/>
-        </w:rPr>
-        <w:t>hạn</w:t>
-      </w:r>
-      <w:proofErr w:type="spellEnd"/>
-      <w:r>
-        <w:rPr>
-          <w:rFonts w:ascii="Times New Roman" w:hAnsi="Times New Roman" w:cs="Times New Roman"/>
-          <w:lang w:val="fr-FR"/>
-        </w:rPr>
-        <w:t xml:space="preserve"> </w:t>
-      </w:r>
-      <w:proofErr w:type="spellStart"/>
-      <w:r>
-        <w:rPr>
-          <w:rFonts w:ascii="Times New Roman" w:hAnsi="Times New Roman" w:cs="Times New Roman"/>
-          <w:lang w:val="fr-FR"/>
-        </w:rPr>
-        <w:t>hiệu</w:t>
-      </w:r>
-      <w:proofErr w:type="spellEnd"/>
-      <w:r>
-        <w:rPr>
-          <w:rFonts w:ascii="Times New Roman" w:hAnsi="Times New Roman" w:cs="Times New Roman"/>
-          <w:lang w:val="fr-FR"/>
-        </w:rPr>
-        <w:t xml:space="preserve"> </w:t>
-      </w:r>
-      <w:proofErr w:type="spellStart"/>
       <w:proofErr w:type="gramStart"/>
       <w:r>
         <w:rPr>
           <w:rFonts w:ascii="Times New Roman" w:hAnsi="Times New Roman" w:cs="Times New Roman"/>
           <w:lang w:val="fr-FR"/>
         </w:rPr>
-        <w:t>lực</w:t>
-      </w:r>
-      <w:proofErr w:type="spellEnd"/>
-      <w:r>
-        <w:rPr>
-          <w:rFonts w:ascii="Times New Roman" w:hAnsi="Times New Roman" w:cs="Times New Roman"/>
-          <w:lang w:val="fr-FR"/>
-        </w:rPr>
-        <w:t>:</w:t>
+        <w:t>lực:</w:t>
       </w:r>
       <w:proofErr w:type="gramEnd"/>
       <w:r>
@@ -3054,39 +2150,7 @@
           <w:rFonts w:ascii="Times New Roman" w:hAnsi="Times New Roman" w:cs="Times New Roman"/>
           <w:lang w:val="fr-FR"/>
         </w:rPr>
-        <w:t xml:space="preserve"> </w:t>
-      </w:r>
-      <w:proofErr w:type="spellStart"/>
-      <w:r>
-        <w:rPr>
-          <w:rFonts w:ascii="Times New Roman" w:hAnsi="Times New Roman" w:cs="Times New Roman"/>
-          <w:lang w:val="fr-FR"/>
-        </w:rPr>
-        <w:t>từ</w:t>
-      </w:r>
-      <w:proofErr w:type="spellEnd"/>
-      <w:r>
-        <w:rPr>
-          <w:rFonts w:ascii="Times New Roman" w:hAnsi="Times New Roman" w:cs="Times New Roman"/>
-          <w:lang w:val="fr-FR"/>
-        </w:rPr>
-        <w:t xml:space="preserve"> {{EFFECTIVE_DATE}} </w:t>
-      </w:r>
-      <w:proofErr w:type="spellStart"/>
-      <w:r>
-        <w:rPr>
-          <w:rFonts w:ascii="Times New Roman" w:hAnsi="Times New Roman" w:cs="Times New Roman"/>
-          <w:lang w:val="fr-FR"/>
-        </w:rPr>
-        <w:t>đến</w:t>
-      </w:r>
-      <w:proofErr w:type="spellEnd"/>
-      <w:r>
-        <w:rPr>
-          <w:rFonts w:ascii="Times New Roman" w:hAnsi="Times New Roman" w:cs="Times New Roman"/>
-          <w:lang w:val="fr-FR"/>
-        </w:rPr>
-        <w:t xml:space="preserve"> {{EXPIRE_DATE}}.</w:t>
+        <w:t xml:space="preserve"> từ {{EFFECTIVE_DATE}} đến {{EXPIRE_DATE}}.</w:t>
       </w:r>
     </w:p>
     <w:p>
@@ -3095,61 +2159,11 @@
           <w:rFonts w:ascii="Times New Roman" w:hAnsi="Times New Roman" w:cs="Times New Roman"/>
         </w:rPr>
       </w:pPr>
-      <w:proofErr w:type="spellStart"/>
       <w:r>
         <w:rPr>
           <w:rFonts w:ascii="Times New Roman" w:hAnsi="Times New Roman" w:cs="Times New Roman"/>
         </w:rPr>
-        <w:t>Giá</w:t>
-      </w:r>
-      <w:proofErr w:type="spellEnd"/>
-      <w:r>
-        <w:rPr>
-          <w:rFonts w:ascii="Times New Roman" w:hAnsi="Times New Roman" w:cs="Times New Roman"/>
-        </w:rPr>
-        <w:t xml:space="preserve"> </w:t>
-      </w:r>
-      <w:proofErr w:type="spellStart"/>
-      <w:r>
-        <w:rPr>
-          <w:rFonts w:ascii="Times New Roman" w:hAnsi="Times New Roman" w:cs="Times New Roman"/>
-        </w:rPr>
-        <w:t>trị</w:t>
-      </w:r>
-      <w:proofErr w:type="spellEnd"/>
-      <w:r>
-        <w:rPr>
-          <w:rFonts w:ascii="Times New Roman" w:hAnsi="Times New Roman" w:cs="Times New Roman"/>
-        </w:rPr>
-        <w:t xml:space="preserve"> </w:t>
-      </w:r>
-      <w:proofErr w:type="spellStart"/>
-      <w:r>
-        <w:rPr>
-          <w:rFonts w:ascii="Times New Roman" w:hAnsi="Times New Roman" w:cs="Times New Roman"/>
-        </w:rPr>
-        <w:t>hợp</w:t>
-      </w:r>
-      <w:proofErr w:type="spellEnd"/>
-      <w:r>
-        <w:rPr>
-          <w:rFonts w:ascii="Times New Roman" w:hAnsi="Times New Roman" w:cs="Times New Roman"/>
-        </w:rPr>
-        <w:t xml:space="preserve"> </w:t>
-      </w:r>
-      <w:proofErr w:type="spellStart"/>
-      <w:r>
-        <w:rPr>
-          <w:rFonts w:ascii="Times New Roman" w:hAnsi="Times New Roman" w:cs="Times New Roman"/>
-        </w:rPr>
-        <w:t>đồng</w:t>
-      </w:r>
-      <w:proofErr w:type="spellEnd"/>
-      <w:r>
-        <w:rPr>
-          <w:rFonts w:ascii="Times New Roman" w:hAnsi="Times New Roman" w:cs="Times New Roman"/>
-        </w:rPr>
-        <w:t>: {{CONTRACT_TOTAL_AMOUNT}} {{CONTRACT_CURRENCY}}.</w:t>
+        <w:t>Giá trị hợp đồng: {{CONTRACT_TOTAL_AMOUNT}} {{CONTRACT_CURRENCY}}.</w:t>
       </w:r>
     </w:p>
     <w:p>
@@ -3158,33 +2172,11 @@
           <w:rFonts w:ascii="Times New Roman" w:hAnsi="Times New Roman" w:cs="Times New Roman"/>
         </w:rPr>
       </w:pPr>
-      <w:proofErr w:type="spellStart"/>
       <w:r>
         <w:rPr>
           <w:rFonts w:ascii="Times New Roman" w:hAnsi="Times New Roman" w:cs="Times New Roman"/>
         </w:rPr>
-        <w:t>Bằng</w:t>
-      </w:r>
-      <w:proofErr w:type="spellEnd"/>
-      <w:r>
-        <w:rPr>
-          <w:rFonts w:ascii="Times New Roman" w:hAnsi="Times New Roman" w:cs="Times New Roman"/>
-        </w:rPr>
-        <w:t xml:space="preserve"> </w:t>
-      </w:r>
-      <w:proofErr w:type="spellStart"/>
-      <w:r>
-        <w:rPr>
-          <w:rFonts w:ascii="Times New Roman" w:hAnsi="Times New Roman" w:cs="Times New Roman"/>
-        </w:rPr>
-        <w:t>chữ</w:t>
-      </w:r>
-      <w:proofErr w:type="spellEnd"/>
-      <w:r>
-        <w:rPr>
-          <w:rFonts w:ascii="Times New Roman" w:hAnsi="Times New Roman" w:cs="Times New Roman"/>
-        </w:rPr>
-        <w:t>: {{CONTRACT_TOTAL_AMOUNT_IN_WORDS}}.</w:t>
+        <w:t>Bằng chữ: {{CONTRACT_TOTAL_AMOUNT_IN_WORDS}}.</w:t>
       </w:r>
     </w:p>
     <w:p>
@@ -3255,6 +2247,7 @@
           <w:rFonts w:ascii="Times New Roman" w:hAnsi="Times New Roman" w:cs="Times New Roman"/>
           <w:b/>
         </w:rPr>
+        <w:lastRenderedPageBreak/>
         <w:t>ĐIỀU KHOẢN HỢP ĐỒNG</w:t>
       </w:r>
     </w:p>
@@ -5640,6 +4633,38 @@
       <w:u w:val="single"/>
     </w:rPr>
   </w:style>
+  <w:style w:type="paragraph" w:styleId="HTMLPreformatted">
+    <w:name w:val="HTML Preformatted"/>
+    <w:basedOn w:val="Normal"/>
+    <w:link w:val="HTMLPreformattedChar"/>
+    <w:uiPriority w:val="99"/>
+    <w:semiHidden/>
+    <w:unhideWhenUsed/>
+    <w:rsid w:val="00362456"/>
+    <w:pPr>
+      <w:spacing w:after="0" w:line="240" w:lineRule="auto"/>
+    </w:pPr>
+    <w:rPr>
+      <w:rFonts w:ascii="Consolas" w:hAnsi="Consolas"/>
+      <w:sz w:val="20"/>
+      <w:szCs w:val="20"/>
+    </w:rPr>
+  </w:style>
+  <w:style w:type="character" w:customStyle="1" w:styleId="HTMLPreformattedChar">
+    <w:name w:val="HTML Preformatted Char"/>
+    <w:basedOn w:val="DefaultParagraphFont"/>
+    <w:link w:val="HTMLPreformatted"/>
+    <w:uiPriority w:val="99"/>
+    <w:semiHidden/>
+    <w:rsid w:val="00362456"/>
+    <w:rPr>
+      <w:rFonts w:ascii="Consolas" w:hAnsi="Consolas"/>
+      <w:kern w:val="0"/>
+      <w:sz w:val="20"/>
+      <w:szCs w:val="20"/>
+      <w14:ligatures w14:val="none"/>
+    </w:rPr>
+  </w:style>
 </w:styles>
 </file>
 

</xml_diff>